<commit_message>
Updated to 7.3 with Climate Library v6
Issue #63
</commit_message>
<xml_diff>
--- a/docs/LANDIS-II Biomass Succession v7 User Guide.docx
+++ b/docs/LANDIS-II Biomass Succession v7 User Guide.docx
@@ -1,6 +1,6 @@
 
 <file path=word/document.xml><?xml version="1.0" encoding="utf-8"?>
-<w:document xmlns:wpc="http://schemas.microsoft.com/office/word/2010/wordprocessingCanvas" xmlns:cx="http://schemas.microsoft.com/office/drawing/2014/chartex" xmlns:cx1="http://schemas.microsoft.com/office/drawing/2015/9/8/chartex" xmlns:cx2="http://schemas.microsoft.com/office/drawing/2015/10/21/chartex" xmlns:cx3="http://schemas.microsoft.com/office/drawing/2016/5/9/chartex" xmlns:cx4="http://schemas.microsoft.com/office/drawing/2016/5/10/chartex" xmlns:cx5="http://schemas.microsoft.com/office/drawing/2016/5/11/chartex" xmlns:cx6="http://schemas.microsoft.com/office/drawing/2016/5/12/chartex" xmlns:cx7="http://schemas.microsoft.com/office/drawing/2016/5/13/chartex" xmlns:cx8="http://schemas.microsoft.com/office/drawing/2016/5/14/chartex" xmlns:mc="http://schemas.openxmlformats.org/markup-compatibility/2006" xmlns:aink="http://schemas.microsoft.com/office/drawing/2016/ink" xmlns:am3d="http://schemas.microsoft.com/office/drawing/2017/model3d" xmlns:o="urn:schemas-microsoft-com:office:office" xmlns:oel="http://schemas.microsoft.com/office/2019/extlst" xmlns:r="http://schemas.openxmlformats.org/officeDocument/2006/relationships" xmlns:m="http://schemas.openxmlformats.org/officeDocument/2006/math" xmlns:v="urn:schemas-microsoft-com:vml" xmlns:wp14="http://schemas.microsoft.com/office/word/2010/wordprocessingDrawing" xmlns:wp="http://schemas.openxmlformats.org/drawingml/2006/wordprocessingDrawing" xmlns:w10="urn:schemas-microsoft-com:office:word" xmlns:w="http://schemas.openxmlformats.org/wordprocessingml/2006/main" xmlns:w14="http://schemas.microsoft.com/office/word/2010/wordml" xmlns:w15="http://schemas.microsoft.com/office/word/2012/wordml" xmlns:w16cex="http://schemas.microsoft.com/office/word/2018/wordml/cex" xmlns:w16cid="http://schemas.microsoft.com/office/word/2016/wordml/cid" xmlns:w16="http://schemas.microsoft.com/office/word/2018/wordml" xmlns:w16du="http://schemas.microsoft.com/office/word/2023/wordml/word16du" xmlns:w16sdtdh="http://schemas.microsoft.com/office/word/2020/wordml/sdtdatahash" xmlns:w16sdtfl="http://schemas.microsoft.com/office/word/2024/wordml/sdtformatlock" xmlns:w16se="http://schemas.microsoft.com/office/word/2015/wordml/symex" xmlns:wpg="http://schemas.microsoft.com/office/word/2010/wordprocessingGroup" xmlns:wpi="http://schemas.microsoft.com/office/word/2010/wordprocessingInk" xmlns:wne="http://schemas.microsoft.com/office/word/2006/wordml" xmlns:wps="http://schemas.microsoft.com/office/word/2010/wordprocessingShape" mc:Ignorable="w14 w15 w16se w16cid w16 w16cex w16sdtdh w16sdtfl w16du wp14">
+<w:document xmlns:wpc="http://schemas.microsoft.com/office/word/2010/wordprocessingCanvas" xmlns:cx="http://schemas.microsoft.com/office/drawing/2014/chartex" xmlns:cx1="http://schemas.microsoft.com/office/drawing/2015/9/8/chartex" xmlns:cx2="http://schemas.microsoft.com/office/drawing/2015/10/21/chartex" xmlns:cx3="http://schemas.microsoft.com/office/drawing/2016/5/9/chartex" xmlns:cx4="http://schemas.microsoft.com/office/drawing/2016/5/10/chartex" xmlns:cx5="http://schemas.microsoft.com/office/drawing/2016/5/11/chartex" xmlns:cx6="http://schemas.microsoft.com/office/drawing/2016/5/12/chartex" xmlns:cx7="http://schemas.microsoft.com/office/drawing/2016/5/13/chartex" xmlns:cx8="http://schemas.microsoft.com/office/drawing/2016/5/14/chartex" xmlns:mc="http://schemas.openxmlformats.org/markup-compatibility/2006" xmlns:aink="http://schemas.microsoft.com/office/drawing/2016/ink" xmlns:am3d="http://schemas.microsoft.com/office/drawing/2017/model3d" xmlns:o="urn:schemas-microsoft-com:office:office" xmlns:oel="http://schemas.microsoft.com/office/2019/extlst" xmlns:r="http://schemas.openxmlformats.org/officeDocument/2006/relationships" xmlns:m="http://schemas.openxmlformats.org/officeDocument/2006/math" xmlns:v="urn:schemas-microsoft-com:vml" xmlns:wp14="http://schemas.microsoft.com/office/word/2010/wordprocessingDrawing" xmlns:wp="http://schemas.openxmlformats.org/drawingml/2006/wordprocessingDrawing" xmlns:w10="urn:schemas-microsoft-com:office:word" xmlns:w="http://schemas.openxmlformats.org/wordprocessingml/2006/main" xmlns:w14="http://schemas.microsoft.com/office/word/2010/wordml" xmlns:w15="http://schemas.microsoft.com/office/word/2012/wordml" xmlns:w16cei="http://schemas.microsoft.com/office/word/2026/wordml/cei" xmlns:w16cex="http://schemas.microsoft.com/office/word/2018/wordml/cex" xmlns:w16cid="http://schemas.microsoft.com/office/word/2016/wordml/cid" xmlns:w16="http://schemas.microsoft.com/office/word/2018/wordml" xmlns:w16du="http://schemas.microsoft.com/office/word/2023/wordml/word16du" xmlns:w16sdtdh="http://schemas.microsoft.com/office/word/2020/wordml/sdtdatahash" xmlns:w16sdtfl="http://schemas.microsoft.com/office/word/2024/wordml/sdtformatlock" xmlns:w16se="http://schemas.microsoft.com/office/word/2015/wordml/symex" xmlns:wpg="http://schemas.microsoft.com/office/word/2010/wordprocessingGroup" xmlns:wpi="http://schemas.microsoft.com/office/word/2010/wordprocessingInk" xmlns:wne="http://schemas.microsoft.com/office/word/2006/wordml" xmlns:wps="http://schemas.microsoft.com/office/word/2010/wordprocessingShape" mc:Ignorable="w14 w15 w16se w16cid w16 w16cex w16sdtdh w16sdtfl w16du wp14">
   <w:body>
     <w:p>
       <w:pPr>
@@ -70,7 +70,7 @@
         <w:rPr>
           <w:rStyle w:val="titleline1Char"/>
         </w:rPr>
-        <w:t>7.2</w:t>
+        <w:t>7.3</w:t>
       </w:r>
       <w:r>
         <w:rPr>
@@ -143,7 +143,7 @@
         <w:rPr>
           <w:noProof/>
         </w:rPr>
-        <w:t>March 27, 2026</w:t>
+        <w:t>September 8, 2026</w:t>
       </w:r>
       <w:r>
         <w:rPr>
@@ -226,7 +226,7 @@
       <w:r>
         <w:fldChar w:fldCharType="separate"/>
       </w:r>
-      <w:hyperlink w:anchor="_Toc225506237" w:history="1">
+      <w:hyperlink w:anchor="_Toc239766202" w:history="1">
         <w:r>
           <w:rPr>
             <w:rStyle w:val="Hyperlink"/>
@@ -274,7 +274,7 @@
             <w:noProof/>
             <w:webHidden/>
           </w:rPr>
-          <w:instrText xml:space="preserve"> PAGEREF _Toc225506237 \h </w:instrText>
+          <w:instrText xml:space="preserve"> PAGEREF _Toc239766202 \h </w:instrText>
         </w:r>
         <w:r>
           <w:rPr>
@@ -321,7 +321,7 @@
           <w14:ligatures w14:val="standardContextual"/>
         </w:rPr>
       </w:pPr>
-      <w:hyperlink w:anchor="_Toc225506238" w:history="1">
+      <w:hyperlink w:anchor="_Toc239766203" w:history="1">
         <w:r>
           <w:rPr>
             <w:rStyle w:val="Hyperlink"/>
@@ -366,7 +366,7 @@
             <w:noProof/>
             <w:webHidden/>
           </w:rPr>
-          <w:instrText xml:space="preserve"> PAGEREF _Toc225506238 \h </w:instrText>
+          <w:instrText xml:space="preserve"> PAGEREF _Toc239766203 \h </w:instrText>
         </w:r>
         <w:r>
           <w:rPr>
@@ -415,7 +415,7 @@
           <w14:ligatures w14:val="standardContextual"/>
         </w:rPr>
       </w:pPr>
-      <w:hyperlink w:anchor="_Toc225506239" w:history="1">
+      <w:hyperlink w:anchor="_Toc239766204" w:history="1">
         <w:r>
           <w:rPr>
             <w:rStyle w:val="Hyperlink"/>
@@ -462,7 +462,7 @@
             <w:noProof/>
             <w:webHidden/>
           </w:rPr>
-          <w:instrText xml:space="preserve"> PAGEREF _Toc225506239 \h </w:instrText>
+          <w:instrText xml:space="preserve"> PAGEREF _Toc239766204 \h </w:instrText>
         </w:r>
         <w:r>
           <w:rPr>
@@ -511,7 +511,7 @@
           <w14:ligatures w14:val="standardContextual"/>
         </w:rPr>
       </w:pPr>
-      <w:hyperlink w:anchor="_Toc225506240" w:history="1">
+      <w:hyperlink w:anchor="_Toc239766205" w:history="1">
         <w:r>
           <w:rPr>
             <w:rStyle w:val="Hyperlink"/>
@@ -558,7 +558,7 @@
             <w:noProof/>
             <w:webHidden/>
           </w:rPr>
-          <w:instrText xml:space="preserve"> PAGEREF _Toc225506240 \h </w:instrText>
+          <w:instrText xml:space="preserve"> PAGEREF _Toc239766205 \h </w:instrText>
         </w:r>
         <w:r>
           <w:rPr>
@@ -607,7 +607,7 @@
           <w14:ligatures w14:val="standardContextual"/>
         </w:rPr>
       </w:pPr>
-      <w:hyperlink w:anchor="_Toc225506241" w:history="1">
+      <w:hyperlink w:anchor="_Toc239766206" w:history="1">
         <w:r>
           <w:rPr>
             <w:rStyle w:val="Hyperlink"/>
@@ -654,7 +654,7 @@
             <w:noProof/>
             <w:webHidden/>
           </w:rPr>
-          <w:instrText xml:space="preserve"> PAGEREF _Toc225506241 \h </w:instrText>
+          <w:instrText xml:space="preserve"> PAGEREF _Toc239766206 \h </w:instrText>
         </w:r>
         <w:r>
           <w:rPr>
@@ -703,7 +703,7 @@
           <w14:ligatures w14:val="standardContextual"/>
         </w:rPr>
       </w:pPr>
-      <w:hyperlink w:anchor="_Toc225506242" w:history="1">
+      <w:hyperlink w:anchor="_Toc239766207" w:history="1">
         <w:r>
           <w:rPr>
             <w:rStyle w:val="Hyperlink"/>
@@ -750,7 +750,7 @@
             <w:noProof/>
             <w:webHidden/>
           </w:rPr>
-          <w:instrText xml:space="preserve"> PAGEREF _Toc225506242 \h </w:instrText>
+          <w:instrText xml:space="preserve"> PAGEREF _Toc239766207 \h </w:instrText>
         </w:r>
         <w:r>
           <w:rPr>
@@ -799,7 +799,7 @@
           <w14:ligatures w14:val="standardContextual"/>
         </w:rPr>
       </w:pPr>
-      <w:hyperlink w:anchor="_Toc225506243" w:history="1">
+      <w:hyperlink w:anchor="_Toc239766208" w:history="1">
         <w:r>
           <w:rPr>
             <w:rStyle w:val="Hyperlink"/>
@@ -846,7 +846,7 @@
             <w:noProof/>
             <w:webHidden/>
           </w:rPr>
-          <w:instrText xml:space="preserve"> PAGEREF _Toc225506243 \h </w:instrText>
+          <w:instrText xml:space="preserve"> PAGEREF _Toc239766208 \h </w:instrText>
         </w:r>
         <w:r>
           <w:rPr>
@@ -895,7 +895,7 @@
           <w14:ligatures w14:val="standardContextual"/>
         </w:rPr>
       </w:pPr>
-      <w:hyperlink w:anchor="_Toc225506244" w:history="1">
+      <w:hyperlink w:anchor="_Toc239766209" w:history="1">
         <w:r>
           <w:rPr>
             <w:rStyle w:val="Hyperlink"/>
@@ -942,7 +942,7 @@
             <w:noProof/>
             <w:webHidden/>
           </w:rPr>
-          <w:instrText xml:space="preserve"> PAGEREF _Toc225506244 \h </w:instrText>
+          <w:instrText xml:space="preserve"> PAGEREF _Toc239766209 \h </w:instrText>
         </w:r>
         <w:r>
           <w:rPr>
@@ -991,7 +991,7 @@
           <w14:ligatures w14:val="standardContextual"/>
         </w:rPr>
       </w:pPr>
-      <w:hyperlink w:anchor="_Toc225506245" w:history="1">
+      <w:hyperlink w:anchor="_Toc239766210" w:history="1">
         <w:r>
           <w:rPr>
             <w:rStyle w:val="Hyperlink"/>
@@ -1038,7 +1038,7 @@
             <w:noProof/>
             <w:webHidden/>
           </w:rPr>
-          <w:instrText xml:space="preserve"> PAGEREF _Toc225506245 \h </w:instrText>
+          <w:instrText xml:space="preserve"> PAGEREF _Toc239766210 \h </w:instrText>
         </w:r>
         <w:r>
           <w:rPr>
@@ -1085,7 +1085,7 @@
           <w14:ligatures w14:val="standardContextual"/>
         </w:rPr>
       </w:pPr>
-      <w:hyperlink w:anchor="_Toc225506246" w:history="1">
+      <w:hyperlink w:anchor="_Toc239766211" w:history="1">
         <w:r>
           <w:rPr>
             <w:rStyle w:val="Hyperlink"/>
@@ -1130,7 +1130,7 @@
             <w:noProof/>
             <w:webHidden/>
           </w:rPr>
-          <w:instrText xml:space="preserve"> PAGEREF _Toc225506246 \h </w:instrText>
+          <w:instrText xml:space="preserve"> PAGEREF _Toc239766211 \h </w:instrText>
         </w:r>
         <w:r>
           <w:rPr>
@@ -1179,7 +1179,7 @@
           <w14:ligatures w14:val="standardContextual"/>
         </w:rPr>
       </w:pPr>
-      <w:hyperlink w:anchor="_Toc225506247" w:history="1">
+      <w:hyperlink w:anchor="_Toc239766212" w:history="1">
         <w:r>
           <w:rPr>
             <w:rStyle w:val="Hyperlink"/>
@@ -1205,7 +1205,7 @@
             <w:rStyle w:val="Hyperlink"/>
             <w:noProof/>
           </w:rPr>
-          <w:t>Version 7.2 (March 2026)</w:t>
+          <w:t>Version 7.3 (September 2026)</w:t>
         </w:r>
         <w:r>
           <w:rPr>
@@ -1226,7 +1226,7 @@
             <w:noProof/>
             <w:webHidden/>
           </w:rPr>
-          <w:instrText xml:space="preserve"> PAGEREF _Toc225506247 \h </w:instrText>
+          <w:instrText xml:space="preserve"> PAGEREF _Toc239766212 \h </w:instrText>
         </w:r>
         <w:r>
           <w:rPr>
@@ -1275,7 +1275,7 @@
           <w14:ligatures w14:val="standardContextual"/>
         </w:rPr>
       </w:pPr>
-      <w:hyperlink w:anchor="_Toc225506248" w:history="1">
+      <w:hyperlink w:anchor="_Toc239766213" w:history="1">
         <w:r>
           <w:rPr>
             <w:rStyle w:val="Hyperlink"/>
@@ -1301,7 +1301,7 @@
             <w:rStyle w:val="Hyperlink"/>
             <w:noProof/>
           </w:rPr>
-          <w:t>Version 7.1 (September 2025)</w:t>
+          <w:t>Version 7.2 (March 2026)</w:t>
         </w:r>
         <w:r>
           <w:rPr>
@@ -1322,7 +1322,7 @@
             <w:noProof/>
             <w:webHidden/>
           </w:rPr>
-          <w:instrText xml:space="preserve"> PAGEREF _Toc225506248 \h </w:instrText>
+          <w:instrText xml:space="preserve"> PAGEREF _Toc239766213 \h </w:instrText>
         </w:r>
         <w:r>
           <w:rPr>
@@ -1371,7 +1371,7 @@
           <w14:ligatures w14:val="standardContextual"/>
         </w:rPr>
       </w:pPr>
-      <w:hyperlink w:anchor="_Toc225506249" w:history="1">
+      <w:hyperlink w:anchor="_Toc239766214" w:history="1">
         <w:r>
           <w:rPr>
             <w:rStyle w:val="Hyperlink"/>
@@ -1397,7 +1397,7 @@
             <w:rStyle w:val="Hyperlink"/>
             <w:noProof/>
           </w:rPr>
-          <w:t>Version 7.0 (September 2024)</w:t>
+          <w:t>Version 7.1 (September 2025)</w:t>
         </w:r>
         <w:r>
           <w:rPr>
@@ -1418,7 +1418,7 @@
             <w:noProof/>
             <w:webHidden/>
           </w:rPr>
-          <w:instrText xml:space="preserve"> PAGEREF _Toc225506249 \h </w:instrText>
+          <w:instrText xml:space="preserve"> PAGEREF _Toc239766214 \h </w:instrText>
         </w:r>
         <w:r>
           <w:rPr>
@@ -1467,7 +1467,7 @@
           <w14:ligatures w14:val="standardContextual"/>
         </w:rPr>
       </w:pPr>
-      <w:hyperlink w:anchor="_Toc225506250" w:history="1">
+      <w:hyperlink w:anchor="_Toc239766215" w:history="1">
         <w:r>
           <w:rPr>
             <w:rStyle w:val="Hyperlink"/>
@@ -1493,7 +1493,7 @@
             <w:rStyle w:val="Hyperlink"/>
             <w:noProof/>
           </w:rPr>
-          <w:t>Version 6.0 (May 2021)</w:t>
+          <w:t>Version 7.0 (September 2024)</w:t>
         </w:r>
         <w:r>
           <w:rPr>
@@ -1514,7 +1514,7 @@
             <w:noProof/>
             <w:webHidden/>
           </w:rPr>
-          <w:instrText xml:space="preserve"> PAGEREF _Toc225506250 \h </w:instrText>
+          <w:instrText xml:space="preserve"> PAGEREF _Toc239766215 \h </w:instrText>
         </w:r>
         <w:r>
           <w:rPr>
@@ -1534,7 +1534,7 @@
             <w:noProof/>
             <w:webHidden/>
           </w:rPr>
-          <w:t>9</w:t>
+          <w:t>8</w:t>
         </w:r>
         <w:r>
           <w:rPr>
@@ -1563,7 +1563,7 @@
           <w14:ligatures w14:val="standardContextual"/>
         </w:rPr>
       </w:pPr>
-      <w:hyperlink w:anchor="_Toc225506251" w:history="1">
+      <w:hyperlink w:anchor="_Toc239766216" w:history="1">
         <w:r>
           <w:rPr>
             <w:rStyle w:val="Hyperlink"/>
@@ -1589,7 +1589,7 @@
             <w:rStyle w:val="Hyperlink"/>
             <w:noProof/>
           </w:rPr>
-          <w:t>Version 5.3 (March 2021)</w:t>
+          <w:t>Version 6.0 (May 2021)</w:t>
         </w:r>
         <w:r>
           <w:rPr>
@@ -1610,7 +1610,7 @@
             <w:noProof/>
             <w:webHidden/>
           </w:rPr>
-          <w:instrText xml:space="preserve"> PAGEREF _Toc225506251 \h </w:instrText>
+          <w:instrText xml:space="preserve"> PAGEREF _Toc239766216 \h </w:instrText>
         </w:r>
         <w:r>
           <w:rPr>
@@ -1659,7 +1659,7 @@
           <w14:ligatures w14:val="standardContextual"/>
         </w:rPr>
       </w:pPr>
-      <w:hyperlink w:anchor="_Toc225506252" w:history="1">
+      <w:hyperlink w:anchor="_Toc239766217" w:history="1">
         <w:r>
           <w:rPr>
             <w:rStyle w:val="Hyperlink"/>
@@ -1685,7 +1685,7 @@
             <w:rStyle w:val="Hyperlink"/>
             <w:noProof/>
           </w:rPr>
-          <w:t>Version 5.2 (September 2019)</w:t>
+          <w:t>Older Versions</w:t>
         </w:r>
         <w:r>
           <w:rPr>
@@ -1706,295 +1706,7 @@
             <w:noProof/>
             <w:webHidden/>
           </w:rPr>
-          <w:instrText xml:space="preserve"> PAGEREF _Toc225506252 \h </w:instrText>
-        </w:r>
-        <w:r>
-          <w:rPr>
-            <w:noProof/>
-            <w:webHidden/>
-          </w:rPr>
-        </w:r>
-        <w:r>
-          <w:rPr>
-            <w:noProof/>
-            <w:webHidden/>
-          </w:rPr>
-          <w:fldChar w:fldCharType="separate"/>
-        </w:r>
-        <w:r>
-          <w:rPr>
-            <w:noProof/>
-            <w:webHidden/>
-          </w:rPr>
-          <w:t>9</w:t>
-        </w:r>
-        <w:r>
-          <w:rPr>
-            <w:noProof/>
-            <w:webHidden/>
-          </w:rPr>
-          <w:fldChar w:fldCharType="end"/>
-        </w:r>
-      </w:hyperlink>
-    </w:p>
-    <w:p>
-      <w:pPr>
-        <w:pStyle w:val="TOC3"/>
-        <w:tabs>
-          <w:tab w:val="left" w:pos="1200"/>
-          <w:tab w:val="right" w:leader="dot" w:pos="8976"/>
-        </w:tabs>
-        <w:rPr>
-          <w:rFonts w:asciiTheme="minorHAnsi" w:eastAsiaTheme="minorEastAsia" w:hAnsiTheme="minorHAnsi" w:cstheme="minorBidi"/>
-          <w:i w:val="0"/>
-          <w:iCs w:val="0"/>
-          <w:noProof/>
-          <w:kern w:val="2"/>
-          <w:sz w:val="24"/>
-          <w:szCs w:val="24"/>
-          <w14:ligatures w14:val="standardContextual"/>
-        </w:rPr>
-      </w:pPr>
-      <w:hyperlink w:anchor="_Toc225506253" w:history="1">
-        <w:r>
-          <w:rPr>
-            <w:rStyle w:val="Hyperlink"/>
-            <w:noProof/>
-          </w:rPr>
-          <w:t>1.2.7</w:t>
-        </w:r>
-        <w:r>
-          <w:rPr>
-            <w:rFonts w:asciiTheme="minorHAnsi" w:eastAsiaTheme="minorEastAsia" w:hAnsiTheme="minorHAnsi" w:cstheme="minorBidi"/>
-            <w:i w:val="0"/>
-            <w:iCs w:val="0"/>
-            <w:noProof/>
-            <w:kern w:val="2"/>
-            <w:sz w:val="24"/>
-            <w:szCs w:val="24"/>
-            <w14:ligatures w14:val="standardContextual"/>
-          </w:rPr>
-          <w:tab/>
-        </w:r>
-        <w:r>
-          <w:rPr>
-            <w:rStyle w:val="Hyperlink"/>
-            <w:noProof/>
-          </w:rPr>
-          <w:t>Version 5.1 (March 2019)</w:t>
-        </w:r>
-        <w:r>
-          <w:rPr>
-            <w:noProof/>
-            <w:webHidden/>
-          </w:rPr>
-          <w:tab/>
-        </w:r>
-        <w:r>
-          <w:rPr>
-            <w:noProof/>
-            <w:webHidden/>
-          </w:rPr>
-          <w:fldChar w:fldCharType="begin"/>
-        </w:r>
-        <w:r>
-          <w:rPr>
-            <w:noProof/>
-            <w:webHidden/>
-          </w:rPr>
-          <w:instrText xml:space="preserve"> PAGEREF _Toc225506253 \h </w:instrText>
-        </w:r>
-        <w:r>
-          <w:rPr>
-            <w:noProof/>
-            <w:webHidden/>
-          </w:rPr>
-        </w:r>
-        <w:r>
-          <w:rPr>
-            <w:noProof/>
-            <w:webHidden/>
-          </w:rPr>
-          <w:fldChar w:fldCharType="separate"/>
-        </w:r>
-        <w:r>
-          <w:rPr>
-            <w:noProof/>
-            <w:webHidden/>
-          </w:rPr>
-          <w:t>9</w:t>
-        </w:r>
-        <w:r>
-          <w:rPr>
-            <w:noProof/>
-            <w:webHidden/>
-          </w:rPr>
-          <w:fldChar w:fldCharType="end"/>
-        </w:r>
-      </w:hyperlink>
-    </w:p>
-    <w:p>
-      <w:pPr>
-        <w:pStyle w:val="TOC3"/>
-        <w:tabs>
-          <w:tab w:val="left" w:pos="1200"/>
-          <w:tab w:val="right" w:leader="dot" w:pos="8976"/>
-        </w:tabs>
-        <w:rPr>
-          <w:rFonts w:asciiTheme="minorHAnsi" w:eastAsiaTheme="minorEastAsia" w:hAnsiTheme="minorHAnsi" w:cstheme="minorBidi"/>
-          <w:i w:val="0"/>
-          <w:iCs w:val="0"/>
-          <w:noProof/>
-          <w:kern w:val="2"/>
-          <w:sz w:val="24"/>
-          <w:szCs w:val="24"/>
-          <w14:ligatures w14:val="standardContextual"/>
-        </w:rPr>
-      </w:pPr>
-      <w:hyperlink w:anchor="_Toc225506254" w:history="1">
-        <w:r>
-          <w:rPr>
-            <w:rStyle w:val="Hyperlink"/>
-            <w:noProof/>
-          </w:rPr>
-          <w:t>1.2.8</w:t>
-        </w:r>
-        <w:r>
-          <w:rPr>
-            <w:rFonts w:asciiTheme="minorHAnsi" w:eastAsiaTheme="minorEastAsia" w:hAnsiTheme="minorHAnsi" w:cstheme="minorBidi"/>
-            <w:i w:val="0"/>
-            <w:iCs w:val="0"/>
-            <w:noProof/>
-            <w:kern w:val="2"/>
-            <w:sz w:val="24"/>
-            <w:szCs w:val="24"/>
-            <w14:ligatures w14:val="standardContextual"/>
-          </w:rPr>
-          <w:tab/>
-        </w:r>
-        <w:r>
-          <w:rPr>
-            <w:rStyle w:val="Hyperlink"/>
-            <w:noProof/>
-          </w:rPr>
-          <w:t>Version 5.0 (August 2018)</w:t>
-        </w:r>
-        <w:r>
-          <w:rPr>
-            <w:noProof/>
-            <w:webHidden/>
-          </w:rPr>
-          <w:tab/>
-        </w:r>
-        <w:r>
-          <w:rPr>
-            <w:noProof/>
-            <w:webHidden/>
-          </w:rPr>
-          <w:fldChar w:fldCharType="begin"/>
-        </w:r>
-        <w:r>
-          <w:rPr>
-            <w:noProof/>
-            <w:webHidden/>
-          </w:rPr>
-          <w:instrText xml:space="preserve"> PAGEREF _Toc225506254 \h </w:instrText>
-        </w:r>
-        <w:r>
-          <w:rPr>
-            <w:noProof/>
-            <w:webHidden/>
-          </w:rPr>
-        </w:r>
-        <w:r>
-          <w:rPr>
-            <w:noProof/>
-            <w:webHidden/>
-          </w:rPr>
-          <w:fldChar w:fldCharType="separate"/>
-        </w:r>
-        <w:r>
-          <w:rPr>
-            <w:noProof/>
-            <w:webHidden/>
-          </w:rPr>
-          <w:t>9</w:t>
-        </w:r>
-        <w:r>
-          <w:rPr>
-            <w:noProof/>
-            <w:webHidden/>
-          </w:rPr>
-          <w:fldChar w:fldCharType="end"/>
-        </w:r>
-      </w:hyperlink>
-    </w:p>
-    <w:p>
-      <w:pPr>
-        <w:pStyle w:val="TOC3"/>
-        <w:tabs>
-          <w:tab w:val="left" w:pos="1200"/>
-          <w:tab w:val="right" w:leader="dot" w:pos="8976"/>
-        </w:tabs>
-        <w:rPr>
-          <w:rFonts w:asciiTheme="minorHAnsi" w:eastAsiaTheme="minorEastAsia" w:hAnsiTheme="minorHAnsi" w:cstheme="minorBidi"/>
-          <w:i w:val="0"/>
-          <w:iCs w:val="0"/>
-          <w:noProof/>
-          <w:kern w:val="2"/>
-          <w:sz w:val="24"/>
-          <w:szCs w:val="24"/>
-          <w14:ligatures w14:val="standardContextual"/>
-        </w:rPr>
-      </w:pPr>
-      <w:hyperlink w:anchor="_Toc225506255" w:history="1">
-        <w:r>
-          <w:rPr>
-            <w:rStyle w:val="Hyperlink"/>
-            <w:noProof/>
-          </w:rPr>
-          <w:t>1.2.9</w:t>
-        </w:r>
-        <w:r>
-          <w:rPr>
-            <w:rFonts w:asciiTheme="minorHAnsi" w:eastAsiaTheme="minorEastAsia" w:hAnsiTheme="minorHAnsi" w:cstheme="minorBidi"/>
-            <w:i w:val="0"/>
-            <w:iCs w:val="0"/>
-            <w:noProof/>
-            <w:kern w:val="2"/>
-            <w:sz w:val="24"/>
-            <w:szCs w:val="24"/>
-            <w14:ligatures w14:val="standardContextual"/>
-          </w:rPr>
-          <w:tab/>
-        </w:r>
-        <w:r>
-          <w:rPr>
-            <w:rStyle w:val="Hyperlink"/>
-            <w:noProof/>
-          </w:rPr>
-          <w:t>Older Versions</w:t>
-        </w:r>
-        <w:r>
-          <w:rPr>
-            <w:noProof/>
-            <w:webHidden/>
-          </w:rPr>
-          <w:tab/>
-        </w:r>
-        <w:r>
-          <w:rPr>
-            <w:noProof/>
-            <w:webHidden/>
-          </w:rPr>
-          <w:fldChar w:fldCharType="begin"/>
-        </w:r>
-        <w:r>
-          <w:rPr>
-            <w:noProof/>
-            <w:webHidden/>
-          </w:rPr>
-          <w:instrText xml:space="preserve"> PAGEREF _Toc225506255 \h </w:instrText>
+          <w:instrText xml:space="preserve"> PAGEREF _Toc239766217 \h </w:instrText>
         </w:r>
         <w:r>
           <w:rPr>
@@ -2041,7 +1753,7 @@
           <w14:ligatures w14:val="standardContextual"/>
         </w:rPr>
       </w:pPr>
-      <w:hyperlink w:anchor="_Toc225506256" w:history="1">
+      <w:hyperlink w:anchor="_Toc239766218" w:history="1">
         <w:r>
           <w:rPr>
             <w:rStyle w:val="Hyperlink"/>
@@ -2086,7 +1798,7 @@
             <w:noProof/>
             <w:webHidden/>
           </w:rPr>
-          <w:instrText xml:space="preserve"> PAGEREF _Toc225506256 \h </w:instrText>
+          <w:instrText xml:space="preserve"> PAGEREF _Toc239766218 \h </w:instrText>
         </w:r>
         <w:r>
           <w:rPr>
@@ -2133,7 +1845,7 @@
           <w14:ligatures w14:val="standardContextual"/>
         </w:rPr>
       </w:pPr>
-      <w:hyperlink w:anchor="_Toc225506257" w:history="1">
+      <w:hyperlink w:anchor="_Toc239766219" w:history="1">
         <w:r>
           <w:rPr>
             <w:rStyle w:val="Hyperlink"/>
@@ -2178,7 +1890,7 @@
             <w:noProof/>
             <w:webHidden/>
           </w:rPr>
-          <w:instrText xml:space="preserve"> PAGEREF _Toc225506257 \h </w:instrText>
+          <w:instrText xml:space="preserve"> PAGEREF _Toc239766219 \h </w:instrText>
         </w:r>
         <w:r>
           <w:rPr>
@@ -2225,7 +1937,7 @@
           <w14:ligatures w14:val="standardContextual"/>
         </w:rPr>
       </w:pPr>
-      <w:hyperlink w:anchor="_Toc225506258" w:history="1">
+      <w:hyperlink w:anchor="_Toc239766220" w:history="1">
         <w:r>
           <w:rPr>
             <w:rStyle w:val="Hyperlink"/>
@@ -2270,7 +1982,7 @@
             <w:noProof/>
             <w:webHidden/>
           </w:rPr>
-          <w:instrText xml:space="preserve"> PAGEREF _Toc225506258 \h </w:instrText>
+          <w:instrText xml:space="preserve"> PAGEREF _Toc239766220 \h </w:instrText>
         </w:r>
         <w:r>
           <w:rPr>
@@ -2320,7 +2032,7 @@
           <w14:ligatures w14:val="standardContextual"/>
         </w:rPr>
       </w:pPr>
-      <w:hyperlink w:anchor="_Toc225506259" w:history="1">
+      <w:hyperlink w:anchor="_Toc239766221" w:history="1">
         <w:r>
           <w:rPr>
             <w:rStyle w:val="Hyperlink"/>
@@ -2368,7 +2080,7 @@
             <w:noProof/>
             <w:webHidden/>
           </w:rPr>
-          <w:instrText xml:space="preserve"> PAGEREF _Toc225506259 \h </w:instrText>
+          <w:instrText xml:space="preserve"> PAGEREF _Toc239766221 \h </w:instrText>
         </w:r>
         <w:r>
           <w:rPr>
@@ -2415,7 +2127,7 @@
           <w14:ligatures w14:val="standardContextual"/>
         </w:rPr>
       </w:pPr>
-      <w:hyperlink w:anchor="_Toc225506260" w:history="1">
+      <w:hyperlink w:anchor="_Toc239766222" w:history="1">
         <w:r>
           <w:rPr>
             <w:rStyle w:val="Hyperlink"/>
@@ -2460,7 +2172,7 @@
             <w:noProof/>
             <w:webHidden/>
           </w:rPr>
-          <w:instrText xml:space="preserve"> PAGEREF _Toc225506260 \h </w:instrText>
+          <w:instrText xml:space="preserve"> PAGEREF _Toc239766222 \h </w:instrText>
         </w:r>
         <w:r>
           <w:rPr>
@@ -2507,7 +2219,7 @@
           <w14:ligatures w14:val="standardContextual"/>
         </w:rPr>
       </w:pPr>
-      <w:hyperlink w:anchor="_Toc225506261" w:history="1">
+      <w:hyperlink w:anchor="_Toc239766223" w:history="1">
         <w:r>
           <w:rPr>
             <w:rStyle w:val="Hyperlink"/>
@@ -2552,7 +2264,7 @@
             <w:noProof/>
             <w:webHidden/>
           </w:rPr>
-          <w:instrText xml:space="preserve"> PAGEREF _Toc225506261 \h </w:instrText>
+          <w:instrText xml:space="preserve"> PAGEREF _Toc239766223 \h </w:instrText>
         </w:r>
         <w:r>
           <w:rPr>
@@ -2599,7 +2311,7 @@
           <w14:ligatures w14:val="standardContextual"/>
         </w:rPr>
       </w:pPr>
-      <w:hyperlink w:anchor="_Toc225506262" w:history="1">
+      <w:hyperlink w:anchor="_Toc239766224" w:history="1">
         <w:r>
           <w:rPr>
             <w:rStyle w:val="Hyperlink"/>
@@ -2644,7 +2356,7 @@
             <w:noProof/>
             <w:webHidden/>
           </w:rPr>
-          <w:instrText xml:space="preserve"> PAGEREF _Toc225506262 \h </w:instrText>
+          <w:instrText xml:space="preserve"> PAGEREF _Toc239766224 \h </w:instrText>
         </w:r>
         <w:r>
           <w:rPr>
@@ -2691,7 +2403,7 @@
           <w14:ligatures w14:val="standardContextual"/>
         </w:rPr>
       </w:pPr>
-      <w:hyperlink w:anchor="_Toc225506263" w:history="1">
+      <w:hyperlink w:anchor="_Toc239766225" w:history="1">
         <w:r>
           <w:rPr>
             <w:rStyle w:val="Hyperlink"/>
@@ -2736,7 +2448,7 @@
             <w:noProof/>
             <w:webHidden/>
           </w:rPr>
-          <w:instrText xml:space="preserve"> PAGEREF _Toc225506263 \h </w:instrText>
+          <w:instrText xml:space="preserve"> PAGEREF _Toc239766225 \h </w:instrText>
         </w:r>
         <w:r>
           <w:rPr>
@@ -2783,7 +2495,7 @@
           <w14:ligatures w14:val="standardContextual"/>
         </w:rPr>
       </w:pPr>
-      <w:hyperlink w:anchor="_Toc225506264" w:history="1">
+      <w:hyperlink w:anchor="_Toc239766226" w:history="1">
         <w:r>
           <w:rPr>
             <w:rStyle w:val="Hyperlink"/>
@@ -2828,7 +2540,7 @@
             <w:noProof/>
             <w:webHidden/>
           </w:rPr>
-          <w:instrText xml:space="preserve"> PAGEREF _Toc225506264 \h </w:instrText>
+          <w:instrText xml:space="preserve"> PAGEREF _Toc239766226 \h </w:instrText>
         </w:r>
         <w:r>
           <w:rPr>
@@ -2875,7 +2587,7 @@
           <w14:ligatures w14:val="standardContextual"/>
         </w:rPr>
       </w:pPr>
-      <w:hyperlink w:anchor="_Toc225506265" w:history="1">
+      <w:hyperlink w:anchor="_Toc239766227" w:history="1">
         <w:r>
           <w:rPr>
             <w:rStyle w:val="Hyperlink"/>
@@ -2920,7 +2632,7 @@
             <w:noProof/>
             <w:webHidden/>
           </w:rPr>
-          <w:instrText xml:space="preserve"> PAGEREF _Toc225506265 \h </w:instrText>
+          <w:instrText xml:space="preserve"> PAGEREF _Toc239766227 \h </w:instrText>
         </w:r>
         <w:r>
           <w:rPr>
@@ -2967,7 +2679,7 @@
           <w14:ligatures w14:val="standardContextual"/>
         </w:rPr>
       </w:pPr>
-      <w:hyperlink w:anchor="_Toc225506266" w:history="1">
+      <w:hyperlink w:anchor="_Toc239766228" w:history="1">
         <w:r>
           <w:rPr>
             <w:rStyle w:val="Hyperlink"/>
@@ -3012,7 +2724,7 @@
             <w:noProof/>
             <w:webHidden/>
           </w:rPr>
-          <w:instrText xml:space="preserve"> PAGEREF _Toc225506266 \h </w:instrText>
+          <w:instrText xml:space="preserve"> PAGEREF _Toc239766228 \h </w:instrText>
         </w:r>
         <w:r>
           <w:rPr>
@@ -3059,7 +2771,7 @@
           <w14:ligatures w14:val="standardContextual"/>
         </w:rPr>
       </w:pPr>
-      <w:hyperlink w:anchor="_Toc225506267" w:history="1">
+      <w:hyperlink w:anchor="_Toc239766229" w:history="1">
         <w:r>
           <w:rPr>
             <w:rStyle w:val="Hyperlink"/>
@@ -3104,7 +2816,7 @@
             <w:noProof/>
             <w:webHidden/>
           </w:rPr>
-          <w:instrText xml:space="preserve"> PAGEREF _Toc225506267 \h </w:instrText>
+          <w:instrText xml:space="preserve"> PAGEREF _Toc239766229 \h </w:instrText>
         </w:r>
         <w:r>
           <w:rPr>
@@ -3151,7 +2863,7 @@
           <w14:ligatures w14:val="standardContextual"/>
         </w:rPr>
       </w:pPr>
-      <w:hyperlink w:anchor="_Toc225506268" w:history="1">
+      <w:hyperlink w:anchor="_Toc239766230" w:history="1">
         <w:r>
           <w:rPr>
             <w:rStyle w:val="Hyperlink"/>
@@ -3196,7 +2908,7 @@
             <w:noProof/>
             <w:webHidden/>
           </w:rPr>
-          <w:instrText xml:space="preserve"> PAGEREF _Toc225506268 \h </w:instrText>
+          <w:instrText xml:space="preserve"> PAGEREF _Toc239766230 \h </w:instrText>
         </w:r>
         <w:r>
           <w:rPr>
@@ -3243,7 +2955,7 @@
           <w14:ligatures w14:val="standardContextual"/>
         </w:rPr>
       </w:pPr>
-      <w:hyperlink w:anchor="_Toc225506269" w:history="1">
+      <w:hyperlink w:anchor="_Toc239766231" w:history="1">
         <w:r>
           <w:rPr>
             <w:rStyle w:val="Hyperlink"/>
@@ -3288,7 +3000,7 @@
             <w:noProof/>
             <w:webHidden/>
           </w:rPr>
-          <w:instrText xml:space="preserve"> PAGEREF _Toc225506269 \h </w:instrText>
+          <w:instrText xml:space="preserve"> PAGEREF _Toc239766231 \h </w:instrText>
         </w:r>
         <w:r>
           <w:rPr>
@@ -3337,7 +3049,7 @@
           <w14:ligatures w14:val="standardContextual"/>
         </w:rPr>
       </w:pPr>
-      <w:hyperlink w:anchor="_Toc225506270" w:history="1">
+      <w:hyperlink w:anchor="_Toc239766232" w:history="1">
         <w:r>
           <w:rPr>
             <w:rStyle w:val="Hyperlink"/>
@@ -3384,7 +3096,7 @@
             <w:noProof/>
             <w:webHidden/>
           </w:rPr>
-          <w:instrText xml:space="preserve"> PAGEREF _Toc225506270 \h </w:instrText>
+          <w:instrText xml:space="preserve"> PAGEREF _Toc239766232 \h </w:instrText>
         </w:r>
         <w:r>
           <w:rPr>
@@ -3433,7 +3145,7 @@
           <w14:ligatures w14:val="standardContextual"/>
         </w:rPr>
       </w:pPr>
-      <w:hyperlink w:anchor="_Toc225506271" w:history="1">
+      <w:hyperlink w:anchor="_Toc239766233" w:history="1">
         <w:r>
           <w:rPr>
             <w:rStyle w:val="Hyperlink"/>
@@ -3480,7 +3192,7 @@
             <w:noProof/>
             <w:webHidden/>
           </w:rPr>
-          <w:instrText xml:space="preserve"> PAGEREF _Toc225506271 \h </w:instrText>
+          <w:instrText xml:space="preserve"> PAGEREF _Toc239766233 \h </w:instrText>
         </w:r>
         <w:r>
           <w:rPr>
@@ -3529,7 +3241,7 @@
           <w14:ligatures w14:val="standardContextual"/>
         </w:rPr>
       </w:pPr>
-      <w:hyperlink w:anchor="_Toc225506272" w:history="1">
+      <w:hyperlink w:anchor="_Toc239766234" w:history="1">
         <w:r>
           <w:rPr>
             <w:rStyle w:val="Hyperlink"/>
@@ -3576,7 +3288,7 @@
             <w:noProof/>
             <w:webHidden/>
           </w:rPr>
-          <w:instrText xml:space="preserve"> PAGEREF _Toc225506272 \h </w:instrText>
+          <w:instrText xml:space="preserve"> PAGEREF _Toc239766234 \h </w:instrText>
         </w:r>
         <w:r>
           <w:rPr>
@@ -3625,7 +3337,7 @@
           <w14:ligatures w14:val="standardContextual"/>
         </w:rPr>
       </w:pPr>
-      <w:hyperlink w:anchor="_Toc225506273" w:history="1">
+      <w:hyperlink w:anchor="_Toc239766235" w:history="1">
         <w:r>
           <w:rPr>
             <w:rStyle w:val="Hyperlink"/>
@@ -3672,7 +3384,7 @@
             <w:noProof/>
             <w:webHidden/>
           </w:rPr>
-          <w:instrText xml:space="preserve"> PAGEREF _Toc225506273 \h </w:instrText>
+          <w:instrText xml:space="preserve"> PAGEREF _Toc239766235 \h </w:instrText>
         </w:r>
         <w:r>
           <w:rPr>
@@ -3719,7 +3431,7 @@
           <w14:ligatures w14:val="standardContextual"/>
         </w:rPr>
       </w:pPr>
-      <w:hyperlink w:anchor="_Toc225506274" w:history="1">
+      <w:hyperlink w:anchor="_Toc239766236" w:history="1">
         <w:r>
           <w:rPr>
             <w:rStyle w:val="Hyperlink"/>
@@ -3764,7 +3476,7 @@
             <w:noProof/>
             <w:webHidden/>
           </w:rPr>
-          <w:instrText xml:space="preserve"> PAGEREF _Toc225506274 \h </w:instrText>
+          <w:instrText xml:space="preserve"> PAGEREF _Toc239766236 \h </w:instrText>
         </w:r>
         <w:r>
           <w:rPr>
@@ -3813,7 +3525,7 @@
           <w14:ligatures w14:val="standardContextual"/>
         </w:rPr>
       </w:pPr>
-      <w:hyperlink w:anchor="_Toc225506275" w:history="1">
+      <w:hyperlink w:anchor="_Toc239766237" w:history="1">
         <w:r>
           <w:rPr>
             <w:rStyle w:val="Hyperlink"/>
@@ -3860,7 +3572,7 @@
             <w:noProof/>
             <w:webHidden/>
           </w:rPr>
-          <w:instrText xml:space="preserve"> PAGEREF _Toc225506275 \h </w:instrText>
+          <w:instrText xml:space="preserve"> PAGEREF _Toc239766237 \h </w:instrText>
         </w:r>
         <w:r>
           <w:rPr>
@@ -3909,7 +3621,7 @@
           <w14:ligatures w14:val="standardContextual"/>
         </w:rPr>
       </w:pPr>
-      <w:hyperlink w:anchor="_Toc225506276" w:history="1">
+      <w:hyperlink w:anchor="_Toc239766238" w:history="1">
         <w:r>
           <w:rPr>
             <w:rStyle w:val="Hyperlink"/>
@@ -3956,7 +3668,7 @@
             <w:noProof/>
             <w:webHidden/>
           </w:rPr>
-          <w:instrText xml:space="preserve"> PAGEREF _Toc225506276 \h </w:instrText>
+          <w:instrText xml:space="preserve"> PAGEREF _Toc239766238 \h </w:instrText>
         </w:r>
         <w:r>
           <w:rPr>
@@ -4003,7 +3715,7 @@
           <w14:ligatures w14:val="standardContextual"/>
         </w:rPr>
       </w:pPr>
-      <w:hyperlink w:anchor="_Toc225506277" w:history="1">
+      <w:hyperlink w:anchor="_Toc239766239" w:history="1">
         <w:r>
           <w:rPr>
             <w:rStyle w:val="Hyperlink"/>
@@ -4048,7 +3760,7 @@
             <w:noProof/>
             <w:webHidden/>
           </w:rPr>
-          <w:instrText xml:space="preserve"> PAGEREF _Toc225506277 \h </w:instrText>
+          <w:instrText xml:space="preserve"> PAGEREF _Toc239766239 \h </w:instrText>
         </w:r>
         <w:r>
           <w:rPr>
@@ -4097,7 +3809,7 @@
           <w14:ligatures w14:val="standardContextual"/>
         </w:rPr>
       </w:pPr>
-      <w:hyperlink w:anchor="_Toc225506278" w:history="1">
+      <w:hyperlink w:anchor="_Toc239766240" w:history="1">
         <w:r>
           <w:rPr>
             <w:rStyle w:val="Hyperlink"/>
@@ -4144,7 +3856,7 @@
             <w:noProof/>
             <w:webHidden/>
           </w:rPr>
-          <w:instrText xml:space="preserve"> PAGEREF _Toc225506278 \h </w:instrText>
+          <w:instrText xml:space="preserve"> PAGEREF _Toc239766240 \h </w:instrText>
         </w:r>
         <w:r>
           <w:rPr>
@@ -4193,7 +3905,7 @@
           <w14:ligatures w14:val="standardContextual"/>
         </w:rPr>
       </w:pPr>
-      <w:hyperlink w:anchor="_Toc225506279" w:history="1">
+      <w:hyperlink w:anchor="_Toc239766241" w:history="1">
         <w:r>
           <w:rPr>
             <w:rStyle w:val="Hyperlink"/>
@@ -4240,7 +3952,7 @@
             <w:noProof/>
             <w:webHidden/>
           </w:rPr>
-          <w:instrText xml:space="preserve"> PAGEREF _Toc225506279 \h </w:instrText>
+          <w:instrText xml:space="preserve"> PAGEREF _Toc239766241 \h </w:instrText>
         </w:r>
         <w:r>
           <w:rPr>
@@ -4289,7 +4001,7 @@
           <w14:ligatures w14:val="standardContextual"/>
         </w:rPr>
       </w:pPr>
-      <w:hyperlink w:anchor="_Toc225506280" w:history="1">
+      <w:hyperlink w:anchor="_Toc239766242" w:history="1">
         <w:r>
           <w:rPr>
             <w:rStyle w:val="Hyperlink"/>
@@ -4336,7 +4048,7 @@
             <w:noProof/>
             <w:webHidden/>
           </w:rPr>
-          <w:instrText xml:space="preserve"> PAGEREF _Toc225506280 \h </w:instrText>
+          <w:instrText xml:space="preserve"> PAGEREF _Toc239766242 \h </w:instrText>
         </w:r>
         <w:r>
           <w:rPr>
@@ -4385,7 +4097,7 @@
           <w14:ligatures w14:val="standardContextual"/>
         </w:rPr>
       </w:pPr>
-      <w:hyperlink w:anchor="_Toc225506281" w:history="1">
+      <w:hyperlink w:anchor="_Toc239766243" w:history="1">
         <w:r>
           <w:rPr>
             <w:rStyle w:val="Hyperlink"/>
@@ -4432,7 +4144,7 @@
             <w:noProof/>
             <w:webHidden/>
           </w:rPr>
-          <w:instrText xml:space="preserve"> PAGEREF _Toc225506281 \h </w:instrText>
+          <w:instrText xml:space="preserve"> PAGEREF _Toc239766243 \h </w:instrText>
         </w:r>
         <w:r>
           <w:rPr>
@@ -4481,7 +4193,7 @@
           <w14:ligatures w14:val="standardContextual"/>
         </w:rPr>
       </w:pPr>
-      <w:hyperlink w:anchor="_Toc225506282" w:history="1">
+      <w:hyperlink w:anchor="_Toc239766244" w:history="1">
         <w:r>
           <w:rPr>
             <w:rStyle w:val="Hyperlink"/>
@@ -4528,7 +4240,7 @@
             <w:noProof/>
             <w:webHidden/>
           </w:rPr>
-          <w:instrText xml:space="preserve"> PAGEREF _Toc225506282 \h </w:instrText>
+          <w:instrText xml:space="preserve"> PAGEREF _Toc239766244 \h </w:instrText>
         </w:r>
         <w:r>
           <w:rPr>
@@ -4577,7 +4289,7 @@
           <w14:ligatures w14:val="standardContextual"/>
         </w:rPr>
       </w:pPr>
-      <w:hyperlink w:anchor="_Toc225506283" w:history="1">
+      <w:hyperlink w:anchor="_Toc239766245" w:history="1">
         <w:r>
           <w:rPr>
             <w:rStyle w:val="Hyperlink"/>
@@ -4624,7 +4336,7 @@
             <w:noProof/>
             <w:webHidden/>
           </w:rPr>
-          <w:instrText xml:space="preserve"> PAGEREF _Toc225506283 \h </w:instrText>
+          <w:instrText xml:space="preserve"> PAGEREF _Toc239766245 \h </w:instrText>
         </w:r>
         <w:r>
           <w:rPr>
@@ -4671,7 +4383,7 @@
           <w14:ligatures w14:val="standardContextual"/>
         </w:rPr>
       </w:pPr>
-      <w:hyperlink w:anchor="_Toc225506284" w:history="1">
+      <w:hyperlink w:anchor="_Toc239766246" w:history="1">
         <w:r>
           <w:rPr>
             <w:rStyle w:val="Hyperlink"/>
@@ -4716,7 +4428,7 @@
             <w:noProof/>
             <w:webHidden/>
           </w:rPr>
-          <w:instrText xml:space="preserve"> PAGEREF _Toc225506284 \h </w:instrText>
+          <w:instrText xml:space="preserve"> PAGEREF _Toc239766246 \h </w:instrText>
         </w:r>
         <w:r>
           <w:rPr>
@@ -4765,7 +4477,7 @@
           <w14:ligatures w14:val="standardContextual"/>
         </w:rPr>
       </w:pPr>
-      <w:hyperlink w:anchor="_Toc225506285" w:history="1">
+      <w:hyperlink w:anchor="_Toc239766247" w:history="1">
         <w:r>
           <w:rPr>
             <w:rStyle w:val="Hyperlink"/>
@@ -4812,7 +4524,7 @@
             <w:noProof/>
             <w:webHidden/>
           </w:rPr>
-          <w:instrText xml:space="preserve"> PAGEREF _Toc225506285 \h </w:instrText>
+          <w:instrText xml:space="preserve"> PAGEREF _Toc239766247 \h </w:instrText>
         </w:r>
         <w:r>
           <w:rPr>
@@ -4861,7 +4573,7 @@
           <w14:ligatures w14:val="standardContextual"/>
         </w:rPr>
       </w:pPr>
-      <w:hyperlink w:anchor="_Toc225506286" w:history="1">
+      <w:hyperlink w:anchor="_Toc239766248" w:history="1">
         <w:r>
           <w:rPr>
             <w:rStyle w:val="Hyperlink"/>
@@ -4908,7 +4620,7 @@
             <w:noProof/>
             <w:webHidden/>
           </w:rPr>
-          <w:instrText xml:space="preserve"> PAGEREF _Toc225506286 \h </w:instrText>
+          <w:instrText xml:space="preserve"> PAGEREF _Toc239766248 \h </w:instrText>
         </w:r>
         <w:r>
           <w:rPr>
@@ -4955,7 +4667,7 @@
           <w14:ligatures w14:val="standardContextual"/>
         </w:rPr>
       </w:pPr>
-      <w:hyperlink w:anchor="_Toc225506287" w:history="1">
+      <w:hyperlink w:anchor="_Toc239766249" w:history="1">
         <w:r>
           <w:rPr>
             <w:rStyle w:val="Hyperlink"/>
@@ -5000,7 +4712,7 @@
             <w:noProof/>
             <w:webHidden/>
           </w:rPr>
-          <w:instrText xml:space="preserve"> PAGEREF _Toc225506287 \h </w:instrText>
+          <w:instrText xml:space="preserve"> PAGEREF _Toc239766249 \h </w:instrText>
         </w:r>
         <w:r>
           <w:rPr>
@@ -5049,7 +4761,7 @@
           <w14:ligatures w14:val="standardContextual"/>
         </w:rPr>
       </w:pPr>
-      <w:hyperlink w:anchor="_Toc225506288" w:history="1">
+      <w:hyperlink w:anchor="_Toc239766250" w:history="1">
         <w:r>
           <w:rPr>
             <w:rStyle w:val="Hyperlink"/>
@@ -5096,7 +4808,7 @@
             <w:noProof/>
             <w:webHidden/>
           </w:rPr>
-          <w:instrText xml:space="preserve"> PAGEREF _Toc225506288 \h </w:instrText>
+          <w:instrText xml:space="preserve"> PAGEREF _Toc239766250 \h </w:instrText>
         </w:r>
         <w:r>
           <w:rPr>
@@ -5145,7 +4857,7 @@
           <w14:ligatures w14:val="standardContextual"/>
         </w:rPr>
       </w:pPr>
-      <w:hyperlink w:anchor="_Toc225506289" w:history="1">
+      <w:hyperlink w:anchor="_Toc239766251" w:history="1">
         <w:r>
           <w:rPr>
             <w:rStyle w:val="Hyperlink"/>
@@ -5192,7 +4904,7 @@
             <w:noProof/>
             <w:webHidden/>
           </w:rPr>
-          <w:instrText xml:space="preserve"> PAGEREF _Toc225506289 \h </w:instrText>
+          <w:instrText xml:space="preserve"> PAGEREF _Toc239766251 \h </w:instrText>
         </w:r>
         <w:r>
           <w:rPr>
@@ -5241,7 +4953,7 @@
           <w14:ligatures w14:val="standardContextual"/>
         </w:rPr>
       </w:pPr>
-      <w:hyperlink w:anchor="_Toc225506290" w:history="1">
+      <w:hyperlink w:anchor="_Toc239766252" w:history="1">
         <w:r>
           <w:rPr>
             <w:rStyle w:val="Hyperlink"/>
@@ -5288,7 +5000,7 @@
             <w:noProof/>
             <w:webHidden/>
           </w:rPr>
-          <w:instrText xml:space="preserve"> PAGEREF _Toc225506290 \h </w:instrText>
+          <w:instrText xml:space="preserve"> PAGEREF _Toc239766252 \h </w:instrText>
         </w:r>
         <w:r>
           <w:rPr>
@@ -5337,7 +5049,7 @@
           <w14:ligatures w14:val="standardContextual"/>
         </w:rPr>
       </w:pPr>
-      <w:hyperlink w:anchor="_Toc225506291" w:history="1">
+      <w:hyperlink w:anchor="_Toc239766253" w:history="1">
         <w:r>
           <w:rPr>
             <w:rStyle w:val="Hyperlink"/>
@@ -5384,7 +5096,7 @@
             <w:noProof/>
             <w:webHidden/>
           </w:rPr>
-          <w:instrText xml:space="preserve"> PAGEREF _Toc225506291 \h </w:instrText>
+          <w:instrText xml:space="preserve"> PAGEREF _Toc239766253 \h </w:instrText>
         </w:r>
         <w:r>
           <w:rPr>
@@ -5433,7 +5145,7 @@
           <w14:ligatures w14:val="standardContextual"/>
         </w:rPr>
       </w:pPr>
-      <w:hyperlink w:anchor="_Toc225506292" w:history="1">
+      <w:hyperlink w:anchor="_Toc239766254" w:history="1">
         <w:r>
           <w:rPr>
             <w:rStyle w:val="Hyperlink"/>
@@ -5480,7 +5192,7 @@
             <w:noProof/>
             <w:webHidden/>
           </w:rPr>
-          <w:instrText xml:space="preserve"> PAGEREF _Toc225506292 \h </w:instrText>
+          <w:instrText xml:space="preserve"> PAGEREF _Toc239766254 \h </w:instrText>
         </w:r>
         <w:r>
           <w:rPr>
@@ -5529,7 +5241,7 @@
           <w14:ligatures w14:val="standardContextual"/>
         </w:rPr>
       </w:pPr>
-      <w:hyperlink w:anchor="_Toc225506293" w:history="1">
+      <w:hyperlink w:anchor="_Toc239766255" w:history="1">
         <w:r>
           <w:rPr>
             <w:rStyle w:val="Hyperlink"/>
@@ -5576,7 +5288,7 @@
             <w:noProof/>
             <w:webHidden/>
           </w:rPr>
-          <w:instrText xml:space="preserve"> PAGEREF _Toc225506293 \h </w:instrText>
+          <w:instrText xml:space="preserve"> PAGEREF _Toc239766255 \h </w:instrText>
         </w:r>
         <w:r>
           <w:rPr>
@@ -5625,7 +5337,7 @@
           <w14:ligatures w14:val="standardContextual"/>
         </w:rPr>
       </w:pPr>
-      <w:hyperlink w:anchor="_Toc225506294" w:history="1">
+      <w:hyperlink w:anchor="_Toc239766256" w:history="1">
         <w:r>
           <w:rPr>
             <w:rStyle w:val="Hyperlink"/>
@@ -5672,7 +5384,7 @@
             <w:noProof/>
             <w:webHidden/>
           </w:rPr>
-          <w:instrText xml:space="preserve"> PAGEREF _Toc225506294 \h </w:instrText>
+          <w:instrText xml:space="preserve"> PAGEREF _Toc239766256 \h </w:instrText>
         </w:r>
         <w:r>
           <w:rPr>
@@ -5719,7 +5431,7 @@
           <w14:ligatures w14:val="standardContextual"/>
         </w:rPr>
       </w:pPr>
-      <w:hyperlink w:anchor="_Toc225506295" w:history="1">
+      <w:hyperlink w:anchor="_Toc239766257" w:history="1">
         <w:r>
           <w:rPr>
             <w:rStyle w:val="Hyperlink"/>
@@ -5764,7 +5476,7 @@
             <w:noProof/>
             <w:webHidden/>
           </w:rPr>
-          <w:instrText xml:space="preserve"> PAGEREF _Toc225506295 \h </w:instrText>
+          <w:instrText xml:space="preserve"> PAGEREF _Toc239766257 \h </w:instrText>
         </w:r>
         <w:r>
           <w:rPr>
@@ -5813,7 +5525,7 @@
           <w14:ligatures w14:val="standardContextual"/>
         </w:rPr>
       </w:pPr>
-      <w:hyperlink w:anchor="_Toc225506296" w:history="1">
+      <w:hyperlink w:anchor="_Toc239766258" w:history="1">
         <w:r>
           <w:rPr>
             <w:rStyle w:val="Hyperlink"/>
@@ -5860,7 +5572,7 @@
             <w:noProof/>
             <w:webHidden/>
           </w:rPr>
-          <w:instrText xml:space="preserve"> PAGEREF _Toc225506296 \h </w:instrText>
+          <w:instrText xml:space="preserve"> PAGEREF _Toc239766258 \h </w:instrText>
         </w:r>
         <w:r>
           <w:rPr>
@@ -5909,7 +5621,7 @@
           <w14:ligatures w14:val="standardContextual"/>
         </w:rPr>
       </w:pPr>
-      <w:hyperlink w:anchor="_Toc225506297" w:history="1">
+      <w:hyperlink w:anchor="_Toc239766259" w:history="1">
         <w:r>
           <w:rPr>
             <w:rStyle w:val="Hyperlink"/>
@@ -5956,7 +5668,7 @@
             <w:noProof/>
             <w:webHidden/>
           </w:rPr>
-          <w:instrText xml:space="preserve"> PAGEREF _Toc225506297 \h </w:instrText>
+          <w:instrText xml:space="preserve"> PAGEREF _Toc239766259 \h </w:instrText>
         </w:r>
         <w:r>
           <w:rPr>
@@ -6005,7 +5717,7 @@
           <w14:ligatures w14:val="standardContextual"/>
         </w:rPr>
       </w:pPr>
-      <w:hyperlink w:anchor="_Toc225506298" w:history="1">
+      <w:hyperlink w:anchor="_Toc239766260" w:history="1">
         <w:r>
           <w:rPr>
             <w:rStyle w:val="Hyperlink"/>
@@ -6052,7 +5764,7 @@
             <w:noProof/>
             <w:webHidden/>
           </w:rPr>
-          <w:instrText xml:space="preserve"> PAGEREF _Toc225506298 \h </w:instrText>
+          <w:instrText xml:space="preserve"> PAGEREF _Toc239766260 \h </w:instrText>
         </w:r>
         <w:r>
           <w:rPr>
@@ -6099,7 +5811,7 @@
           <w14:ligatures w14:val="standardContextual"/>
         </w:rPr>
       </w:pPr>
-      <w:hyperlink w:anchor="_Toc225506299" w:history="1">
+      <w:hyperlink w:anchor="_Toc239766261" w:history="1">
         <w:r>
           <w:rPr>
             <w:rStyle w:val="Hyperlink"/>
@@ -6144,7 +5856,7 @@
             <w:noProof/>
             <w:webHidden/>
           </w:rPr>
-          <w:instrText xml:space="preserve"> PAGEREF _Toc225506299 \h </w:instrText>
+          <w:instrText xml:space="preserve"> PAGEREF _Toc239766261 \h </w:instrText>
         </w:r>
         <w:r>
           <w:rPr>
@@ -6193,7 +5905,7 @@
           <w14:ligatures w14:val="standardContextual"/>
         </w:rPr>
       </w:pPr>
-      <w:hyperlink w:anchor="_Toc225506300" w:history="1">
+      <w:hyperlink w:anchor="_Toc239766262" w:history="1">
         <w:r>
           <w:rPr>
             <w:rStyle w:val="Hyperlink"/>
@@ -6240,7 +5952,7 @@
             <w:noProof/>
             <w:webHidden/>
           </w:rPr>
-          <w:instrText xml:space="preserve"> PAGEREF _Toc225506300 \h </w:instrText>
+          <w:instrText xml:space="preserve"> PAGEREF _Toc239766262 \h </w:instrText>
         </w:r>
         <w:r>
           <w:rPr>
@@ -6289,7 +6001,7 @@
           <w14:ligatures w14:val="standardContextual"/>
         </w:rPr>
       </w:pPr>
-      <w:hyperlink w:anchor="_Toc225506301" w:history="1">
+      <w:hyperlink w:anchor="_Toc239766263" w:history="1">
         <w:r>
           <w:rPr>
             <w:rStyle w:val="Hyperlink"/>
@@ -6336,7 +6048,7 @@
             <w:noProof/>
             <w:webHidden/>
           </w:rPr>
-          <w:instrText xml:space="preserve"> PAGEREF _Toc225506301 \h </w:instrText>
+          <w:instrText xml:space="preserve"> PAGEREF _Toc239766263 \h </w:instrText>
         </w:r>
         <w:r>
           <w:rPr>
@@ -6385,7 +6097,7 @@
           <w14:ligatures w14:val="standardContextual"/>
         </w:rPr>
       </w:pPr>
-      <w:hyperlink w:anchor="_Toc225506302" w:history="1">
+      <w:hyperlink w:anchor="_Toc239766264" w:history="1">
         <w:r>
           <w:rPr>
             <w:rStyle w:val="Hyperlink"/>
@@ -6432,7 +6144,7 @@
             <w:noProof/>
             <w:webHidden/>
           </w:rPr>
-          <w:instrText xml:space="preserve"> PAGEREF _Toc225506302 \h </w:instrText>
+          <w:instrText xml:space="preserve"> PAGEREF _Toc239766264 \h </w:instrText>
         </w:r>
         <w:r>
           <w:rPr>
@@ -6481,7 +6193,7 @@
           <w14:ligatures w14:val="standardContextual"/>
         </w:rPr>
       </w:pPr>
-      <w:hyperlink w:anchor="_Toc225506303" w:history="1">
+      <w:hyperlink w:anchor="_Toc239766265" w:history="1">
         <w:r>
           <w:rPr>
             <w:rStyle w:val="Hyperlink"/>
@@ -6528,7 +6240,7 @@
             <w:noProof/>
             <w:webHidden/>
           </w:rPr>
-          <w:instrText xml:space="preserve"> PAGEREF _Toc225506303 \h </w:instrText>
+          <w:instrText xml:space="preserve"> PAGEREF _Toc239766265 \h </w:instrText>
         </w:r>
         <w:r>
           <w:rPr>
@@ -6577,7 +6289,7 @@
           <w14:ligatures w14:val="standardContextual"/>
         </w:rPr>
       </w:pPr>
-      <w:hyperlink w:anchor="_Toc225506304" w:history="1">
+      <w:hyperlink w:anchor="_Toc239766266" w:history="1">
         <w:r>
           <w:rPr>
             <w:rStyle w:val="Hyperlink"/>
@@ -6624,7 +6336,7 @@
             <w:noProof/>
             <w:webHidden/>
           </w:rPr>
-          <w:instrText xml:space="preserve"> PAGEREF _Toc225506304 \h </w:instrText>
+          <w:instrText xml:space="preserve"> PAGEREF _Toc239766266 \h </w:instrText>
         </w:r>
         <w:r>
           <w:rPr>
@@ -6674,7 +6386,7 @@
           <w14:ligatures w14:val="standardContextual"/>
         </w:rPr>
       </w:pPr>
-      <w:hyperlink w:anchor="_Toc225506305" w:history="1">
+      <w:hyperlink w:anchor="_Toc239766267" w:history="1">
         <w:r>
           <w:rPr>
             <w:rStyle w:val="Hyperlink"/>
@@ -6722,7 +6434,7 @@
             <w:noProof/>
             <w:webHidden/>
           </w:rPr>
-          <w:instrText xml:space="preserve"> PAGEREF _Toc225506305 \h </w:instrText>
+          <w:instrText xml:space="preserve"> PAGEREF _Toc239766267 \h </w:instrText>
         </w:r>
         <w:r>
           <w:rPr>
@@ -6769,7 +6481,7 @@
           <w14:ligatures w14:val="standardContextual"/>
         </w:rPr>
       </w:pPr>
-      <w:hyperlink w:anchor="_Toc225506306" w:history="1">
+      <w:hyperlink w:anchor="_Toc239766268" w:history="1">
         <w:r>
           <w:rPr>
             <w:rStyle w:val="Hyperlink"/>
@@ -6814,7 +6526,7 @@
             <w:noProof/>
             <w:webHidden/>
           </w:rPr>
-          <w:instrText xml:space="preserve"> PAGEREF _Toc225506306 \h </w:instrText>
+          <w:instrText xml:space="preserve"> PAGEREF _Toc239766268 \h </w:instrText>
         </w:r>
         <w:r>
           <w:rPr>
@@ -6861,7 +6573,7 @@
           <w14:ligatures w14:val="standardContextual"/>
         </w:rPr>
       </w:pPr>
-      <w:hyperlink w:anchor="_Toc225506307" w:history="1">
+      <w:hyperlink w:anchor="_Toc239766269" w:history="1">
         <w:r>
           <w:rPr>
             <w:rStyle w:val="Hyperlink"/>
@@ -6906,7 +6618,7 @@
             <w:noProof/>
             <w:webHidden/>
           </w:rPr>
-          <w:instrText xml:space="preserve"> PAGEREF _Toc225506307 \h </w:instrText>
+          <w:instrText xml:space="preserve"> PAGEREF _Toc239766269 \h </w:instrText>
         </w:r>
         <w:r>
           <w:rPr>
@@ -6955,7 +6667,7 @@
           <w14:ligatures w14:val="standardContextual"/>
         </w:rPr>
       </w:pPr>
-      <w:hyperlink w:anchor="_Toc225506308" w:history="1">
+      <w:hyperlink w:anchor="_Toc239766270" w:history="1">
         <w:r>
           <w:rPr>
             <w:rStyle w:val="Hyperlink"/>
@@ -7002,7 +6714,7 @@
             <w:noProof/>
             <w:webHidden/>
           </w:rPr>
-          <w:instrText xml:space="preserve"> PAGEREF _Toc225506308 \h </w:instrText>
+          <w:instrText xml:space="preserve"> PAGEREF _Toc239766270 \h </w:instrText>
         </w:r>
         <w:r>
           <w:rPr>
@@ -7051,7 +6763,7 @@
           <w14:ligatures w14:val="standardContextual"/>
         </w:rPr>
       </w:pPr>
-      <w:hyperlink w:anchor="_Toc225506309" w:history="1">
+      <w:hyperlink w:anchor="_Toc239766271" w:history="1">
         <w:r>
           <w:rPr>
             <w:rStyle w:val="Hyperlink"/>
@@ -7098,7 +6810,7 @@
             <w:noProof/>
             <w:webHidden/>
           </w:rPr>
-          <w:instrText xml:space="preserve"> PAGEREF _Toc225506309 \h </w:instrText>
+          <w:instrText xml:space="preserve"> PAGEREF _Toc239766271 \h </w:instrText>
         </w:r>
         <w:r>
           <w:rPr>
@@ -7147,7 +6859,7 @@
           <w14:ligatures w14:val="standardContextual"/>
         </w:rPr>
       </w:pPr>
-      <w:hyperlink w:anchor="_Toc225506310" w:history="1">
+      <w:hyperlink w:anchor="_Toc239766272" w:history="1">
         <w:r>
           <w:rPr>
             <w:rStyle w:val="Hyperlink"/>
@@ -7194,7 +6906,7 @@
             <w:noProof/>
             <w:webHidden/>
           </w:rPr>
-          <w:instrText xml:space="preserve"> PAGEREF _Toc225506310 \h </w:instrText>
+          <w:instrText xml:space="preserve"> PAGEREF _Toc239766272 \h </w:instrText>
         </w:r>
         <w:r>
           <w:rPr>
@@ -7243,7 +6955,7 @@
           <w14:ligatures w14:val="standardContextual"/>
         </w:rPr>
       </w:pPr>
-      <w:hyperlink w:anchor="_Toc225506311" w:history="1">
+      <w:hyperlink w:anchor="_Toc239766273" w:history="1">
         <w:r>
           <w:rPr>
             <w:rStyle w:val="Hyperlink"/>
@@ -7290,7 +7002,7 @@
             <w:noProof/>
             <w:webHidden/>
           </w:rPr>
-          <w:instrText xml:space="preserve"> PAGEREF _Toc225506311 \h </w:instrText>
+          <w:instrText xml:space="preserve"> PAGEREF _Toc239766273 \h </w:instrText>
         </w:r>
         <w:r>
           <w:rPr>
@@ -7340,7 +7052,7 @@
           <w14:ligatures w14:val="standardContextual"/>
         </w:rPr>
       </w:pPr>
-      <w:hyperlink w:anchor="_Toc225506312" w:history="1">
+      <w:hyperlink w:anchor="_Toc239766274" w:history="1">
         <w:r>
           <w:rPr>
             <w:rStyle w:val="Hyperlink"/>
@@ -7388,7 +7100,7 @@
             <w:noProof/>
             <w:webHidden/>
           </w:rPr>
-          <w:instrText xml:space="preserve"> PAGEREF _Toc225506312 \h </w:instrText>
+          <w:instrText xml:space="preserve"> PAGEREF _Toc239766274 \h </w:instrText>
         </w:r>
         <w:r>
           <w:rPr>
@@ -7437,7 +7149,7 @@
           <w14:ligatures w14:val="standardContextual"/>
         </w:rPr>
       </w:pPr>
-      <w:hyperlink w:anchor="_Toc225506313" w:history="1">
+      <w:hyperlink w:anchor="_Toc239766275" w:history="1">
         <w:r>
           <w:rPr>
             <w:rStyle w:val="Hyperlink"/>
@@ -7484,7 +7196,7 @@
             <w:noProof/>
             <w:webHidden/>
           </w:rPr>
-          <w:instrText xml:space="preserve"> PAGEREF _Toc225506313 \h </w:instrText>
+          <w:instrText xml:space="preserve"> PAGEREF _Toc239766275 \h </w:instrText>
         </w:r>
         <w:r>
           <w:rPr>
@@ -7533,7 +7245,7 @@
           <w14:ligatures w14:val="standardContextual"/>
         </w:rPr>
       </w:pPr>
-      <w:hyperlink w:anchor="_Toc225506314" w:history="1">
+      <w:hyperlink w:anchor="_Toc239766276" w:history="1">
         <w:r>
           <w:rPr>
             <w:rStyle w:val="Hyperlink"/>
@@ -7580,7 +7292,7 @@
             <w:noProof/>
             <w:webHidden/>
           </w:rPr>
-          <w:instrText xml:space="preserve"> PAGEREF _Toc225506314 \h </w:instrText>
+          <w:instrText xml:space="preserve"> PAGEREF _Toc239766276 \h </w:instrText>
         </w:r>
         <w:r>
           <w:rPr>
@@ -7629,7 +7341,7 @@
           <w14:ligatures w14:val="standardContextual"/>
         </w:rPr>
       </w:pPr>
-      <w:hyperlink w:anchor="_Toc225506315" w:history="1">
+      <w:hyperlink w:anchor="_Toc239766277" w:history="1">
         <w:r>
           <w:rPr>
             <w:rStyle w:val="Hyperlink"/>
@@ -7676,7 +7388,7 @@
             <w:noProof/>
             <w:webHidden/>
           </w:rPr>
-          <w:instrText xml:space="preserve"> PAGEREF _Toc225506315 \h </w:instrText>
+          <w:instrText xml:space="preserve"> PAGEREF _Toc239766277 \h </w:instrText>
         </w:r>
         <w:r>
           <w:rPr>
@@ -7725,7 +7437,7 @@
           <w14:ligatures w14:val="standardContextual"/>
         </w:rPr>
       </w:pPr>
-      <w:hyperlink w:anchor="_Toc225506316" w:history="1">
+      <w:hyperlink w:anchor="_Toc239766278" w:history="1">
         <w:r>
           <w:rPr>
             <w:rStyle w:val="Hyperlink"/>
@@ -7772,7 +7484,7 @@
             <w:noProof/>
             <w:webHidden/>
           </w:rPr>
-          <w:instrText xml:space="preserve"> PAGEREF _Toc225506316 \h </w:instrText>
+          <w:instrText xml:space="preserve"> PAGEREF _Toc239766278 \h </w:instrText>
         </w:r>
         <w:r>
           <w:rPr>
@@ -7821,7 +7533,7 @@
           <w14:ligatures w14:val="standardContextual"/>
         </w:rPr>
       </w:pPr>
-      <w:hyperlink w:anchor="_Toc225506317" w:history="1">
+      <w:hyperlink w:anchor="_Toc239766279" w:history="1">
         <w:r>
           <w:rPr>
             <w:rStyle w:val="Hyperlink"/>
@@ -7868,7 +7580,7 @@
             <w:noProof/>
             <w:webHidden/>
           </w:rPr>
-          <w:instrText xml:space="preserve"> PAGEREF _Toc225506317 \h </w:instrText>
+          <w:instrText xml:space="preserve"> PAGEREF _Toc239766279 \h </w:instrText>
         </w:r>
         <w:r>
           <w:rPr>
@@ -7917,7 +7629,7 @@
           <w14:ligatures w14:val="standardContextual"/>
         </w:rPr>
       </w:pPr>
-      <w:hyperlink w:anchor="_Toc225506318" w:history="1">
+      <w:hyperlink w:anchor="_Toc239766280" w:history="1">
         <w:r>
           <w:rPr>
             <w:rStyle w:val="Hyperlink"/>
@@ -7964,7 +7676,7 @@
             <w:noProof/>
             <w:webHidden/>
           </w:rPr>
-          <w:instrText xml:space="preserve"> PAGEREF _Toc225506318 \h </w:instrText>
+          <w:instrText xml:space="preserve"> PAGEREF _Toc239766280 \h </w:instrText>
         </w:r>
         <w:r>
           <w:rPr>
@@ -8014,7 +7726,7 @@
           <w14:ligatures w14:val="standardContextual"/>
         </w:rPr>
       </w:pPr>
-      <w:hyperlink w:anchor="_Toc225506319" w:history="1">
+      <w:hyperlink w:anchor="_Toc239766281" w:history="1">
         <w:r>
           <w:rPr>
             <w:rStyle w:val="Hyperlink"/>
@@ -8062,7 +7774,7 @@
             <w:noProof/>
             <w:webHidden/>
           </w:rPr>
-          <w:instrText xml:space="preserve"> PAGEREF _Toc225506319 \h </w:instrText>
+          <w:instrText xml:space="preserve"> PAGEREF _Toc239766281 \h </w:instrText>
         </w:r>
         <w:r>
           <w:rPr>
@@ -8109,7 +7821,7 @@
           <w14:ligatures w14:val="standardContextual"/>
         </w:rPr>
       </w:pPr>
-      <w:hyperlink w:anchor="_Toc225506320" w:history="1">
+      <w:hyperlink w:anchor="_Toc239766282" w:history="1">
         <w:r>
           <w:rPr>
             <w:rStyle w:val="Hyperlink"/>
@@ -8154,7 +7866,7 @@
             <w:noProof/>
             <w:webHidden/>
           </w:rPr>
-          <w:instrText xml:space="preserve"> PAGEREF _Toc225506320 \h </w:instrText>
+          <w:instrText xml:space="preserve"> PAGEREF _Toc239766282 \h </w:instrText>
         </w:r>
         <w:r>
           <w:rPr>
@@ -8193,7 +7905,7 @@
         <w:lastRenderedPageBreak/>
         <w:fldChar w:fldCharType="end"/>
       </w:r>
-      <w:bookmarkStart w:id="3" w:name="_Toc225506237"/>
+      <w:bookmarkStart w:id="3" w:name="_Toc239766202"/>
       <w:r>
         <w:t>Introduction</w:t>
       </w:r>
@@ -8417,7 +8129,7 @@
       </w:pPr>
       <w:bookmarkStart w:id="9" w:name="_Toc342047012"/>
       <w:bookmarkStart w:id="10" w:name="_Toc391464724"/>
-      <w:bookmarkStart w:id="11" w:name="_Toc225506238"/>
+      <w:bookmarkStart w:id="11" w:name="_Toc239766203"/>
       <w:bookmarkEnd w:id="4"/>
       <w:bookmarkEnd w:id="5"/>
       <w:bookmarkEnd w:id="6"/>
@@ -8434,7 +8146,7 @@
       <w:pPr>
         <w:pStyle w:val="Heading3"/>
       </w:pPr>
-      <w:bookmarkStart w:id="12" w:name="_Toc225506239"/>
+      <w:bookmarkStart w:id="12" w:name="_Toc239766204"/>
       <w:r>
         <w:t>Cohort reproduction – disturbance interactions</w:t>
       </w:r>
@@ -8513,7 +8225,7 @@
         <w:pStyle w:val="Heading3"/>
       </w:pPr>
       <w:bookmarkStart w:id="13" w:name="_Ref421710107"/>
-      <w:bookmarkStart w:id="14" w:name="_Toc225506240"/>
+      <w:bookmarkStart w:id="14" w:name="_Toc239766205"/>
       <w:r>
         <w:t>Cohort reproduction – Initial biomass</w:t>
       </w:r>
@@ -8572,7 +8284,7 @@
           <v:shape id="_x0000_i1025" type="#_x0000_t75" alt="" style="width:308.4pt;height:18pt;mso-width-percent:0;mso-height-percent:0;mso-width-percent:0;mso-height-percent:0" o:ole="">
             <v:imagedata r:id="rId9" o:title=""/>
           </v:shape>
-          <o:OLEObject Type="Embed" ProgID="Equation.3" ShapeID="_x0000_i1025" DrawAspect="Content" ObjectID="_1836118994" r:id="rId10"/>
+          <o:OLEObject Type="Embed" ProgID="Equation.3" ShapeID="_x0000_i1025" DrawAspect="Content" ObjectID="_1850378965" r:id="rId10"/>
         </w:object>
       </w:r>
     </w:p>
@@ -8739,7 +8451,7 @@
       <w:pPr>
         <w:pStyle w:val="Heading3"/>
       </w:pPr>
-      <w:bookmarkStart w:id="15" w:name="_Toc225506241"/>
+      <w:bookmarkStart w:id="15" w:name="_Toc239766206"/>
       <w:r>
         <w:t>Cohort growth and ageing</w:t>
       </w:r>
@@ -8791,15 +8503,7 @@
         <w:t>POT</w:t>
       </w:r>
       <w:r>
-        <w:t xml:space="preserve">) represents the available ‘growing space’, minus space already occupied by other species age </w:t>
-      </w:r>
-      <w:proofErr w:type="gramStart"/>
-      <w:r>
-        <w:t>cohorts</w:t>
-      </w:r>
-      <w:proofErr w:type="gramEnd"/>
-      <w:r>
-        <w:t xml:space="preserve">.  There are two alternative calculations for </w:t>
+        <w:t xml:space="preserve">) represents the available ‘growing space’, minus space already occupied by other species age cohorts.  There are two alternative calculations for </w:t>
       </w:r>
       <w:r>
         <w:rPr>
@@ -9239,7 +8943,7 @@
           <v:shape id="_x0000_i1026" type="#_x0000_t75" alt="" style="width:135pt;height:18.6pt;mso-width-percent:0;mso-height-percent:0;mso-width-percent:0;mso-height-percent:0" o:ole="">
             <v:imagedata r:id="rId11" o:title=""/>
           </v:shape>
-          <o:OLEObject Type="Embed" ProgID="Equation.3" ShapeID="_x0000_i1026" DrawAspect="Content" ObjectID="_1836118995" r:id="rId12"/>
+          <o:OLEObject Type="Embed" ProgID="Equation.3" ShapeID="_x0000_i1026" DrawAspect="Content" ObjectID="_1850378966" r:id="rId12"/>
         </w:object>
       </w:r>
       <w:r>
@@ -9674,7 +9378,7 @@
           <v:shape id="_x0000_i1027" type="#_x0000_t75" alt="" style="width:177pt;height:22.2pt;mso-width-percent:0;mso-height-percent:0;mso-width-percent:0;mso-height-percent:0" o:ole="">
             <v:imagedata r:id="rId13" o:title=""/>
           </v:shape>
-          <o:OLEObject Type="Embed" ProgID="Equation.3" ShapeID="_x0000_i1027" DrawAspect="Content" ObjectID="_1836118996" r:id="rId14"/>
+          <o:OLEObject Type="Embed" ProgID="Equation.3" ShapeID="_x0000_i1027" DrawAspect="Content" ObjectID="_1850378967" r:id="rId14"/>
         </w:object>
       </w:r>
       <w:r>
@@ -9803,7 +9507,7 @@
           <v:shape id="_x0000_i1028" type="#_x0000_t75" alt="" style="width:237pt;height:18.6pt;mso-width-percent:0;mso-height-percent:0;mso-width-percent:0;mso-height-percent:0" o:ole="">
             <v:imagedata r:id="rId15" o:title=""/>
           </v:shape>
-          <o:OLEObject Type="Embed" ProgID="Equation.3" ShapeID="_x0000_i1028" DrawAspect="Content" ObjectID="_1836118997" r:id="rId16"/>
+          <o:OLEObject Type="Embed" ProgID="Equation.3" ShapeID="_x0000_i1028" DrawAspect="Content" ObjectID="_1850378968" r:id="rId16"/>
         </w:object>
       </w:r>
       <w:r>
@@ -10002,7 +9706,7 @@
           <v:shape id="_x0000_i1029" type="#_x0000_t75" alt="" style="width:183pt;height:36.6pt;mso-width-percent:0;mso-height-percent:0;mso-width-percent:0;mso-height-percent:0" o:ole="">
             <v:imagedata r:id="rId17" o:title=""/>
           </v:shape>
-          <o:OLEObject Type="Embed" ProgID="Equation.3" ShapeID="_x0000_i1029" DrawAspect="Content" ObjectID="_1836118998" r:id="rId18"/>
+          <o:OLEObject Type="Embed" ProgID="Equation.3" ShapeID="_x0000_i1029" DrawAspect="Content" ObjectID="_1850378969" r:id="rId18"/>
         </w:object>
       </w:r>
       <w:r>
@@ -10028,7 +9732,7 @@
       <w:pPr>
         <w:pStyle w:val="Heading3"/>
       </w:pPr>
-      <w:bookmarkStart w:id="16" w:name="_Toc225506242"/>
+      <w:bookmarkStart w:id="16" w:name="_Toc239766207"/>
       <w:r>
         <w:t>Cohort senescence and mortality</w:t>
       </w:r>
@@ -10101,7 +9805,7 @@
       <w:pPr>
         <w:pStyle w:val="Heading3"/>
       </w:pPr>
-      <w:bookmarkStart w:id="17" w:name="_Toc225506243"/>
+      <w:bookmarkStart w:id="17" w:name="_Toc239766208"/>
       <w:r>
         <w:t>Dead biomass decay</w:t>
       </w:r>
@@ -10180,7 +9884,7 @@
       <w:pPr>
         <w:pStyle w:val="Heading3"/>
       </w:pPr>
-      <w:bookmarkStart w:id="18" w:name="_Toc225506244"/>
+      <w:bookmarkStart w:id="18" w:name="_Toc239766209"/>
       <w:r>
         <w:lastRenderedPageBreak/>
         <w:t>Initializing biomass</w:t>
@@ -10298,7 +10002,7 @@
       <w:pPr>
         <w:pStyle w:val="Heading3"/>
       </w:pPr>
-      <w:bookmarkStart w:id="19" w:name="_Toc225506245"/>
+      <w:bookmarkStart w:id="19" w:name="_Toc239766210"/>
       <w:r>
         <w:t>Shade calculations</w:t>
       </w:r>
@@ -10531,7 +10235,7 @@
         <w:spacing w:line="276" w:lineRule="auto"/>
         <w:ind w:right="945"/>
       </w:pPr>
-      <w:bookmarkStart w:id="22" w:name="_Toc225506246"/>
+      <w:bookmarkStart w:id="22" w:name="_Toc239766211"/>
       <w:r>
         <w:t xml:space="preserve">Major </w:t>
       </w:r>
@@ -10545,11 +10249,29 @@
         <w:pStyle w:val="Heading3"/>
       </w:pPr>
       <w:bookmarkStart w:id="23" w:name="_Toc391464720"/>
-      <w:bookmarkStart w:id="24" w:name="_Toc225506247"/>
+      <w:bookmarkStart w:id="24" w:name="_Toc239766212"/>
+      <w:r>
+        <w:t>Version 7.3 (September 2026)</w:t>
+      </w:r>
+      <w:bookmarkEnd w:id="24"/>
+    </w:p>
+    <w:p>
+      <w:pPr>
+        <w:pStyle w:val="textbody"/>
+      </w:pPr>
+      <w:r>
+        <w:t>Updated for the revised (v6) Climate Library.</w:t>
+      </w:r>
+    </w:p>
+    <w:p>
+      <w:pPr>
+        <w:pStyle w:val="Heading3"/>
+      </w:pPr>
+      <w:bookmarkStart w:id="25" w:name="_Toc239766213"/>
       <w:r>
         <w:t>Version 7.2 (March 2026)</w:t>
       </w:r>
-      <w:bookmarkEnd w:id="24"/>
+      <w:bookmarkEnd w:id="25"/>
     </w:p>
     <w:p>
       <w:pPr>
@@ -10563,11 +10285,11 @@
       <w:pPr>
         <w:pStyle w:val="Heading3"/>
       </w:pPr>
-      <w:bookmarkStart w:id="25" w:name="_Toc225506248"/>
+      <w:bookmarkStart w:id="26" w:name="_Toc239766214"/>
       <w:r>
         <w:t>Version 7.1 (September 2025)</w:t>
       </w:r>
-      <w:bookmarkEnd w:id="25"/>
+      <w:bookmarkEnd w:id="26"/>
     </w:p>
     <w:p>
       <w:pPr>
@@ -10581,7 +10303,7 @@
       <w:pPr>
         <w:pStyle w:val="Heading3"/>
       </w:pPr>
-      <w:bookmarkStart w:id="26" w:name="_Toc225506249"/>
+      <w:bookmarkStart w:id="27" w:name="_Toc239766215"/>
       <w:r>
         <w:t>Version 7.0 (</w:t>
       </w:r>
@@ -10591,7 +10313,7 @@
       <w:r>
         <w:t xml:space="preserve"> 2024)</w:t>
       </w:r>
-      <w:bookmarkEnd w:id="26"/>
+      <w:bookmarkEnd w:id="27"/>
     </w:p>
     <w:p>
       <w:pPr>
@@ -10645,6 +10367,7 @@
         </w:numPr>
       </w:pPr>
       <w:r>
+        <w:lastRenderedPageBreak/>
         <w:t xml:space="preserve">Initial biomass </w:t>
       </w:r>
       <w:r>
@@ -10667,12 +10390,11 @@
       <w:pPr>
         <w:pStyle w:val="Heading3"/>
       </w:pPr>
-      <w:bookmarkStart w:id="27" w:name="_Toc225506250"/>
-      <w:r>
-        <w:lastRenderedPageBreak/>
+      <w:bookmarkStart w:id="28" w:name="_Toc239766216"/>
+      <w:r>
         <w:t>Version 6.0 (May 2021)</w:t>
       </w:r>
-      <w:bookmarkEnd w:id="27"/>
+      <w:bookmarkEnd w:id="28"/>
     </w:p>
     <w:p>
       <w:pPr>
@@ -10703,139 +10425,30 @@
       <w:pPr>
         <w:pStyle w:val="Heading3"/>
       </w:pPr>
-      <w:bookmarkStart w:id="28" w:name="_Toc225506251"/>
-      <w:r>
-        <w:t>Version 5.3 (March 2021)</w:t>
-      </w:r>
-      <w:bookmarkEnd w:id="28"/>
+      <w:bookmarkStart w:id="29" w:name="_Toc239766217"/>
+      <w:r>
+        <w:t xml:space="preserve">Older </w:t>
+      </w:r>
+      <w:r>
+        <w:t>Version</w:t>
+      </w:r>
+      <w:r>
+        <w:t>s</w:t>
+      </w:r>
+      <w:bookmarkEnd w:id="29"/>
+      <w:r>
+        <w:t xml:space="preserve"> </w:t>
+      </w:r>
     </w:p>
     <w:p>
       <w:pPr>
         <w:pStyle w:val="textbody"/>
       </w:pPr>
       <w:r>
-        <w:t>Updated to Climate Library v4.2.</w:t>
-      </w:r>
-    </w:p>
-    <w:p>
-      <w:pPr>
-        <w:pStyle w:val="Heading3"/>
-      </w:pPr>
-      <w:bookmarkStart w:id="29" w:name="_Toc225506252"/>
-      <w:r>
-        <w:t>Version 5.2 (September 2019)</w:t>
-      </w:r>
-      <w:bookmarkEnd w:id="29"/>
-    </w:p>
-    <w:p>
-      <w:pPr>
-        <w:pStyle w:val="textbody"/>
-      </w:pPr>
-      <w:r>
-        <w:t>Updated to Succession Library v8 and Climate Library v4.</w:t>
-      </w:r>
-    </w:p>
-    <w:p>
-      <w:pPr>
-        <w:pStyle w:val="Heading3"/>
-      </w:pPr>
-      <w:bookmarkStart w:id="30" w:name="_Toc225506253"/>
-      <w:r>
-        <w:t>Version 5.1 (March 2019)</w:t>
-      </w:r>
-      <w:bookmarkEnd w:id="30"/>
-    </w:p>
-    <w:p>
-      <w:pPr>
-        <w:pStyle w:val="textbody"/>
-      </w:pPr>
-      <w:r>
-        <w:t>Updated to Succession Library v7.</w:t>
-      </w:r>
-    </w:p>
-    <w:p>
-      <w:pPr>
-        <w:pStyle w:val="Heading3"/>
-      </w:pPr>
-      <w:bookmarkStart w:id="31" w:name="_Toc225506254"/>
-      <w:r>
-        <w:t>Version 5.0 (August 2018)</w:t>
-      </w:r>
-      <w:bookmarkEnd w:id="31"/>
-    </w:p>
-    <w:p>
-      <w:pPr>
-        <w:pStyle w:val="textbody"/>
-      </w:pPr>
-      <w:r>
-        <w:t xml:space="preserve">Biomass Succession was recompiled for Core v7.0.  In addition, the </w:t>
-      </w:r>
-      <w:r>
-        <w:t xml:space="preserve">separate </w:t>
-      </w:r>
-      <w:r>
-        <w:t xml:space="preserve">age-only-disturbance </w:t>
-      </w:r>
-      <w:r>
-        <w:t xml:space="preserve">input text file </w:t>
-      </w:r>
-      <w:r>
-        <w:t xml:space="preserve">was replaced with </w:t>
-      </w:r>
-      <w:proofErr w:type="spellStart"/>
-      <w:r>
-        <w:t>FireReduction</w:t>
-      </w:r>
-      <w:r>
-        <w:t>Parameters</w:t>
-      </w:r>
-      <w:proofErr w:type="spellEnd"/>
-      <w:r>
-        <w:t xml:space="preserve"> and </w:t>
-      </w:r>
-      <w:proofErr w:type="spellStart"/>
-      <w:r>
-        <w:t>HarvestReductionParameters</w:t>
-      </w:r>
-      <w:proofErr w:type="spellEnd"/>
-      <w:r>
-        <w:t xml:space="preserve"> tables in the primary input file</w:t>
-      </w:r>
-      <w:r>
-        <w:t>.</w:t>
-      </w:r>
-      <w:r>
-        <w:t xml:space="preserve">  Doing so eliminated confusion regarding default behavior and simplified the code.</w:t>
-      </w:r>
-    </w:p>
-    <w:p>
-      <w:pPr>
-        <w:pStyle w:val="Heading3"/>
-      </w:pPr>
-      <w:bookmarkStart w:id="32" w:name="_Toc225506255"/>
-      <w:r>
-        <w:t xml:space="preserve">Older </w:t>
-      </w:r>
-      <w:r>
-        <w:t>Version</w:t>
-      </w:r>
-      <w:r>
-        <w:t>s</w:t>
-      </w:r>
-      <w:bookmarkEnd w:id="32"/>
-      <w:r>
-        <w:t xml:space="preserve"> </w:t>
-      </w:r>
-    </w:p>
-    <w:p>
-      <w:pPr>
-        <w:pStyle w:val="textbody"/>
-      </w:pPr>
-      <w:r>
         <w:t xml:space="preserve">Documentation for versions </w:t>
       </w:r>
       <w:r>
-        <w:t>4</w:t>
+        <w:t>5</w:t>
       </w:r>
       <w:r>
         <w:t>.x and earlier can be found on GitHub:</w:t>
@@ -10865,7 +10478,7 @@
         <w:spacing w:line="276" w:lineRule="auto"/>
         <w:ind w:right="945"/>
       </w:pPr>
-      <w:bookmarkStart w:id="33" w:name="_Toc225506256"/>
+      <w:bookmarkStart w:id="30" w:name="_Toc239766218"/>
       <w:bookmarkEnd w:id="23"/>
       <w:r>
         <w:t xml:space="preserve">Minor </w:t>
@@ -10876,138 +10489,138 @@
       <w:r>
         <w:t xml:space="preserve"> (this major release)</w:t>
       </w:r>
+      <w:bookmarkEnd w:id="30"/>
+    </w:p>
+    <w:p>
+      <w:pPr>
+        <w:pStyle w:val="textbody"/>
+      </w:pPr>
+      <w:r>
+        <w:t>None yet.</w:t>
+      </w:r>
+    </w:p>
+    <w:p>
+      <w:pPr>
+        <w:pStyle w:val="Heading2"/>
+      </w:pPr>
+      <w:bookmarkStart w:id="31" w:name="_Toc239766219"/>
+      <w:r>
+        <w:t>References</w:t>
+      </w:r>
+      <w:bookmarkEnd w:id="31"/>
+    </w:p>
+    <w:p>
+      <w:pPr>
+        <w:pStyle w:val="reference"/>
+        <w:rPr>
+          <w:rFonts w:cs="MS Sans Serif"/>
+        </w:rPr>
+      </w:pPr>
+      <w:r>
+        <w:rPr>
+          <w:rFonts w:cs="MS Sans Serif"/>
+        </w:rPr>
+        <w:t xml:space="preserve">Keeling, H. C. and </w:t>
+      </w:r>
+      <w:r>
+        <w:rPr>
+          <w:rFonts w:cs="MS Sans Serif"/>
+        </w:rPr>
+        <w:t xml:space="preserve">O.L. </w:t>
+      </w:r>
+      <w:r>
+        <w:rPr>
+          <w:rFonts w:cs="MS Sans Serif"/>
+        </w:rPr>
+        <w:t>Phillips. The global relationship between forest productivity and biomass. Global Ecology and Biogeography. 2007; 16:618-631.</w:t>
+      </w:r>
+    </w:p>
+    <w:p>
+      <w:pPr>
+        <w:pStyle w:val="reference"/>
+        <w:rPr>
+          <w:rFonts w:cs="MS Sans Serif"/>
+        </w:rPr>
+      </w:pPr>
+      <w:r>
+        <w:rPr>
+          <w:rFonts w:cs="MS Sans Serif"/>
+        </w:rPr>
+        <w:t xml:space="preserve">Kretchun, A.M., R.M. Scheller, D.J. Shinneman, B. Soderquist, K. Maguire, T.E. Link, E.K. Strand. 2020. Long term persistence of aspen in snowdrift-dependent ecosystems. Forest Ecology and Management 426: </w:t>
+      </w:r>
+      <w:r>
+        <w:rPr>
+          <w:rFonts w:cs="MS Sans Serif"/>
+        </w:rPr>
+        <w:t xml:space="preserve">118005.  </w:t>
+      </w:r>
+      <w:hyperlink r:id="rId20" w:history="1">
+        <w:r>
+          <w:rPr>
+            <w:rFonts w:cs="MS Sans Serif"/>
+          </w:rPr>
+          <w:t>https://doi.org/10.1016/j.foreco.2020.118005</w:t>
+        </w:r>
+      </w:hyperlink>
+    </w:p>
+    <w:p>
+      <w:pPr>
+        <w:pStyle w:val="reference"/>
+      </w:pPr>
+      <w:proofErr w:type="spellStart"/>
+      <w:r>
+        <w:rPr>
+          <w:rFonts w:cs="MS Sans Serif"/>
+        </w:rPr>
+        <w:t>Meentemeyer</w:t>
+      </w:r>
+      <w:proofErr w:type="spellEnd"/>
+      <w:r>
+        <w:rPr>
+          <w:rFonts w:cs="MS Sans Serif"/>
+        </w:rPr>
+        <w:t>, V. Macroclimate and lignin control rates of litter decomposition rates. Ecology. 1978; 59(3):465-472.</w:t>
+      </w:r>
+    </w:p>
+    <w:p>
+      <w:pPr>
+        <w:pStyle w:val="reference"/>
+      </w:pPr>
+      <w:r>
+        <w:t xml:space="preserve">Scheller, R.M. and </w:t>
+      </w:r>
+      <w:r>
+        <w:t xml:space="preserve">D.J. </w:t>
+      </w:r>
+      <w:proofErr w:type="spellStart"/>
+      <w:r>
+        <w:t>Mladenoff</w:t>
+      </w:r>
+      <w:proofErr w:type="spellEnd"/>
+      <w:r>
+        <w:t>. A forest growth and biomass module for a landscape simulation model, LANDIS</w:t>
+      </w:r>
+      <w:proofErr w:type="gramStart"/>
+      <w:r>
+        <w:t>:  Design</w:t>
+      </w:r>
+      <w:proofErr w:type="gramEnd"/>
+      <w:r>
+        <w:t>, validation, and application. Ecological Modelling. 2004; 180(1):211-229.</w:t>
+      </w:r>
+    </w:p>
+    <w:p>
+      <w:pPr>
+        <w:pStyle w:val="Heading2"/>
+      </w:pPr>
+      <w:bookmarkStart w:id="32" w:name="_Toc127846704"/>
+      <w:bookmarkStart w:id="33" w:name="_Toc239766220"/>
+      <w:r>
+        <w:lastRenderedPageBreak/>
+        <w:t>Acknowledgments</w:t>
+      </w:r>
+      <w:bookmarkEnd w:id="32"/>
       <w:bookmarkEnd w:id="33"/>
-    </w:p>
-    <w:p>
-      <w:pPr>
-        <w:pStyle w:val="textbody"/>
-      </w:pPr>
-      <w:r>
-        <w:t>None yet.</w:t>
-      </w:r>
-    </w:p>
-    <w:p>
-      <w:pPr>
-        <w:pStyle w:val="Heading2"/>
-      </w:pPr>
-      <w:bookmarkStart w:id="34" w:name="_Toc225506257"/>
-      <w:r>
-        <w:t>References</w:t>
-      </w:r>
-      <w:bookmarkEnd w:id="34"/>
-    </w:p>
-    <w:p>
-      <w:pPr>
-        <w:pStyle w:val="reference"/>
-        <w:rPr>
-          <w:rFonts w:cs="MS Sans Serif"/>
-        </w:rPr>
-      </w:pPr>
-      <w:r>
-        <w:rPr>
-          <w:rFonts w:cs="MS Sans Serif"/>
-        </w:rPr>
-        <w:t xml:space="preserve">Keeling, H. C. and </w:t>
-      </w:r>
-      <w:r>
-        <w:rPr>
-          <w:rFonts w:cs="MS Sans Serif"/>
-        </w:rPr>
-        <w:t xml:space="preserve">O.L. </w:t>
-      </w:r>
-      <w:r>
-        <w:rPr>
-          <w:rFonts w:cs="MS Sans Serif"/>
-        </w:rPr>
-        <w:t>Phillips. The global relationship between forest productivity and biomass. Global Ecology and Biogeography. 2007; 16:618-631.</w:t>
-      </w:r>
-    </w:p>
-    <w:p>
-      <w:pPr>
-        <w:pStyle w:val="reference"/>
-        <w:rPr>
-          <w:rFonts w:cs="MS Sans Serif"/>
-        </w:rPr>
-      </w:pPr>
-      <w:r>
-        <w:rPr>
-          <w:rFonts w:cs="MS Sans Serif"/>
-        </w:rPr>
-        <w:lastRenderedPageBreak/>
-        <w:t xml:space="preserve">Kretchun, A.M., R.M. Scheller, D.J. Shinneman, B. Soderquist, K. Maguire, T.E. Link, E.K. Strand. 2020. Long term persistence of aspen in snowdrift-dependent ecosystems. Forest Ecology and Management 426: </w:t>
-      </w:r>
-      <w:r>
-        <w:rPr>
-          <w:rFonts w:cs="MS Sans Serif"/>
-        </w:rPr>
-        <w:t xml:space="preserve">118005.  </w:t>
-      </w:r>
-      <w:hyperlink r:id="rId20" w:history="1">
-        <w:r>
-          <w:rPr>
-            <w:rFonts w:cs="MS Sans Serif"/>
-          </w:rPr>
-          <w:t>https://doi.org/10.1016/j.foreco.2020.118005</w:t>
-        </w:r>
-      </w:hyperlink>
-    </w:p>
-    <w:p>
-      <w:pPr>
-        <w:pStyle w:val="reference"/>
-      </w:pPr>
-      <w:proofErr w:type="spellStart"/>
-      <w:r>
-        <w:rPr>
-          <w:rFonts w:cs="MS Sans Serif"/>
-        </w:rPr>
-        <w:t>Meentemeyer</w:t>
-      </w:r>
-      <w:proofErr w:type="spellEnd"/>
-      <w:r>
-        <w:rPr>
-          <w:rFonts w:cs="MS Sans Serif"/>
-        </w:rPr>
-        <w:t>, V. Macroclimate and lignin control rates of litter decomposition rates. Ecology. 1978; 59(3):465-472.</w:t>
-      </w:r>
-    </w:p>
-    <w:p>
-      <w:pPr>
-        <w:pStyle w:val="reference"/>
-      </w:pPr>
-      <w:r>
-        <w:t xml:space="preserve">Scheller, R.M. and </w:t>
-      </w:r>
-      <w:r>
-        <w:t xml:space="preserve">D.J. </w:t>
-      </w:r>
-      <w:proofErr w:type="spellStart"/>
-      <w:r>
-        <w:t>Mladenoff</w:t>
-      </w:r>
-      <w:proofErr w:type="spellEnd"/>
-      <w:r>
-        <w:t>. A forest growth and biomass module for a landscape simulation model, LANDIS</w:t>
-      </w:r>
-      <w:proofErr w:type="gramStart"/>
-      <w:r>
-        <w:t>:  Design</w:t>
-      </w:r>
-      <w:proofErr w:type="gramEnd"/>
-      <w:r>
-        <w:t>, validation, and application. Ecological Modelling. 2004; 180(1):211-229.</w:t>
-      </w:r>
-    </w:p>
-    <w:p>
-      <w:pPr>
-        <w:pStyle w:val="Heading2"/>
-      </w:pPr>
-      <w:bookmarkStart w:id="35" w:name="_Toc127846704"/>
-      <w:bookmarkStart w:id="36" w:name="_Toc225506258"/>
-      <w:r>
-        <w:t>Acknowledgments</w:t>
-      </w:r>
-      <w:bookmarkEnd w:id="35"/>
-      <w:bookmarkEnd w:id="36"/>
     </w:p>
     <w:p>
       <w:pPr>
@@ -11040,7 +10653,7 @@
         </w:tabs>
         <w:ind w:left="1170" w:hanging="1170"/>
       </w:pPr>
-      <w:bookmarkStart w:id="37" w:name="_Toc225506259"/>
+      <w:bookmarkStart w:id="34" w:name="_Toc239766221"/>
       <w:r>
         <w:lastRenderedPageBreak/>
         <w:t xml:space="preserve">Succession </w:t>
@@ -11048,7 +10661,7 @@
       <w:r>
         <w:t>Input File</w:t>
       </w:r>
-      <w:bookmarkEnd w:id="37"/>
+      <w:bookmarkEnd w:id="34"/>
     </w:p>
     <w:p>
       <w:pPr>
@@ -11098,14 +10711,14 @@
       <w:pPr>
         <w:pStyle w:val="Heading2"/>
       </w:pPr>
-      <w:bookmarkStart w:id="38" w:name="_Toc112490865"/>
-      <w:bookmarkStart w:id="39" w:name="_Toc225506260"/>
+      <w:bookmarkStart w:id="35" w:name="_Toc112490865"/>
+      <w:bookmarkStart w:id="36" w:name="_Toc239766222"/>
       <w:proofErr w:type="spellStart"/>
       <w:r>
         <w:t>LandisData</w:t>
       </w:r>
-      <w:bookmarkEnd w:id="38"/>
-      <w:bookmarkEnd w:id="39"/>
+      <w:bookmarkEnd w:id="35"/>
+      <w:bookmarkEnd w:id="36"/>
       <w:proofErr w:type="spellEnd"/>
     </w:p>
     <w:p>
@@ -11131,13 +10744,13 @@
       <w:pPr>
         <w:pStyle w:val="Heading2"/>
       </w:pPr>
-      <w:bookmarkStart w:id="40" w:name="_Toc112490866"/>
-      <w:bookmarkStart w:id="41" w:name="_Toc225506261"/>
+      <w:bookmarkStart w:id="37" w:name="_Toc112490866"/>
+      <w:bookmarkStart w:id="38" w:name="_Toc239766223"/>
       <w:r>
         <w:t>Timestep</w:t>
       </w:r>
-      <w:bookmarkEnd w:id="40"/>
-      <w:bookmarkEnd w:id="41"/>
+      <w:bookmarkEnd w:id="37"/>
+      <w:bookmarkEnd w:id="38"/>
     </w:p>
     <w:p>
       <w:pPr>
@@ -11162,16 +10775,16 @@
         </w:tabs>
         <w:ind w:left="648" w:hanging="648"/>
       </w:pPr>
-      <w:bookmarkStart w:id="42" w:name="_Toc107735767"/>
-      <w:bookmarkStart w:id="43" w:name="_Toc112490867"/>
-      <w:bookmarkStart w:id="44" w:name="_Toc225506262"/>
+      <w:bookmarkStart w:id="39" w:name="_Toc107735767"/>
+      <w:bookmarkStart w:id="40" w:name="_Toc112490867"/>
+      <w:bookmarkStart w:id="41" w:name="_Toc239766224"/>
       <w:proofErr w:type="spellStart"/>
       <w:r>
         <w:t>SeedingAlgorithm</w:t>
       </w:r>
-      <w:bookmarkEnd w:id="42"/>
-      <w:bookmarkEnd w:id="43"/>
-      <w:bookmarkEnd w:id="44"/>
+      <w:bookmarkEnd w:id="39"/>
+      <w:bookmarkEnd w:id="40"/>
+      <w:bookmarkEnd w:id="41"/>
       <w:proofErr w:type="spellEnd"/>
     </w:p>
     <w:p>
@@ -11311,20 +10924,20 @@
           <w:numId w:val="5"/>
         </w:numPr>
       </w:pPr>
-      <w:bookmarkStart w:id="45" w:name="_Toc133339089"/>
-      <w:bookmarkStart w:id="46" w:name="_Toc282434150"/>
-      <w:bookmarkStart w:id="47" w:name="_Toc107735768"/>
-      <w:bookmarkStart w:id="48" w:name="_Toc112490868"/>
-      <w:bookmarkStart w:id="49" w:name="_Ref140207509"/>
-      <w:bookmarkStart w:id="50" w:name="_Toc225506263"/>
+      <w:bookmarkStart w:id="42" w:name="_Toc133339089"/>
+      <w:bookmarkStart w:id="43" w:name="_Toc282434150"/>
+      <w:bookmarkStart w:id="44" w:name="_Toc107735768"/>
+      <w:bookmarkStart w:id="45" w:name="_Toc112490868"/>
+      <w:bookmarkStart w:id="46" w:name="_Ref140207509"/>
+      <w:bookmarkStart w:id="47" w:name="_Toc239766225"/>
       <w:proofErr w:type="spellStart"/>
       <w:proofErr w:type="gramStart"/>
       <w:r>
         <w:t>InitialCommunities</w:t>
       </w:r>
-      <w:bookmarkEnd w:id="45"/>
-      <w:bookmarkEnd w:id="46"/>
-      <w:bookmarkEnd w:id="50"/>
+      <w:bookmarkEnd w:id="42"/>
+      <w:bookmarkEnd w:id="43"/>
+      <w:bookmarkEnd w:id="47"/>
       <w:proofErr w:type="spellEnd"/>
       <w:proofErr w:type="gramEnd"/>
     </w:p>
@@ -11350,18 +10963,18 @@
           <w:numId w:val="5"/>
         </w:numPr>
       </w:pPr>
-      <w:bookmarkStart w:id="51" w:name="_Ref109371856"/>
-      <w:bookmarkStart w:id="52" w:name="_Toc133339090"/>
-      <w:bookmarkStart w:id="53" w:name="_Toc282434151"/>
-      <w:bookmarkStart w:id="54" w:name="_Toc225506264"/>
+      <w:bookmarkStart w:id="48" w:name="_Ref109371856"/>
+      <w:bookmarkStart w:id="49" w:name="_Toc133339090"/>
+      <w:bookmarkStart w:id="50" w:name="_Toc282434151"/>
+      <w:bookmarkStart w:id="51" w:name="_Toc239766226"/>
       <w:proofErr w:type="spellStart"/>
       <w:r>
         <w:t>InitialCommunitiesMap</w:t>
       </w:r>
+      <w:bookmarkEnd w:id="48"/>
+      <w:bookmarkEnd w:id="49"/>
+      <w:bookmarkEnd w:id="50"/>
       <w:bookmarkEnd w:id="51"/>
-      <w:bookmarkEnd w:id="52"/>
-      <w:bookmarkEnd w:id="53"/>
-      <w:bookmarkEnd w:id="54"/>
       <w:proofErr w:type="spellEnd"/>
     </w:p>
     <w:p>
@@ -11386,13 +10999,13 @@
           <w:numId w:val="5"/>
         </w:numPr>
       </w:pPr>
-      <w:bookmarkStart w:id="55" w:name="_Toc463598773"/>
-      <w:bookmarkStart w:id="56" w:name="_Toc225506265"/>
+      <w:bookmarkStart w:id="52" w:name="_Toc463598773"/>
+      <w:bookmarkStart w:id="53" w:name="_Toc239766227"/>
       <w:proofErr w:type="spellStart"/>
       <w:r>
         <w:t>ClimateConfigFile</w:t>
       </w:r>
-      <w:bookmarkEnd w:id="55"/>
+      <w:bookmarkEnd w:id="52"/>
       <w:proofErr w:type="spellEnd"/>
       <w:r>
         <w:t xml:space="preserve"> (</w:t>
@@ -11403,7 +11016,7 @@
       <w:r>
         <w:t>)</w:t>
       </w:r>
-      <w:bookmarkEnd w:id="56"/>
+      <w:bookmarkEnd w:id="53"/>
     </w:p>
     <w:p>
       <w:pPr>
@@ -11464,12 +11077,12 @@
         </w:tabs>
         <w:ind w:left="648" w:hanging="648"/>
       </w:pPr>
-      <w:bookmarkStart w:id="57" w:name="_Toc225506266"/>
+      <w:bookmarkStart w:id="54" w:name="_Toc239766228"/>
       <w:proofErr w:type="spellStart"/>
       <w:r>
         <w:t>CalibrateMode</w:t>
       </w:r>
-      <w:bookmarkEnd w:id="57"/>
+      <w:bookmarkEnd w:id="54"/>
       <w:proofErr w:type="spellEnd"/>
     </w:p>
     <w:p>
@@ -11526,13 +11139,13 @@
         </w:tabs>
         <w:ind w:left="648" w:hanging="648"/>
       </w:pPr>
-      <w:bookmarkStart w:id="58" w:name="_Toc225506267"/>
+      <w:bookmarkStart w:id="55" w:name="_Toc239766229"/>
       <w:proofErr w:type="spellStart"/>
       <w:r>
         <w:lastRenderedPageBreak/>
         <w:t>SpinupCohorts</w:t>
       </w:r>
-      <w:bookmarkEnd w:id="58"/>
+      <w:bookmarkEnd w:id="55"/>
       <w:proofErr w:type="spellEnd"/>
       <w:r>
         <w:t xml:space="preserve"> </w:t>
@@ -11585,12 +11198,12 @@
           <w:tab w:val="num" w:pos="0"/>
         </w:tabs>
       </w:pPr>
-      <w:bookmarkStart w:id="59" w:name="_Toc225506268"/>
+      <w:bookmarkStart w:id="56" w:name="_Toc239766230"/>
       <w:proofErr w:type="spellStart"/>
       <w:r>
         <w:t>SpinupMortalityFraction</w:t>
       </w:r>
-      <w:bookmarkEnd w:id="59"/>
+      <w:bookmarkEnd w:id="56"/>
       <w:proofErr w:type="spellEnd"/>
     </w:p>
     <w:p>
@@ -11613,7 +11226,7 @@
         </w:tabs>
         <w:ind w:left="648" w:hanging="648"/>
       </w:pPr>
-      <w:bookmarkStart w:id="60" w:name="_Toc225506269"/>
+      <w:bookmarkStart w:id="57" w:name="_Toc239766231"/>
       <w:proofErr w:type="spellStart"/>
       <w:r>
         <w:t>MinRelativeBiomass</w:t>
@@ -11622,9 +11235,40 @@
       <w:r>
         <w:t xml:space="preserve"> Table</w:t>
       </w:r>
-      <w:bookmarkEnd w:id="47"/>
-      <w:bookmarkEnd w:id="48"/>
-      <w:bookmarkEnd w:id="49"/>
+      <w:bookmarkEnd w:id="44"/>
+      <w:bookmarkEnd w:id="45"/>
+      <w:bookmarkEnd w:id="46"/>
+      <w:bookmarkEnd w:id="57"/>
+    </w:p>
+    <w:p>
+      <w:pPr>
+        <w:pStyle w:val="textbody"/>
+      </w:pPr>
+      <w:r>
+        <w:t>This table contains the min</w:t>
+      </w:r>
+      <w:r>
+        <w:t>imum relative biomass for shade classes</w:t>
+      </w:r>
+      <w:r>
+        <w:t xml:space="preserve"> 1 - 5</w:t>
+      </w:r>
+      <w:r>
+        <w:t>.</w:t>
+      </w:r>
+    </w:p>
+    <w:p>
+      <w:pPr>
+        <w:pStyle w:val="Heading3"/>
+      </w:pPr>
+      <w:bookmarkStart w:id="58" w:name="_Ref112227719"/>
+      <w:bookmarkStart w:id="59" w:name="_Toc112490869"/>
+      <w:bookmarkStart w:id="60" w:name="_Toc239766232"/>
+      <w:r>
+        <w:t>First Row – Ecoregions</w:t>
+      </w:r>
+      <w:bookmarkEnd w:id="58"/>
+      <w:bookmarkEnd w:id="59"/>
       <w:bookmarkEnd w:id="60"/>
     </w:p>
     <w:p>
@@ -11632,150 +11276,119 @@
         <w:pStyle w:val="textbody"/>
       </w:pPr>
       <w:r>
-        <w:t>This table contains the min</w:t>
-      </w:r>
-      <w:r>
-        <w:t>imum relative biomass for shade classes</w:t>
-      </w:r>
-      <w:r>
-        <w:t xml:space="preserve"> 1 - 5</w:t>
-      </w:r>
-      <w:r>
-        <w:t>.</w:t>
+        <w:t xml:space="preserve">The first row in the table is a list of all the active ecoregions defined in the ecoregions input file (see chapter 6 in the </w:t>
+      </w:r>
+      <w:r>
+        <w:rPr>
+          <w:i/>
+          <w:iCs/>
+        </w:rPr>
+        <w:t>LANDIS</w:t>
+      </w:r>
+      <w:r>
+        <w:rPr>
+          <w:i/>
+          <w:iCs/>
+        </w:rPr>
+        <w:noBreakHyphen/>
+        <w:t>II Model User Guide</w:t>
+      </w:r>
+      <w:r>
+        <w:t>.  The ecoregions can appear in any order; they do not need to appear in the same order as in the ecoregions input file.</w:t>
       </w:r>
     </w:p>
     <w:p>
       <w:pPr>
         <w:pStyle w:val="Heading3"/>
       </w:pPr>
-      <w:bookmarkStart w:id="61" w:name="_Ref112227719"/>
-      <w:bookmarkStart w:id="62" w:name="_Toc112490869"/>
-      <w:bookmarkStart w:id="63" w:name="_Toc225506270"/>
-      <w:r>
-        <w:t>First Row – Ecoregions</w:t>
+      <w:bookmarkStart w:id="61" w:name="_Toc112490870"/>
+      <w:bookmarkStart w:id="62" w:name="_Toc239766233"/>
+      <w:r>
+        <w:t>Other Rows</w:t>
       </w:r>
       <w:bookmarkEnd w:id="61"/>
       <w:bookmarkEnd w:id="62"/>
+    </w:p>
+    <w:p>
+      <w:pPr>
+        <w:pStyle w:val="textbody"/>
+      </w:pPr>
+      <w:r>
+        <w:t>There are 5 other rows in the table, one row for each shade class.</w:t>
+      </w:r>
+    </w:p>
+    <w:p>
+      <w:pPr>
+        <w:pStyle w:val="Heading3"/>
+      </w:pPr>
+      <w:bookmarkStart w:id="63" w:name="_Toc112490871"/>
+      <w:bookmarkStart w:id="64" w:name="_Toc239766234"/>
+      <w:r>
+        <w:t>Shade Class</w:t>
+      </w:r>
       <w:bookmarkEnd w:id="63"/>
+      <w:bookmarkEnd w:id="64"/>
     </w:p>
     <w:p>
       <w:pPr>
         <w:pStyle w:val="textbody"/>
       </w:pPr>
       <w:r>
-        <w:t xml:space="preserve">The first row in the table is a list of all the active ecoregions defined in the ecoregions input file (see chapter 6 in the </w:t>
-      </w:r>
-      <w:r>
-        <w:rPr>
-          <w:i/>
-          <w:iCs/>
-        </w:rPr>
-        <w:t>LANDIS</w:t>
-      </w:r>
-      <w:r>
-        <w:rPr>
-          <w:i/>
-          <w:iCs/>
-        </w:rPr>
-        <w:noBreakHyphen/>
-        <w:t>II Model User Guide</w:t>
-      </w:r>
-      <w:r>
-        <w:t>.  The ecoregions can appear in any order; they do not need to appear in the same order as in the ecoregions input file.</w:t>
+        <w:t xml:space="preserve">This column </w:t>
+      </w:r>
+      <w:r>
+        <w:t>contains</w:t>
+      </w:r>
+      <w:r>
+        <w:t xml:space="preserve"> shade </w:t>
+      </w:r>
+      <w:r>
+        <w:t xml:space="preserve">class </w:t>
+      </w:r>
+      <w:r>
+        <w:t>value</w:t>
+      </w:r>
+      <w:r>
+        <w:t>s</w:t>
+      </w:r>
+      <w:r>
+        <w:t>: 1 ≤ integer ≤ 5.  The shade classes must be in increasing order: class 1 first and ending with class 5.</w:t>
+      </w:r>
+      <w:r>
+        <w:t xml:space="preserve">  Shade class 5 represents the most shade.</w:t>
+      </w:r>
+      <w:r>
+        <w:t xml:space="preserve">  A site will be </w:t>
+      </w:r>
+      <w:proofErr w:type="gramStart"/>
+      <w:r>
+        <w:t>shade</w:t>
+      </w:r>
+      <w:proofErr w:type="gramEnd"/>
+      <w:r>
+        <w:t xml:space="preserve"> class 0 (no shade) until the minimum relative biomass for shade class 1 is reached.</w:t>
       </w:r>
     </w:p>
     <w:p>
       <w:pPr>
         <w:pStyle w:val="Heading3"/>
       </w:pPr>
-      <w:bookmarkStart w:id="64" w:name="_Toc112490870"/>
-      <w:bookmarkStart w:id="65" w:name="_Toc225506271"/>
-      <w:r>
-        <w:t>Other Rows</w:t>
-      </w:r>
-      <w:bookmarkEnd w:id="64"/>
+      <w:bookmarkStart w:id="65" w:name="_Toc112490872"/>
+      <w:bookmarkStart w:id="66" w:name="_Toc239766235"/>
+      <w:r>
+        <w:t xml:space="preserve">Minimum </w:t>
+      </w:r>
+      <w:r>
+        <w:t xml:space="preserve">Biomass </w:t>
+      </w:r>
+      <w:r>
+        <w:t xml:space="preserve">Percentage </w:t>
+      </w:r>
+      <w:r>
+        <w:t>per Ecoregion</w:t>
+      </w:r>
       <w:bookmarkEnd w:id="65"/>
-    </w:p>
-    <w:p>
-      <w:pPr>
-        <w:pStyle w:val="textbody"/>
-      </w:pPr>
-      <w:r>
-        <w:t>There are 5 other rows in the table, one row for each shade class.</w:t>
-      </w:r>
-    </w:p>
-    <w:p>
-      <w:pPr>
-        <w:pStyle w:val="Heading3"/>
-      </w:pPr>
-      <w:bookmarkStart w:id="66" w:name="_Toc112490871"/>
-      <w:bookmarkStart w:id="67" w:name="_Toc225506272"/>
-      <w:r>
-        <w:t>Shade Class</w:t>
-      </w:r>
       <w:bookmarkEnd w:id="66"/>
-      <w:bookmarkEnd w:id="67"/>
-    </w:p>
-    <w:p>
-      <w:pPr>
-        <w:pStyle w:val="textbody"/>
-      </w:pPr>
-      <w:r>
-        <w:t xml:space="preserve">This column </w:t>
-      </w:r>
-      <w:r>
-        <w:t>contains</w:t>
-      </w:r>
-      <w:r>
-        <w:t xml:space="preserve"> shade </w:t>
-      </w:r>
-      <w:r>
-        <w:t xml:space="preserve">class </w:t>
-      </w:r>
-      <w:r>
-        <w:t>value</w:t>
-      </w:r>
-      <w:r>
-        <w:t>s</w:t>
-      </w:r>
-      <w:r>
-        <w:t>: 1 ≤ integer ≤ 5.  The shade classes must be in increasing order: class 1 first and ending with class 5.</w:t>
-      </w:r>
-      <w:r>
-        <w:t xml:space="preserve">  Shade class 5 represents the most shade.</w:t>
-      </w:r>
-      <w:r>
-        <w:t xml:space="preserve">  A site will be </w:t>
-      </w:r>
-      <w:proofErr w:type="gramStart"/>
-      <w:r>
-        <w:t>shade</w:t>
-      </w:r>
-      <w:proofErr w:type="gramEnd"/>
-      <w:r>
-        <w:t xml:space="preserve"> class 0 (no shade) until the minimum relative biomass for shade class 1 is reached.</w:t>
-      </w:r>
-    </w:p>
-    <w:p>
-      <w:pPr>
-        <w:pStyle w:val="Heading3"/>
-      </w:pPr>
-      <w:bookmarkStart w:id="68" w:name="_Toc112490872"/>
-      <w:bookmarkStart w:id="69" w:name="_Toc225506273"/>
-      <w:r>
-        <w:t xml:space="preserve">Minimum </w:t>
-      </w:r>
-      <w:r>
-        <w:t xml:space="preserve">Biomass </w:t>
-      </w:r>
-      <w:r>
-        <w:t xml:space="preserve">Percentage </w:t>
-      </w:r>
-      <w:r>
-        <w:t>per Ecoregion</w:t>
-      </w:r>
-      <w:bookmarkEnd w:id="68"/>
-      <w:bookmarkEnd w:id="69"/>
     </w:p>
     <w:p>
       <w:pPr>
@@ -11871,10 +11484,10 @@
         </w:tabs>
         <w:ind w:left="1170" w:hanging="1170"/>
       </w:pPr>
-      <w:bookmarkStart w:id="70" w:name="_Toc107735769"/>
-      <w:bookmarkStart w:id="71" w:name="_Toc112490873"/>
-      <w:bookmarkStart w:id="72" w:name="_Ref140207562"/>
-      <w:bookmarkStart w:id="73" w:name="_Toc225506274"/>
+      <w:bookmarkStart w:id="67" w:name="_Toc107735769"/>
+      <w:bookmarkStart w:id="68" w:name="_Toc112490873"/>
+      <w:bookmarkStart w:id="69" w:name="_Ref140207562"/>
+      <w:bookmarkStart w:id="70" w:name="_Toc239766236"/>
       <w:proofErr w:type="spellStart"/>
       <w:r>
         <w:t>SufficientLight</w:t>
@@ -11886,7 +11499,7 @@
       <w:r>
         <w:t>Table</w:t>
       </w:r>
-      <w:bookmarkEnd w:id="73"/>
+      <w:bookmarkEnd w:id="70"/>
     </w:p>
     <w:p>
       <w:pPr>
@@ -11897,7 +11510,7 @@
         </w:tabs>
         <w:ind w:left="1170" w:hanging="1170"/>
       </w:pPr>
-      <w:bookmarkStart w:id="74" w:name="_Toc225506275"/>
+      <w:bookmarkStart w:id="71" w:name="_Toc239766237"/>
       <w:r>
         <w:t xml:space="preserve">Species </w:t>
       </w:r>
@@ -11910,7 +11523,7 @@
       <w:r>
         <w:t>Class</w:t>
       </w:r>
-      <w:bookmarkEnd w:id="74"/>
+      <w:bookmarkEnd w:id="71"/>
     </w:p>
     <w:p>
       <w:pPr>
@@ -11935,11 +11548,11 @@
         </w:tabs>
         <w:ind w:left="1170" w:hanging="1170"/>
       </w:pPr>
-      <w:bookmarkStart w:id="75" w:name="_Toc225506276"/>
+      <w:bookmarkStart w:id="72" w:name="_Toc239766238"/>
       <w:r>
         <w:t>Probability of Establishment, given light conditions</w:t>
       </w:r>
-      <w:bookmarkEnd w:id="75"/>
+      <w:bookmarkEnd w:id="72"/>
     </w:p>
     <w:p>
       <w:pPr>
@@ -11986,18 +11599,18 @@
         </w:tabs>
         <w:ind w:left="1170" w:hanging="1170"/>
       </w:pPr>
-      <w:bookmarkStart w:id="76" w:name="_Toc225506277"/>
+      <w:bookmarkStart w:id="73" w:name="_Toc239766239"/>
       <w:proofErr w:type="spellStart"/>
       <w:r>
         <w:t>Species</w:t>
       </w:r>
-      <w:bookmarkEnd w:id="70"/>
-      <w:bookmarkEnd w:id="71"/>
-      <w:bookmarkEnd w:id="72"/>
+      <w:bookmarkEnd w:id="67"/>
+      <w:bookmarkEnd w:id="68"/>
+      <w:bookmarkEnd w:id="69"/>
       <w:r>
         <w:t>DataFile</w:t>
       </w:r>
-      <w:bookmarkEnd w:id="76"/>
+      <w:bookmarkEnd w:id="73"/>
       <w:proofErr w:type="spellEnd"/>
     </w:p>
     <w:p>
@@ -12017,13 +11630,13 @@
         </w:tabs>
         <w:ind w:left="1170" w:hanging="1170"/>
       </w:pPr>
-      <w:bookmarkStart w:id="77" w:name="_Toc112490874"/>
-      <w:bookmarkStart w:id="78" w:name="_Toc225506278"/>
+      <w:bookmarkStart w:id="74" w:name="_Toc112490874"/>
+      <w:bookmarkStart w:id="75" w:name="_Toc239766240"/>
       <w:proofErr w:type="spellStart"/>
       <w:r>
         <w:t>Species</w:t>
       </w:r>
-      <w:bookmarkEnd w:id="77"/>
+      <w:bookmarkEnd w:id="74"/>
       <w:r>
         <w:t>Code</w:t>
       </w:r>
@@ -12031,7 +11644,7 @@
       <w:r>
         <w:t xml:space="preserve"> (string)</w:t>
       </w:r>
-      <w:bookmarkEnd w:id="78"/>
+      <w:bookmarkEnd w:id="75"/>
     </w:p>
     <w:p>
       <w:pPr>
@@ -12068,8 +11681,8 @@
         </w:tabs>
         <w:ind w:left="1170" w:hanging="1170"/>
       </w:pPr>
-      <w:bookmarkStart w:id="79" w:name="_Toc112490875"/>
-      <w:bookmarkStart w:id="80" w:name="_Toc225506279"/>
+      <w:bookmarkStart w:id="76" w:name="_Toc112490875"/>
+      <w:bookmarkStart w:id="77" w:name="_Toc239766241"/>
       <w:proofErr w:type="spellStart"/>
       <w:r>
         <w:t>Leaf</w:t>
@@ -12077,12 +11690,12 @@
       <w:r>
         <w:t>Longevity</w:t>
       </w:r>
-      <w:bookmarkEnd w:id="79"/>
+      <w:bookmarkEnd w:id="76"/>
       <w:proofErr w:type="spellEnd"/>
       <w:r>
         <w:t xml:space="preserve"> (double)</w:t>
       </w:r>
-      <w:bookmarkEnd w:id="80"/>
+      <w:bookmarkEnd w:id="77"/>
     </w:p>
     <w:p>
       <w:pPr>
@@ -12113,8 +11726,8 @@
         </w:tabs>
         <w:ind w:left="1170" w:hanging="1170"/>
       </w:pPr>
-      <w:bookmarkStart w:id="81" w:name="_Toc112490876"/>
-      <w:bookmarkStart w:id="82" w:name="_Toc225506280"/>
+      <w:bookmarkStart w:id="78" w:name="_Toc112490876"/>
+      <w:bookmarkStart w:id="79" w:name="_Toc239766242"/>
       <w:proofErr w:type="spellStart"/>
       <w:r>
         <w:t>Wood</w:t>
@@ -12122,12 +11735,12 @@
       <w:r>
         <w:t>DecayRate</w:t>
       </w:r>
-      <w:bookmarkEnd w:id="81"/>
+      <w:bookmarkEnd w:id="78"/>
       <w:proofErr w:type="spellEnd"/>
       <w:r>
         <w:t xml:space="preserve"> (double)</w:t>
       </w:r>
-      <w:bookmarkEnd w:id="82"/>
+      <w:bookmarkEnd w:id="79"/>
     </w:p>
     <w:p>
       <w:pPr>
@@ -12208,8 +11821,8 @@
         </w:tabs>
         <w:ind w:left="1170" w:hanging="1170"/>
       </w:pPr>
-      <w:bookmarkStart w:id="83" w:name="_Toc112490877"/>
-      <w:bookmarkStart w:id="84" w:name="_Toc225506281"/>
+      <w:bookmarkStart w:id="80" w:name="_Toc112490877"/>
+      <w:bookmarkStart w:id="81" w:name="_Toc239766243"/>
       <w:proofErr w:type="spellStart"/>
       <w:r>
         <w:lastRenderedPageBreak/>
@@ -12218,12 +11831,12 @@
       <w:r>
         <w:t>Curve</w:t>
       </w:r>
-      <w:bookmarkEnd w:id="83"/>
+      <w:bookmarkEnd w:id="80"/>
       <w:proofErr w:type="spellEnd"/>
       <w:r>
         <w:t xml:space="preserve"> (double)</w:t>
       </w:r>
-      <w:bookmarkEnd w:id="84"/>
+      <w:bookmarkEnd w:id="81"/>
     </w:p>
     <w:p>
       <w:pPr>
@@ -12254,9 +11867,9 @@
         </w:tabs>
         <w:ind w:left="1170" w:hanging="1170"/>
       </w:pPr>
-      <w:bookmarkStart w:id="85" w:name="_Toc112490878"/>
-      <w:bookmarkStart w:id="86" w:name="_Toc107735770"/>
-      <w:bookmarkStart w:id="87" w:name="_Toc225506282"/>
+      <w:bookmarkStart w:id="82" w:name="_Toc112490878"/>
+      <w:bookmarkStart w:id="83" w:name="_Toc107735770"/>
+      <w:bookmarkStart w:id="84" w:name="_Toc239766244"/>
       <w:proofErr w:type="spellStart"/>
       <w:r>
         <w:t>GrowthCurve</w:t>
@@ -12265,7 +11878,7 @@
       <w:r>
         <w:t xml:space="preserve"> (double)</w:t>
       </w:r>
-      <w:bookmarkEnd w:id="87"/>
+      <w:bookmarkEnd w:id="84"/>
     </w:p>
     <w:p>
       <w:pPr>
@@ -12321,7 +11934,7 @@
         </w:tabs>
         <w:ind w:left="1170" w:hanging="1170"/>
       </w:pPr>
-      <w:bookmarkStart w:id="88" w:name="_Toc225506283"/>
+      <w:bookmarkStart w:id="85" w:name="_Toc239766245"/>
       <w:proofErr w:type="spellStart"/>
       <w:r>
         <w:t>Leaf</w:t>
@@ -12333,22 +11946,14 @@
       <w:r>
         <w:t xml:space="preserve"> (double)</w:t>
       </w:r>
-      <w:bookmarkEnd w:id="88"/>
+      <w:bookmarkEnd w:id="85"/>
     </w:p>
     <w:p>
       <w:pPr>
         <w:pStyle w:val="textbody"/>
       </w:pPr>
       <w:r>
-        <w:t xml:space="preserve">The </w:t>
-      </w:r>
-      <w:proofErr w:type="gramStart"/>
-      <w:r>
-        <w:t>percent</w:t>
-      </w:r>
-      <w:proofErr w:type="gramEnd"/>
-      <w:r>
-        <w:t xml:space="preserve"> leaf lignin per species.  Value:  </w:t>
+        <w:t xml:space="preserve">The percent leaf lignin per species.  Value:  </w:t>
       </w:r>
       <w:proofErr w:type="gramStart"/>
       <w:r>
@@ -12380,7 +11985,7 @@
         </w:tabs>
         <w:ind w:left="1170" w:hanging="1170"/>
       </w:pPr>
-      <w:bookmarkStart w:id="89" w:name="_Toc225506284"/>
+      <w:bookmarkStart w:id="86" w:name="_Toc239766246"/>
       <w:proofErr w:type="spellStart"/>
       <w:r>
         <w:t>EcoregionParameters</w:t>
@@ -12389,7 +11994,7 @@
       <w:r>
         <w:t xml:space="preserve"> Table</w:t>
       </w:r>
-      <w:bookmarkEnd w:id="89"/>
+      <w:bookmarkEnd w:id="86"/>
     </w:p>
     <w:p>
       <w:pPr>
@@ -12400,11 +12005,11 @@
         </w:tabs>
         <w:ind w:left="1170" w:hanging="1170"/>
       </w:pPr>
-      <w:bookmarkStart w:id="90" w:name="_Toc225506285"/>
+      <w:bookmarkStart w:id="87" w:name="_Toc239766247"/>
       <w:r>
         <w:t>First Column – Ecoregions</w:t>
       </w:r>
-      <w:bookmarkEnd w:id="90"/>
+      <w:bookmarkEnd w:id="87"/>
     </w:p>
     <w:p>
       <w:pPr>
@@ -12441,11 +12046,11 @@
         </w:tabs>
         <w:ind w:left="1170" w:hanging="1170"/>
       </w:pPr>
-      <w:bookmarkStart w:id="91" w:name="_Toc225506286"/>
+      <w:bookmarkStart w:id="88" w:name="_Toc239766248"/>
       <w:r>
         <w:t>Actual Evapotranspiration (AET)</w:t>
       </w:r>
-      <w:bookmarkEnd w:id="91"/>
+      <w:bookmarkEnd w:id="88"/>
     </w:p>
     <w:p>
       <w:pPr>
@@ -12499,15 +12104,15 @@
           <w:tab w:val="num" w:pos="1170"/>
         </w:tabs>
       </w:pPr>
-      <w:bookmarkStart w:id="92" w:name="_Ref140060996"/>
-      <w:bookmarkStart w:id="93" w:name="_Toc225506287"/>
-      <w:bookmarkEnd w:id="85"/>
-      <w:bookmarkEnd w:id="86"/>
+      <w:bookmarkStart w:id="89" w:name="_Ref140060996"/>
+      <w:bookmarkStart w:id="90" w:name="_Toc239766249"/>
+      <w:bookmarkEnd w:id="82"/>
+      <w:bookmarkEnd w:id="83"/>
       <w:proofErr w:type="spellStart"/>
       <w:r>
         <w:t>SpeciesEcoregionDataFile</w:t>
       </w:r>
-      <w:bookmarkEnd w:id="93"/>
+      <w:bookmarkEnd w:id="90"/>
       <w:proofErr w:type="spellEnd"/>
     </w:p>
     <w:p>
@@ -12527,11 +12132,11 @@
         </w:tabs>
         <w:ind w:left="1170" w:hanging="1170"/>
       </w:pPr>
-      <w:bookmarkStart w:id="94" w:name="_Toc225506288"/>
+      <w:bookmarkStart w:id="91" w:name="_Toc239766250"/>
       <w:r>
         <w:t>Year (integer)</w:t>
       </w:r>
-      <w:bookmarkEnd w:id="94"/>
+      <w:bookmarkEnd w:id="91"/>
     </w:p>
     <w:p>
       <w:pPr>
@@ -12567,8 +12172,8 @@
         </w:tabs>
         <w:ind w:left="1170" w:hanging="1170"/>
       </w:pPr>
-      <w:bookmarkStart w:id="95" w:name="_Toc112490879"/>
-      <w:bookmarkStart w:id="96" w:name="_Toc225506289"/>
+      <w:bookmarkStart w:id="92" w:name="_Toc112490879"/>
+      <w:bookmarkStart w:id="93" w:name="_Toc239766251"/>
       <w:proofErr w:type="spellStart"/>
       <w:r>
         <w:lastRenderedPageBreak/>
@@ -12577,12 +12182,12 @@
       <w:r>
         <w:t>Name</w:t>
       </w:r>
-      <w:bookmarkEnd w:id="95"/>
+      <w:bookmarkEnd w:id="92"/>
       <w:proofErr w:type="spellEnd"/>
       <w:r>
         <w:t xml:space="preserve"> (string)</w:t>
       </w:r>
-      <w:bookmarkEnd w:id="96"/>
+      <w:bookmarkEnd w:id="93"/>
     </w:p>
     <w:p>
       <w:pPr>
@@ -12636,8 +12241,8 @@
         </w:tabs>
         <w:ind w:left="1170" w:hanging="1170"/>
       </w:pPr>
-      <w:bookmarkStart w:id="97" w:name="_Toc112490880"/>
-      <w:bookmarkStart w:id="98" w:name="_Toc225506290"/>
+      <w:bookmarkStart w:id="94" w:name="_Toc112490880"/>
+      <w:bookmarkStart w:id="95" w:name="_Toc239766252"/>
       <w:proofErr w:type="spellStart"/>
       <w:r>
         <w:t>Species</w:t>
@@ -12649,11 +12254,11 @@
       <w:r>
         <w:t xml:space="preserve"> </w:t>
       </w:r>
-      <w:bookmarkEnd w:id="97"/>
+      <w:bookmarkEnd w:id="94"/>
       <w:r>
         <w:t>(string)</w:t>
       </w:r>
-      <w:bookmarkEnd w:id="98"/>
+      <w:bookmarkEnd w:id="95"/>
     </w:p>
     <w:p>
       <w:pPr>
@@ -12672,9 +12277,9 @@
         </w:tabs>
         <w:ind w:left="1170" w:hanging="1170"/>
       </w:pPr>
-      <w:bookmarkStart w:id="99" w:name="_Toc112490881"/>
-      <w:bookmarkStart w:id="100" w:name="_Ref140207863"/>
-      <w:bookmarkStart w:id="101" w:name="_Toc225506291"/>
+      <w:bookmarkStart w:id="96" w:name="_Toc112490881"/>
+      <w:bookmarkStart w:id="97" w:name="_Ref140207863"/>
+      <w:bookmarkStart w:id="98" w:name="_Toc239766253"/>
       <w:proofErr w:type="spellStart"/>
       <w:r>
         <w:t>Prob</w:t>
@@ -12686,9 +12291,9 @@
       <w:r>
         <w:t xml:space="preserve"> (double)</w:t>
       </w:r>
-      <w:bookmarkEnd w:id="99"/>
-      <w:bookmarkEnd w:id="100"/>
-      <w:bookmarkEnd w:id="101"/>
+      <w:bookmarkEnd w:id="96"/>
+      <w:bookmarkEnd w:id="97"/>
+      <w:bookmarkEnd w:id="98"/>
     </w:p>
     <w:p>
       <w:pPr>
@@ -12735,10 +12340,10 @@
         </w:tabs>
         <w:ind w:left="1170" w:hanging="1170"/>
       </w:pPr>
-      <w:bookmarkStart w:id="102" w:name="_Toc107735771"/>
-      <w:bookmarkStart w:id="103" w:name="_Toc112490882"/>
-      <w:bookmarkStart w:id="104" w:name="_Ref140207866"/>
-      <w:bookmarkStart w:id="105" w:name="_Toc225506292"/>
+      <w:bookmarkStart w:id="99" w:name="_Toc107735771"/>
+      <w:bookmarkStart w:id="100" w:name="_Toc112490882"/>
+      <w:bookmarkStart w:id="101" w:name="_Ref140207866"/>
+      <w:bookmarkStart w:id="102" w:name="_Toc239766254"/>
       <w:proofErr w:type="spellStart"/>
       <w:r>
         <w:t>ProbMortality</w:t>
@@ -12747,7 +12352,7 @@
       <w:r>
         <w:t xml:space="preserve"> (double)</w:t>
       </w:r>
-      <w:bookmarkEnd w:id="105"/>
+      <w:bookmarkEnd w:id="102"/>
     </w:p>
     <w:p>
       <w:pPr>
@@ -12780,22 +12385,22 @@
         </w:tabs>
         <w:ind w:left="1170" w:hanging="1170"/>
       </w:pPr>
-      <w:bookmarkStart w:id="106" w:name="_Toc225506293"/>
-      <w:bookmarkEnd w:id="102"/>
+      <w:bookmarkStart w:id="103" w:name="_Toc239766255"/>
+      <w:bookmarkEnd w:id="99"/>
       <w:proofErr w:type="spellStart"/>
       <w:r>
         <w:t>ANPP</w:t>
       </w:r>
+      <w:bookmarkEnd w:id="100"/>
+      <w:bookmarkEnd w:id="101"/>
+      <w:r>
+        <w:t>max</w:t>
+      </w:r>
+      <w:proofErr w:type="spellEnd"/>
+      <w:r>
+        <w:t xml:space="preserve"> (integer)</w:t>
+      </w:r>
       <w:bookmarkEnd w:id="103"/>
-      <w:bookmarkEnd w:id="104"/>
-      <w:r>
-        <w:t>max</w:t>
-      </w:r>
-      <w:proofErr w:type="spellEnd"/>
-      <w:r>
-        <w:t xml:space="preserve"> (integer)</w:t>
-      </w:r>
-      <w:bookmarkEnd w:id="106"/>
     </w:p>
     <w:p>
       <w:pPr>
@@ -12876,9 +12481,9 @@
         </w:tabs>
         <w:ind w:left="1170" w:hanging="1170"/>
       </w:pPr>
-      <w:bookmarkStart w:id="107" w:name="_Toc112490883"/>
-      <w:bookmarkStart w:id="108" w:name="_Ref140207868"/>
-      <w:bookmarkStart w:id="109" w:name="_Toc225506294"/>
+      <w:bookmarkStart w:id="104" w:name="_Toc112490883"/>
+      <w:bookmarkStart w:id="105" w:name="_Ref140207868"/>
+      <w:bookmarkStart w:id="106" w:name="_Toc239766256"/>
       <w:proofErr w:type="spellStart"/>
       <w:r>
         <w:t>Biomass</w:t>
@@ -12890,12 +12495,12 @@
       <w:r>
         <w:t xml:space="preserve"> (integer)</w:t>
       </w:r>
-      <w:bookmarkEnd w:id="109"/>
+      <w:bookmarkEnd w:id="106"/>
       <w:r>
         <w:t xml:space="preserve"> </w:t>
       </w:r>
-      <w:bookmarkEnd w:id="107"/>
-      <w:bookmarkEnd w:id="108"/>
+      <w:bookmarkEnd w:id="104"/>
+      <w:bookmarkEnd w:id="105"/>
     </w:p>
     <w:p>
       <w:pPr>
@@ -12958,15 +12563,15 @@
         <w:pStyle w:val="Heading2"/>
         <w:ind w:left="1170" w:hanging="1170"/>
       </w:pPr>
-      <w:bookmarkStart w:id="110" w:name="_Toc510171792"/>
-      <w:bookmarkStart w:id="111" w:name="_Ref140059391"/>
-      <w:bookmarkStart w:id="112" w:name="_Toc225506295"/>
-      <w:bookmarkEnd w:id="92"/>
+      <w:bookmarkStart w:id="107" w:name="_Toc510171792"/>
+      <w:bookmarkStart w:id="108" w:name="_Ref140059391"/>
+      <w:bookmarkStart w:id="109" w:name="_Toc239766257"/>
+      <w:bookmarkEnd w:id="89"/>
       <w:r>
         <w:t>Fire Reduction Parameters</w:t>
       </w:r>
-      <w:bookmarkEnd w:id="110"/>
-      <w:bookmarkEnd w:id="112"/>
+      <w:bookmarkEnd w:id="107"/>
+      <w:bookmarkEnd w:id="109"/>
     </w:p>
     <w:p>
       <w:pPr>
@@ -13027,14 +12632,14 @@
         </w:tabs>
         <w:ind w:left="1170" w:hanging="1170"/>
       </w:pPr>
-      <w:bookmarkStart w:id="113" w:name="_Toc510171793"/>
-      <w:bookmarkStart w:id="114" w:name="_Toc225506296"/>
+      <w:bookmarkStart w:id="110" w:name="_Toc510171793"/>
+      <w:bookmarkStart w:id="111" w:name="_Toc239766258"/>
       <w:r>
         <w:lastRenderedPageBreak/>
         <w:t>Fire Severity</w:t>
       </w:r>
-      <w:bookmarkEnd w:id="113"/>
-      <w:bookmarkEnd w:id="114"/>
+      <w:bookmarkEnd w:id="110"/>
+      <w:bookmarkEnd w:id="111"/>
     </w:p>
     <w:p>
       <w:pPr>
@@ -13053,13 +12658,13 @@
         </w:tabs>
         <w:ind w:left="1170" w:hanging="1170"/>
       </w:pPr>
-      <w:bookmarkStart w:id="115" w:name="_Toc510171794"/>
-      <w:bookmarkStart w:id="116" w:name="_Toc225506297"/>
+      <w:bookmarkStart w:id="112" w:name="_Toc510171794"/>
+      <w:bookmarkStart w:id="113" w:name="_Toc239766259"/>
       <w:r>
         <w:t>Wood Reduction</w:t>
       </w:r>
-      <w:bookmarkEnd w:id="115"/>
-      <w:bookmarkEnd w:id="116"/>
+      <w:bookmarkEnd w:id="112"/>
+      <w:bookmarkEnd w:id="113"/>
     </w:p>
     <w:p>
       <w:pPr>
@@ -13078,13 +12683,13 @@
         </w:tabs>
         <w:ind w:left="1170" w:hanging="1170"/>
       </w:pPr>
-      <w:bookmarkStart w:id="117" w:name="_Toc510171795"/>
-      <w:bookmarkStart w:id="118" w:name="_Toc225506298"/>
+      <w:bookmarkStart w:id="114" w:name="_Toc510171795"/>
+      <w:bookmarkStart w:id="115" w:name="_Toc239766260"/>
       <w:r>
         <w:t>Litter Reduction</w:t>
       </w:r>
-      <w:bookmarkEnd w:id="117"/>
-      <w:bookmarkEnd w:id="118"/>
+      <w:bookmarkEnd w:id="114"/>
+      <w:bookmarkEnd w:id="115"/>
     </w:p>
     <w:p>
       <w:pPr>
@@ -13099,13 +12704,13 @@
         <w:pStyle w:val="Heading2"/>
         <w:ind w:left="1170" w:hanging="1170"/>
       </w:pPr>
-      <w:bookmarkStart w:id="119" w:name="_Toc510171796"/>
-      <w:bookmarkStart w:id="120" w:name="_Toc225506299"/>
+      <w:bookmarkStart w:id="116" w:name="_Toc510171796"/>
+      <w:bookmarkStart w:id="117" w:name="_Toc239766261"/>
       <w:r>
         <w:t>Harvest Reduction Parameters</w:t>
       </w:r>
-      <w:bookmarkEnd w:id="119"/>
-      <w:bookmarkEnd w:id="120"/>
+      <w:bookmarkEnd w:id="116"/>
+      <w:bookmarkEnd w:id="117"/>
     </w:p>
     <w:p>
       <w:pPr>
@@ -13160,13 +12765,13 @@
         </w:tabs>
         <w:ind w:left="1170" w:hanging="1170"/>
       </w:pPr>
-      <w:bookmarkStart w:id="121" w:name="_Toc510171797"/>
-      <w:bookmarkStart w:id="122" w:name="_Toc225506300"/>
+      <w:bookmarkStart w:id="118" w:name="_Toc510171797"/>
+      <w:bookmarkStart w:id="119" w:name="_Toc239766262"/>
       <w:r>
         <w:t>Prescription Name</w:t>
       </w:r>
-      <w:bookmarkEnd w:id="121"/>
-      <w:bookmarkEnd w:id="122"/>
+      <w:bookmarkEnd w:id="118"/>
+      <w:bookmarkEnd w:id="119"/>
     </w:p>
     <w:p>
       <w:pPr>
@@ -13238,13 +12843,13 @@
         </w:tabs>
         <w:ind w:left="1170" w:hanging="1170"/>
       </w:pPr>
-      <w:bookmarkStart w:id="123" w:name="_Toc510171798"/>
-      <w:bookmarkStart w:id="124" w:name="_Toc225506301"/>
+      <w:bookmarkStart w:id="120" w:name="_Toc510171798"/>
+      <w:bookmarkStart w:id="121" w:name="_Toc239766263"/>
       <w:r>
         <w:t>Dead Wood Reduction</w:t>
       </w:r>
-      <w:bookmarkEnd w:id="123"/>
-      <w:bookmarkEnd w:id="124"/>
+      <w:bookmarkEnd w:id="120"/>
+      <w:bookmarkEnd w:id="121"/>
     </w:p>
     <w:p>
       <w:pPr>
@@ -13266,14 +12871,14 @@
         </w:tabs>
         <w:ind w:left="1170" w:hanging="1170"/>
       </w:pPr>
-      <w:bookmarkStart w:id="125" w:name="_Toc510171799"/>
-      <w:bookmarkStart w:id="126" w:name="_Toc225506302"/>
+      <w:bookmarkStart w:id="122" w:name="_Toc510171799"/>
+      <w:bookmarkStart w:id="123" w:name="_Toc239766264"/>
       <w:r>
         <w:lastRenderedPageBreak/>
         <w:t>Dead Litter Reduction</w:t>
       </w:r>
-      <w:bookmarkEnd w:id="125"/>
-      <w:bookmarkEnd w:id="126"/>
+      <w:bookmarkEnd w:id="122"/>
+      <w:bookmarkEnd w:id="123"/>
     </w:p>
     <w:p>
       <w:pPr>
@@ -13295,12 +12900,12 @@
         </w:tabs>
         <w:ind w:left="1170" w:hanging="1170"/>
       </w:pPr>
-      <w:bookmarkStart w:id="127" w:name="_Toc510171800"/>
-      <w:bookmarkStart w:id="128" w:name="_Toc225506303"/>
+      <w:bookmarkStart w:id="124" w:name="_Toc510171800"/>
+      <w:bookmarkStart w:id="125" w:name="_Toc239766265"/>
       <w:r>
         <w:t>Cohort Wood Removal</w:t>
       </w:r>
-      <w:bookmarkEnd w:id="128"/>
+      <w:bookmarkEnd w:id="125"/>
     </w:p>
     <w:p>
       <w:pPr>
@@ -13349,7 +12954,7 @@
         </w:tabs>
         <w:ind w:left="1170" w:hanging="1170"/>
       </w:pPr>
-      <w:bookmarkStart w:id="129" w:name="_Toc225506304"/>
+      <w:bookmarkStart w:id="126" w:name="_Toc239766266"/>
       <w:r>
         <w:t xml:space="preserve">Cohort </w:t>
       </w:r>
@@ -13359,8 +12964,8 @@
       <w:r>
         <w:t>Removal</w:t>
       </w:r>
-      <w:bookmarkEnd w:id="127"/>
-      <w:bookmarkEnd w:id="129"/>
+      <w:bookmarkEnd w:id="124"/>
+      <w:bookmarkEnd w:id="126"/>
     </w:p>
     <w:p>
       <w:pPr>
@@ -13420,11 +13025,11 @@
           <w:numId w:val="5"/>
         </w:numPr>
       </w:pPr>
-      <w:bookmarkStart w:id="130" w:name="_Ref109371329"/>
-      <w:bookmarkStart w:id="131" w:name="_Toc133339122"/>
-      <w:bookmarkStart w:id="132" w:name="_Toc282434158"/>
-      <w:bookmarkStart w:id="133" w:name="_Toc225506305"/>
-      <w:bookmarkEnd w:id="111"/>
+      <w:bookmarkStart w:id="127" w:name="_Ref109371329"/>
+      <w:bookmarkStart w:id="128" w:name="_Toc133339122"/>
+      <w:bookmarkStart w:id="129" w:name="_Toc282434158"/>
+      <w:bookmarkStart w:id="130" w:name="_Toc239766267"/>
+      <w:bookmarkEnd w:id="108"/>
       <w:r>
         <w:lastRenderedPageBreak/>
         <w:t>In</w:t>
@@ -13432,46 +13037,46 @@
       <w:r>
         <w:t>itial Communities</w:t>
       </w:r>
+      <w:bookmarkEnd w:id="127"/>
+      <w:bookmarkEnd w:id="128"/>
+      <w:bookmarkEnd w:id="129"/>
       <w:bookmarkEnd w:id="130"/>
+    </w:p>
+    <w:p>
+      <w:pPr>
+        <w:pStyle w:val="textbody"/>
+      </w:pPr>
+      <w:r>
+        <w:t xml:space="preserve">This file contains the definitions of the initial community classes.  Each active site on the landscape is assigned to an initial community class.  The class specifies the </w:t>
+      </w:r>
+      <w:proofErr w:type="gramStart"/>
+      <w:r>
+        <w:t>tree</w:t>
+      </w:r>
+      <w:proofErr w:type="gramEnd"/>
+      <w:r>
+        <w:t xml:space="preserve"> species that are present along with the </w:t>
+      </w:r>
+      <w:proofErr w:type="gramStart"/>
+      <w:r>
+        <w:t>particular age</w:t>
+      </w:r>
+      <w:proofErr w:type="gramEnd"/>
+      <w:r>
+        <w:t xml:space="preserve"> classes that are present for each of those species.</w:t>
+      </w:r>
+    </w:p>
+    <w:p>
+      <w:pPr>
+        <w:pStyle w:val="Heading2"/>
+      </w:pPr>
+      <w:bookmarkStart w:id="131" w:name="_Toc165539610"/>
+      <w:bookmarkStart w:id="132" w:name="_Toc239766268"/>
+      <w:r>
+        <w:t>Initial Communities Map</w:t>
+      </w:r>
       <w:bookmarkEnd w:id="131"/>
       <w:bookmarkEnd w:id="132"/>
-      <w:bookmarkEnd w:id="133"/>
-    </w:p>
-    <w:p>
-      <w:pPr>
-        <w:pStyle w:val="textbody"/>
-      </w:pPr>
-      <w:r>
-        <w:t xml:space="preserve">This file contains the definitions of the initial community classes.  Each active site on the landscape is assigned to an initial community class.  The class specifies the </w:t>
-      </w:r>
-      <w:proofErr w:type="gramStart"/>
-      <w:r>
-        <w:t>tree</w:t>
-      </w:r>
-      <w:proofErr w:type="gramEnd"/>
-      <w:r>
-        <w:t xml:space="preserve"> species that are present along with the </w:t>
-      </w:r>
-      <w:proofErr w:type="gramStart"/>
-      <w:r>
-        <w:t>particular age</w:t>
-      </w:r>
-      <w:proofErr w:type="gramEnd"/>
-      <w:r>
-        <w:t xml:space="preserve"> classes that are present for each of those species.</w:t>
-      </w:r>
-    </w:p>
-    <w:p>
-      <w:pPr>
-        <w:pStyle w:val="Heading2"/>
-      </w:pPr>
-      <w:bookmarkStart w:id="134" w:name="_Toc165539610"/>
-      <w:bookmarkStart w:id="135" w:name="_Toc225506306"/>
-      <w:r>
-        <w:t>Initial Communities Map</w:t>
-      </w:r>
-      <w:bookmarkEnd w:id="134"/>
-      <w:bookmarkEnd w:id="135"/>
     </w:p>
     <w:p>
       <w:pPr>
@@ -13511,358 +13116,358 @@
       <w:pPr>
         <w:pStyle w:val="Heading2"/>
       </w:pPr>
-      <w:bookmarkStart w:id="136" w:name="_Toc165539611"/>
-      <w:bookmarkStart w:id="137" w:name="_Toc225506307"/>
+      <w:bookmarkStart w:id="133" w:name="_Toc165539611"/>
+      <w:bookmarkStart w:id="134" w:name="_Toc239766269"/>
       <w:r>
         <w:t>Initial Communities Input CSV File</w:t>
       </w:r>
+      <w:bookmarkEnd w:id="133"/>
+      <w:bookmarkEnd w:id="134"/>
+    </w:p>
+    <w:p>
+      <w:pPr>
+        <w:pStyle w:val="textbody"/>
+      </w:pPr>
+      <w:r>
+        <w:t>This file contains the definitions for each initial community.  Each active site on the landscape is assigned an initial community.  The initial community specifies the cohorts that are present including species, age, and biomass (g m</w:t>
+      </w:r>
+      <w:r>
+        <w:rPr>
+          <w:vertAlign w:val="superscript"/>
+        </w:rPr>
+        <w:t>-2</w:t>
+      </w:r>
+      <w:r>
+        <w:t>).  Each initial community has an associated map code that corresponds to the accompanying map.  Note</w:t>
+      </w:r>
+      <w:proofErr w:type="gramStart"/>
+      <w:r>
+        <w:t>:  ANPP</w:t>
+      </w:r>
+      <w:proofErr w:type="gramEnd"/>
+      <w:r>
+        <w:t xml:space="preserve"> (g m</w:t>
+      </w:r>
+      <w:r>
+        <w:rPr>
+          <w:vertAlign w:val="superscript"/>
+        </w:rPr>
+        <w:t>-2</w:t>
+      </w:r>
+      <w:r>
+        <w:rPr>
+          <w:vertAlign w:val="superscript"/>
+        </w:rPr>
+        <w:t xml:space="preserve"> </w:t>
+      </w:r>
+      <w:r>
+        <w:t>yr</w:t>
+      </w:r>
+      <w:r>
+        <w:rPr>
+          <w:vertAlign w:val="superscript"/>
+        </w:rPr>
+        <w:t>-1</w:t>
+      </w:r>
+      <w:r>
+        <w:t xml:space="preserve">) is initialized with a value of 0 and is assigned a value during the </w:t>
+      </w:r>
+      <w:proofErr w:type="gramStart"/>
+      <w:r>
+        <w:t>first time</w:t>
+      </w:r>
+      <w:proofErr w:type="gramEnd"/>
+      <w:r>
+        <w:t xml:space="preserve"> step.</w:t>
+      </w:r>
+    </w:p>
+    <w:p>
+      <w:pPr>
+        <w:pStyle w:val="Heading3"/>
+        <w:ind w:left="1170" w:hanging="450"/>
+      </w:pPr>
+      <w:bookmarkStart w:id="135" w:name="_Toc165539612"/>
+      <w:bookmarkStart w:id="136" w:name="_Toc133339126"/>
+      <w:bookmarkStart w:id="137" w:name="_Toc282434162"/>
+      <w:bookmarkStart w:id="138" w:name="_Toc239766270"/>
+      <w:proofErr w:type="spellStart"/>
+      <w:r>
+        <w:t>FileName</w:t>
+      </w:r>
+      <w:bookmarkEnd w:id="135"/>
+      <w:bookmarkEnd w:id="138"/>
+      <w:proofErr w:type="spellEnd"/>
+      <w:r>
+        <w:t xml:space="preserve"> </w:t>
+      </w:r>
+    </w:p>
+    <w:p>
+      <w:pPr>
+        <w:pStyle w:val="textbody"/>
+      </w:pPr>
+      <w:r>
+        <w:t>The file name must point to a CSV file with format described next.</w:t>
+      </w:r>
+    </w:p>
+    <w:p>
+      <w:pPr>
+        <w:pStyle w:val="Heading3"/>
+        <w:ind w:left="1170" w:hanging="450"/>
+      </w:pPr>
+      <w:bookmarkStart w:id="139" w:name="_Toc165539613"/>
+      <w:bookmarkStart w:id="140" w:name="_Toc239766271"/>
+      <w:r>
+        <w:t>CSV file format</w:t>
+      </w:r>
+      <w:bookmarkEnd w:id="139"/>
+      <w:bookmarkEnd w:id="140"/>
+    </w:p>
+    <w:p>
+      <w:pPr>
+        <w:pStyle w:val="textbody"/>
+      </w:pPr>
+      <w:r>
+        <w:t>The CSV format requires a header with the names</w:t>
+      </w:r>
+      <w:r>
+        <w:t xml:space="preserve"> in bold below</w:t>
+      </w:r>
+      <w:r>
+        <w:t>.</w:t>
+      </w:r>
+    </w:p>
+    <w:p>
+      <w:pPr>
+        <w:pStyle w:val="textbody"/>
+      </w:pPr>
+      <w:r>
+        <w:t>Each row contains these data:</w:t>
+      </w:r>
+    </w:p>
+    <w:p>
+      <w:pPr>
+        <w:pStyle w:val="textbody"/>
+      </w:pPr>
+      <w:proofErr w:type="spellStart"/>
+      <w:r>
+        <w:rPr>
+          <w:b/>
+        </w:rPr>
+        <w:t>MapCode</w:t>
+      </w:r>
+      <w:proofErr w:type="spellEnd"/>
+      <w:proofErr w:type="gramStart"/>
+      <w:r>
+        <w:t>:  This</w:t>
+      </w:r>
+      <w:proofErr w:type="gramEnd"/>
+      <w:r>
+        <w:t xml:space="preserve"> parameter is the code used for the community in the </w:t>
+      </w:r>
+      <w:proofErr w:type="gramStart"/>
+      <w:r>
+        <w:t>input map</w:t>
+      </w:r>
+      <w:proofErr w:type="gramEnd"/>
+      <w:r>
+        <w:t xml:space="preserve"> (see section </w:t>
+      </w:r>
+      <w:fldSimple w:instr=" REF _Ref109371856 \r ">
+        <w:r>
+          <w:t>2.5</w:t>
+        </w:r>
+      </w:fldSimple>
+      <w:r>
+        <w:t xml:space="preserve">).  Value: 0 ≤ integer ≤ 65,535.  Each </w:t>
+      </w:r>
+      <w:proofErr w:type="gramStart"/>
+      <w:r>
+        <w:t>communities’</w:t>
+      </w:r>
+      <w:proofErr w:type="gramEnd"/>
+      <w:r>
+        <w:t xml:space="preserve"> map code must be unique.  Map codes do not have to appear in any order, and do not need to be consecutive.</w:t>
+      </w:r>
+    </w:p>
+    <w:p>
+      <w:pPr>
+        <w:pStyle w:val="textbody"/>
+      </w:pPr>
+      <w:proofErr w:type="spellStart"/>
+      <w:r>
+        <w:rPr>
+          <w:b/>
+        </w:rPr>
+        <w:t>SpeciesName</w:t>
+      </w:r>
+      <w:proofErr w:type="spellEnd"/>
+      <w:proofErr w:type="gramStart"/>
+      <w:r>
+        <w:t>:</w:t>
+      </w:r>
+      <w:r>
+        <w:t xml:space="preserve">  These</w:t>
+      </w:r>
+      <w:proofErr w:type="gramEnd"/>
+      <w:r>
+        <w:t xml:space="preserve"> must match the names found in the scenario species file.</w:t>
+      </w:r>
+    </w:p>
+    <w:p>
+      <w:pPr>
+        <w:pStyle w:val="textbody"/>
+      </w:pPr>
+      <w:proofErr w:type="spellStart"/>
+      <w:r>
+        <w:rPr>
+          <w:b/>
+        </w:rPr>
+        <w:lastRenderedPageBreak/>
+        <w:t>CohortAge</w:t>
+      </w:r>
+      <w:proofErr w:type="spellEnd"/>
+      <w:proofErr w:type="gramStart"/>
+      <w:r>
+        <w:t>:</w:t>
+      </w:r>
+      <w:r>
+        <w:t xml:space="preserve">  A</w:t>
+      </w:r>
+      <w:proofErr w:type="gramEnd"/>
+      <w:r>
+        <w:t xml:space="preserve"> cohort age is an integer and must be between 1 and the species’ Longevity parameter.  The ages do not have to appear in any order.</w:t>
+      </w:r>
+    </w:p>
+    <w:p>
+      <w:pPr>
+        <w:pStyle w:val="textbody"/>
+      </w:pPr>
+      <w:proofErr w:type="spellStart"/>
+      <w:r>
+        <w:rPr>
+          <w:b/>
+        </w:rPr>
+        <w:t>CohortBiomass</w:t>
+      </w:r>
+      <w:proofErr w:type="spellEnd"/>
+      <w:proofErr w:type="gramStart"/>
+      <w:r>
+        <w:t>:</w:t>
+      </w:r>
+      <w:r>
+        <w:t xml:space="preserve">  Biomass</w:t>
+      </w:r>
+      <w:proofErr w:type="gramEnd"/>
+      <w:r>
+        <w:t xml:space="preserve"> must be entered as an integer (no significant digits).</w:t>
+      </w:r>
+    </w:p>
+    <w:p>
+      <w:pPr>
+        <w:pStyle w:val="Heading3"/>
+        <w:ind w:left="1170" w:hanging="450"/>
+      </w:pPr>
+      <w:bookmarkStart w:id="141" w:name="_Toc239766272"/>
+      <w:r>
+        <w:t>Unvegetated (aka empty) Map Codes</w:t>
+      </w:r>
+      <w:bookmarkEnd w:id="141"/>
+    </w:p>
+    <w:p>
+      <w:pPr>
+        <w:pStyle w:val="textbody"/>
+      </w:pPr>
+      <w:r>
+        <w:rPr>
+          <w:b/>
+          <w:i/>
+        </w:rPr>
+        <w:t>For Empty Map Codes</w:t>
+      </w:r>
+      <w:proofErr w:type="gramStart"/>
+      <w:r>
+        <w:t>:</w:t>
+      </w:r>
+      <w:r>
+        <w:t xml:space="preserve">  If</w:t>
+      </w:r>
+      <w:proofErr w:type="gramEnd"/>
+      <w:r>
+        <w:t xml:space="preserve"> there is an active map code that does not have any vegetation, the data should be represented as</w:t>
+      </w:r>
+      <w:proofErr w:type="gramStart"/>
+      <w:r>
+        <w:t xml:space="preserve">:  </w:t>
+      </w:r>
+      <w:proofErr w:type="spellStart"/>
+      <w:r>
+        <w:rPr>
+          <w:i/>
+        </w:rPr>
+        <w:t>TheActualMapCode</w:t>
+      </w:r>
+      <w:proofErr w:type="spellEnd"/>
+      <w:proofErr w:type="gramEnd"/>
+      <w:r>
+        <w:t xml:space="preserve">, NA, 0, 0 (where </w:t>
+      </w:r>
+      <w:proofErr w:type="spellStart"/>
+      <w:r>
+        <w:rPr>
+          <w:i/>
+        </w:rPr>
+        <w:t>TheActualMapCode</w:t>
+      </w:r>
+      <w:proofErr w:type="spellEnd"/>
+      <w:r>
+        <w:t xml:space="preserve"> is the code without data, e.g. 1968).</w:t>
+      </w:r>
+    </w:p>
+    <w:p>
+      <w:pPr>
+        <w:pStyle w:val="textbody"/>
+      </w:pPr>
+      <w:r>
+        <w:rPr>
+          <w:b/>
+          <w:i/>
+        </w:rPr>
+        <w:t>Example</w:t>
+      </w:r>
+      <w:r>
+        <w:t>:</w:t>
+      </w:r>
+    </w:p>
+    <w:p>
+      <w:pPr>
+        <w:pStyle w:val="textbody"/>
+      </w:pPr>
+      <w:r>
+        <w:rPr>
+          <w:b/>
+          <w:i/>
+        </w:rPr>
+        <w:t>5, NA, 0, 0</w:t>
+      </w:r>
+    </w:p>
+    <w:p>
+      <w:pPr>
+        <w:pStyle w:val="Heading3"/>
+        <w:ind w:left="1170" w:hanging="450"/>
+      </w:pPr>
+      <w:bookmarkStart w:id="142" w:name="_Toc133339128"/>
+      <w:bookmarkStart w:id="143" w:name="_Toc282434164"/>
+      <w:bookmarkStart w:id="144" w:name="_Toc165539614"/>
+      <w:bookmarkStart w:id="145" w:name="_Toc239766273"/>
       <w:bookmarkEnd w:id="136"/>
       <w:bookmarkEnd w:id="137"/>
-    </w:p>
-    <w:p>
-      <w:pPr>
-        <w:pStyle w:val="textbody"/>
-      </w:pPr>
-      <w:r>
-        <w:t>This file contains the definitions for each initial community.  Each active site on the landscape is assigned an initial community.  The initial community specifies the cohorts that are present including species, age, and biomass (g m</w:t>
-      </w:r>
-      <w:r>
-        <w:rPr>
-          <w:vertAlign w:val="superscript"/>
-        </w:rPr>
-        <w:t>-2</w:t>
-      </w:r>
-      <w:r>
-        <w:t>).  Each initial community has an associated map code that corresponds to the accompanying map.  Note</w:t>
-      </w:r>
-      <w:proofErr w:type="gramStart"/>
-      <w:r>
-        <w:t>:  ANPP</w:t>
-      </w:r>
-      <w:proofErr w:type="gramEnd"/>
-      <w:r>
-        <w:t xml:space="preserve"> (g m</w:t>
-      </w:r>
-      <w:r>
-        <w:rPr>
-          <w:vertAlign w:val="superscript"/>
-        </w:rPr>
-        <w:t>-2</w:t>
-      </w:r>
-      <w:r>
-        <w:rPr>
-          <w:vertAlign w:val="superscript"/>
-        </w:rPr>
-        <w:t xml:space="preserve"> </w:t>
-      </w:r>
-      <w:r>
-        <w:t>yr</w:t>
-      </w:r>
-      <w:r>
-        <w:rPr>
-          <w:vertAlign w:val="superscript"/>
-        </w:rPr>
-        <w:t>-1</w:t>
-      </w:r>
-      <w:r>
-        <w:t xml:space="preserve">) is initialized with a value of 0 and is assigned a value during the </w:t>
-      </w:r>
-      <w:proofErr w:type="gramStart"/>
-      <w:r>
-        <w:t>first time</w:t>
-      </w:r>
-      <w:proofErr w:type="gramEnd"/>
-      <w:r>
-        <w:t xml:space="preserve"> step.</w:t>
-      </w:r>
-    </w:p>
-    <w:p>
-      <w:pPr>
-        <w:pStyle w:val="Heading3"/>
-        <w:ind w:left="1170" w:hanging="450"/>
-      </w:pPr>
-      <w:bookmarkStart w:id="138" w:name="_Toc165539612"/>
-      <w:bookmarkStart w:id="139" w:name="_Toc133339126"/>
-      <w:bookmarkStart w:id="140" w:name="_Toc282434162"/>
-      <w:bookmarkStart w:id="141" w:name="_Toc225506308"/>
-      <w:proofErr w:type="spellStart"/>
-      <w:r>
-        <w:t>FileName</w:t>
-      </w:r>
-      <w:bookmarkEnd w:id="138"/>
-      <w:bookmarkEnd w:id="141"/>
-      <w:proofErr w:type="spellEnd"/>
-      <w:r>
-        <w:t xml:space="preserve"> </w:t>
-      </w:r>
-    </w:p>
-    <w:p>
-      <w:pPr>
-        <w:pStyle w:val="textbody"/>
-      </w:pPr>
-      <w:r>
-        <w:t>The file name must point to a CSV file with format described next.</w:t>
-      </w:r>
-    </w:p>
-    <w:p>
-      <w:pPr>
-        <w:pStyle w:val="Heading3"/>
-        <w:ind w:left="1170" w:hanging="450"/>
-      </w:pPr>
-      <w:bookmarkStart w:id="142" w:name="_Toc165539613"/>
-      <w:bookmarkStart w:id="143" w:name="_Toc225506309"/>
-      <w:r>
-        <w:t>CSV file format</w:t>
+      <w:r>
+        <w:t>Grouping Species Ages into Cohorts</w:t>
       </w:r>
       <w:bookmarkEnd w:id="142"/>
       <w:bookmarkEnd w:id="143"/>
-    </w:p>
-    <w:p>
-      <w:pPr>
-        <w:pStyle w:val="textbody"/>
-      </w:pPr>
-      <w:r>
-        <w:t>The CSV format requires a header with the names</w:t>
-      </w:r>
-      <w:r>
-        <w:t xml:space="preserve"> in bold below</w:t>
-      </w:r>
-      <w:r>
-        <w:t>.</w:t>
-      </w:r>
-    </w:p>
-    <w:p>
-      <w:pPr>
-        <w:pStyle w:val="textbody"/>
-      </w:pPr>
-      <w:r>
-        <w:t>Each row contains these data:</w:t>
-      </w:r>
-    </w:p>
-    <w:p>
-      <w:pPr>
-        <w:pStyle w:val="textbody"/>
-      </w:pPr>
-      <w:proofErr w:type="spellStart"/>
-      <w:r>
-        <w:rPr>
-          <w:b/>
-        </w:rPr>
-        <w:t>MapCode</w:t>
-      </w:r>
-      <w:proofErr w:type="spellEnd"/>
-      <w:proofErr w:type="gramStart"/>
-      <w:r>
-        <w:t>:  This</w:t>
-      </w:r>
-      <w:proofErr w:type="gramEnd"/>
-      <w:r>
-        <w:t xml:space="preserve"> parameter is the code used for the community in the </w:t>
-      </w:r>
-      <w:proofErr w:type="gramStart"/>
-      <w:r>
-        <w:t>input map</w:t>
-      </w:r>
-      <w:proofErr w:type="gramEnd"/>
-      <w:r>
-        <w:t xml:space="preserve"> (see section </w:t>
-      </w:r>
-      <w:fldSimple w:instr=" REF _Ref109371856 \r ">
-        <w:r>
-          <w:t>2.5</w:t>
-        </w:r>
-      </w:fldSimple>
-      <w:r>
-        <w:t xml:space="preserve">).  Value: 0 ≤ integer ≤ 65,535.  Each </w:t>
-      </w:r>
-      <w:proofErr w:type="gramStart"/>
-      <w:r>
-        <w:t>communities’</w:t>
-      </w:r>
-      <w:proofErr w:type="gramEnd"/>
-      <w:r>
-        <w:t xml:space="preserve"> map code must be unique.  Map codes do not have to appear in any order, and do not need to be consecutive.</w:t>
-      </w:r>
-    </w:p>
-    <w:p>
-      <w:pPr>
-        <w:pStyle w:val="textbody"/>
-      </w:pPr>
-      <w:proofErr w:type="spellStart"/>
-      <w:r>
-        <w:rPr>
-          <w:b/>
-        </w:rPr>
-        <w:t>SpeciesName</w:t>
-      </w:r>
-      <w:proofErr w:type="spellEnd"/>
-      <w:proofErr w:type="gramStart"/>
-      <w:r>
-        <w:t>:</w:t>
-      </w:r>
-      <w:r>
-        <w:t xml:space="preserve">  These</w:t>
-      </w:r>
-      <w:proofErr w:type="gramEnd"/>
-      <w:r>
-        <w:t xml:space="preserve"> must match the names found in the scenario species file.</w:t>
-      </w:r>
-    </w:p>
-    <w:p>
-      <w:pPr>
-        <w:pStyle w:val="textbody"/>
-      </w:pPr>
-      <w:proofErr w:type="spellStart"/>
-      <w:r>
-        <w:rPr>
-          <w:b/>
-        </w:rPr>
-        <w:lastRenderedPageBreak/>
-        <w:t>CohortAge</w:t>
-      </w:r>
-      <w:proofErr w:type="spellEnd"/>
-      <w:proofErr w:type="gramStart"/>
-      <w:r>
-        <w:t>:</w:t>
-      </w:r>
-      <w:r>
-        <w:t xml:space="preserve">  A</w:t>
-      </w:r>
-      <w:proofErr w:type="gramEnd"/>
-      <w:r>
-        <w:t xml:space="preserve"> cohort age is an integer and must be between 1 and the species’ Longevity parameter.  The ages do not have to appear in any order.</w:t>
-      </w:r>
-    </w:p>
-    <w:p>
-      <w:pPr>
-        <w:pStyle w:val="textbody"/>
-      </w:pPr>
-      <w:proofErr w:type="spellStart"/>
-      <w:r>
-        <w:rPr>
-          <w:b/>
-        </w:rPr>
-        <w:t>CohortBiomass</w:t>
-      </w:r>
-      <w:proofErr w:type="spellEnd"/>
-      <w:proofErr w:type="gramStart"/>
-      <w:r>
-        <w:t>:</w:t>
-      </w:r>
-      <w:r>
-        <w:t xml:space="preserve">  Biomass</w:t>
-      </w:r>
-      <w:proofErr w:type="gramEnd"/>
-      <w:r>
-        <w:t xml:space="preserve"> must be entered as an integer (no significant digits).</w:t>
-      </w:r>
-    </w:p>
-    <w:p>
-      <w:pPr>
-        <w:pStyle w:val="Heading3"/>
-        <w:ind w:left="1170" w:hanging="450"/>
-      </w:pPr>
-      <w:bookmarkStart w:id="144" w:name="_Toc225506310"/>
-      <w:r>
-        <w:t>Unvegetated (aka empty) Map Codes</w:t>
-      </w:r>
       <w:bookmarkEnd w:id="144"/>
-    </w:p>
-    <w:p>
-      <w:pPr>
-        <w:pStyle w:val="textbody"/>
-      </w:pPr>
-      <w:r>
-        <w:rPr>
-          <w:b/>
-          <w:i/>
-        </w:rPr>
-        <w:t>For Empty Map Codes</w:t>
-      </w:r>
-      <w:proofErr w:type="gramStart"/>
-      <w:r>
-        <w:t>:</w:t>
-      </w:r>
-      <w:r>
-        <w:t xml:space="preserve">  If</w:t>
-      </w:r>
-      <w:proofErr w:type="gramEnd"/>
-      <w:r>
-        <w:t xml:space="preserve"> there is an active map code that does not have any vegetation, the data should be represented as</w:t>
-      </w:r>
-      <w:proofErr w:type="gramStart"/>
-      <w:r>
-        <w:t xml:space="preserve">:  </w:t>
-      </w:r>
-      <w:proofErr w:type="spellStart"/>
-      <w:r>
-        <w:rPr>
-          <w:i/>
-        </w:rPr>
-        <w:t>TheActualMapCode</w:t>
-      </w:r>
-      <w:proofErr w:type="spellEnd"/>
-      <w:proofErr w:type="gramEnd"/>
-      <w:r>
-        <w:t xml:space="preserve">, NA, 0, 0 (where </w:t>
-      </w:r>
-      <w:proofErr w:type="spellStart"/>
-      <w:r>
-        <w:rPr>
-          <w:i/>
-        </w:rPr>
-        <w:t>TheActualMapCode</w:t>
-      </w:r>
-      <w:proofErr w:type="spellEnd"/>
-      <w:r>
-        <w:t xml:space="preserve"> is the code without data, e.g. 1968).</w:t>
-      </w:r>
-    </w:p>
-    <w:p>
-      <w:pPr>
-        <w:pStyle w:val="textbody"/>
-      </w:pPr>
-      <w:r>
-        <w:rPr>
-          <w:b/>
-          <w:i/>
-        </w:rPr>
-        <w:t>Example</w:t>
-      </w:r>
-      <w:r>
-        <w:t>:</w:t>
-      </w:r>
-    </w:p>
-    <w:p>
-      <w:pPr>
-        <w:pStyle w:val="textbody"/>
-      </w:pPr>
-      <w:r>
-        <w:rPr>
-          <w:b/>
-          <w:i/>
-        </w:rPr>
-        <w:t>5, NA, 0, 0</w:t>
-      </w:r>
-    </w:p>
-    <w:p>
-      <w:pPr>
-        <w:pStyle w:val="Heading3"/>
-        <w:ind w:left="1170" w:hanging="450"/>
-      </w:pPr>
-      <w:bookmarkStart w:id="145" w:name="_Toc133339128"/>
-      <w:bookmarkStart w:id="146" w:name="_Toc282434164"/>
-      <w:bookmarkStart w:id="147" w:name="_Toc165539614"/>
-      <w:bookmarkStart w:id="148" w:name="_Toc225506311"/>
-      <w:bookmarkEnd w:id="139"/>
-      <w:bookmarkEnd w:id="140"/>
-      <w:r>
-        <w:t>Grouping Species Ages into Cohorts</w:t>
-      </w:r>
       <w:bookmarkEnd w:id="145"/>
-      <w:bookmarkEnd w:id="146"/>
-      <w:bookmarkEnd w:id="147"/>
-      <w:bookmarkEnd w:id="148"/>
     </w:p>
     <w:p>
       <w:pPr>
@@ -14017,8 +13622,8 @@
       <w:pPr>
         <w:pStyle w:val="Heading1"/>
       </w:pPr>
-      <w:bookmarkStart w:id="149" w:name="_Toc112490864"/>
-      <w:bookmarkStart w:id="150" w:name="_Toc225506312"/>
+      <w:bookmarkStart w:id="146" w:name="_Toc112490864"/>
+      <w:bookmarkStart w:id="147" w:name="_Toc239766274"/>
       <w:proofErr w:type="gramStart"/>
       <w:r>
         <w:lastRenderedPageBreak/>
@@ -14027,118 +13632,207 @@
       <w:r>
         <w:t>s</w:t>
       </w:r>
+      <w:bookmarkEnd w:id="147"/>
+      <w:proofErr w:type="gramEnd"/>
+    </w:p>
+    <w:p>
+      <w:pPr>
+        <w:pStyle w:val="textbody"/>
+      </w:pPr>
+      <w:r>
+        <w:t xml:space="preserve">For every time step, </w:t>
+      </w:r>
+      <w:r>
+        <w:t>raster maps</w:t>
+      </w:r>
+      <w:r>
+        <w:t xml:space="preserve"> </w:t>
+      </w:r>
+      <w:r>
+        <w:t xml:space="preserve">of aboveground biomass </w:t>
+      </w:r>
+      <w:r>
+        <w:t>Annual Net Primary Productivity (</w:t>
+      </w:r>
+      <w:r>
+        <w:t>ANPP</w:t>
+      </w:r>
+      <w:r>
+        <w:t>)</w:t>
+      </w:r>
+      <w:r>
+        <w:t xml:space="preserve"> (g m </w:t>
+      </w:r>
+      <w:r>
+        <w:rPr>
+          <w:vertAlign w:val="superscript"/>
+        </w:rPr>
+        <w:t xml:space="preserve">-2 </w:t>
+      </w:r>
+      <w:r>
+        <w:rPr>
+          <w:vertAlign w:val="superscript"/>
+        </w:rPr>
+        <w:t>–</w:t>
+      </w:r>
+      <w:r>
+        <w:rPr>
+          <w:vertAlign w:val="superscript"/>
+        </w:rPr>
+        <w:t>yr</w:t>
+      </w:r>
+      <w:r>
+        <w:t>)</w:t>
+      </w:r>
+      <w:r>
+        <w:t xml:space="preserve"> are produced.  In addition, a</w:t>
+      </w:r>
+      <w:r>
+        <w:t xml:space="preserve"> comma-delimited log file is automatically generated with the name </w:t>
+      </w:r>
+      <w:r>
+        <w:rPr>
+          <w:b/>
+        </w:rPr>
+        <w:t>Biomass-succession-v3-log.csv</w:t>
+      </w:r>
+      <w:r>
+        <w:t xml:space="preserve">.  There are six columns of data, listed below.  </w:t>
+      </w:r>
+    </w:p>
+    <w:p>
+      <w:pPr>
+        <w:pStyle w:val="Heading3"/>
+      </w:pPr>
+      <w:bookmarkStart w:id="148" w:name="_Toc239766275"/>
+      <w:r>
+        <w:t>Time</w:t>
+      </w:r>
+      <w:bookmarkEnd w:id="148"/>
+    </w:p>
+    <w:p>
+      <w:pPr>
+        <w:pStyle w:val="textbody"/>
+      </w:pPr>
+      <w:r>
+        <w:t>The simulation time step</w:t>
+      </w:r>
+    </w:p>
+    <w:p>
+      <w:pPr>
+        <w:pStyle w:val="Heading3"/>
+      </w:pPr>
+      <w:bookmarkStart w:id="149" w:name="_Toc239766276"/>
+      <w:r>
+        <w:t>Ecoregion</w:t>
+      </w:r>
+      <w:bookmarkEnd w:id="149"/>
+    </w:p>
+    <w:p>
+      <w:pPr>
+        <w:pStyle w:val="textbody"/>
+      </w:pPr>
+      <w:r>
+        <w:t>The ecoregion reported.  Columns 4-6 are ecoregion averages for the time step.</w:t>
+      </w:r>
+    </w:p>
+    <w:p>
+      <w:pPr>
+        <w:pStyle w:val="Heading3"/>
+      </w:pPr>
+      <w:bookmarkStart w:id="150" w:name="_Toc239766277"/>
+      <w:proofErr w:type="spellStart"/>
+      <w:r>
+        <w:t>NumSites</w:t>
+      </w:r>
       <w:bookmarkEnd w:id="150"/>
-      <w:proofErr w:type="gramEnd"/>
+      <w:proofErr w:type="spellEnd"/>
     </w:p>
     <w:p>
       <w:pPr>
         <w:pStyle w:val="textbody"/>
       </w:pPr>
       <w:r>
-        <w:t xml:space="preserve">For every time step, </w:t>
-      </w:r>
-      <w:r>
-        <w:t>raster maps</w:t>
-      </w:r>
-      <w:r>
-        <w:t xml:space="preserve"> </w:t>
-      </w:r>
-      <w:r>
-        <w:t xml:space="preserve">of aboveground biomass </w:t>
-      </w:r>
-      <w:r>
-        <w:t>Annual Net Primary Productivity (</w:t>
-      </w:r>
-      <w:r>
-        <w:t>ANPP</w:t>
-      </w:r>
-      <w:r>
-        <w:t>)</w:t>
-      </w:r>
-      <w:r>
-        <w:t xml:space="preserve"> (g m </w:t>
+        <w:t>The number of active sites per ecoregion.  This column allows rapid calculations of totals as columns 4-6 are area adjusted.</w:t>
+      </w:r>
+    </w:p>
+    <w:p>
+      <w:pPr>
+        <w:pStyle w:val="Heading3"/>
+      </w:pPr>
+      <w:bookmarkStart w:id="151" w:name="_Toc239766278"/>
+      <w:r>
+        <w:t>LiveB</w:t>
+      </w:r>
+      <w:bookmarkEnd w:id="151"/>
+    </w:p>
+    <w:p>
+      <w:pPr>
+        <w:pStyle w:val="textbody"/>
+      </w:pPr>
+      <w:r>
+        <w:t>The total aboveground live biomass (g m</w:t>
       </w:r>
       <w:r>
         <w:rPr>
           <w:vertAlign w:val="superscript"/>
         </w:rPr>
-        <w:t xml:space="preserve">-2 </w:t>
+        <w:t>-2</w:t>
+      </w:r>
+      <w:r>
+        <w:t>) averaged across all sites in the ecoregion.</w:t>
+      </w:r>
+    </w:p>
+    <w:p>
+      <w:pPr>
+        <w:pStyle w:val="Heading3"/>
+      </w:pPr>
+      <w:bookmarkStart w:id="152" w:name="_Toc239766279"/>
+      <w:r>
+        <w:t>AG_NPP</w:t>
+      </w:r>
+      <w:bookmarkEnd w:id="152"/>
+    </w:p>
+    <w:p>
+      <w:pPr>
+        <w:pStyle w:val="textbody"/>
+      </w:pPr>
+      <w:r>
+        <w:t xml:space="preserve">The total aboveground </w:t>
+      </w:r>
+      <w:r>
+        <w:t xml:space="preserve">biomass </w:t>
+      </w:r>
+      <w:r>
+        <w:t>net primary productivity (g m</w:t>
       </w:r>
       <w:r>
         <w:rPr>
           <w:vertAlign w:val="superscript"/>
         </w:rPr>
-        <w:t>–</w:t>
+        <w:t>-2</w:t>
+      </w:r>
+      <w:r>
+        <w:t xml:space="preserve"> yr</w:t>
       </w:r>
       <w:r>
         <w:rPr>
           <w:vertAlign w:val="superscript"/>
         </w:rPr>
-        <w:t>yr</w:t>
-      </w:r>
-      <w:r>
-        <w:t>)</w:t>
-      </w:r>
-      <w:r>
-        <w:t xml:space="preserve"> are produced.  In addition, a</w:t>
-      </w:r>
-      <w:r>
-        <w:t xml:space="preserve"> comma-delimited log file is automatically generated with the name </w:t>
-      </w:r>
-      <w:r>
-        <w:rPr>
-          <w:b/>
-        </w:rPr>
-        <w:t>Biomass-succession-v3-log.csv</w:t>
-      </w:r>
-      <w:r>
-        <w:t xml:space="preserve">.  There are six columns of data, listed below.  </w:t>
+        <w:t>-1</w:t>
+      </w:r>
+      <w:r>
+        <w:t>) averaged across all sites in the ecoregion.</w:t>
       </w:r>
     </w:p>
     <w:p>
       <w:pPr>
         <w:pStyle w:val="Heading3"/>
       </w:pPr>
-      <w:bookmarkStart w:id="151" w:name="_Toc225506313"/>
-      <w:r>
-        <w:t>Time</w:t>
-      </w:r>
-      <w:bookmarkEnd w:id="151"/>
-    </w:p>
-    <w:p>
-      <w:pPr>
-        <w:pStyle w:val="textbody"/>
-      </w:pPr>
-      <w:r>
-        <w:t>The simulation time step</w:t>
-      </w:r>
-    </w:p>
-    <w:p>
-      <w:pPr>
-        <w:pStyle w:val="Heading3"/>
-      </w:pPr>
-      <w:bookmarkStart w:id="152" w:name="_Toc225506314"/>
-      <w:r>
-        <w:t>Ecoregion</w:t>
-      </w:r>
-      <w:bookmarkEnd w:id="152"/>
-    </w:p>
-    <w:p>
-      <w:pPr>
-        <w:pStyle w:val="textbody"/>
-      </w:pPr>
-      <w:r>
-        <w:t>The ecoregion reported.  Columns 4-6 are ecoregion averages for the time step.</w:t>
-      </w:r>
-    </w:p>
-    <w:p>
-      <w:pPr>
-        <w:pStyle w:val="Heading3"/>
-      </w:pPr>
-      <w:bookmarkStart w:id="153" w:name="_Toc225506315"/>
+      <w:bookmarkStart w:id="153" w:name="_Toc239766280"/>
       <w:proofErr w:type="spellStart"/>
       <w:r>
-        <w:t>NumSites</w:t>
+        <w:t>LitterB</w:t>
       </w:r>
       <w:bookmarkEnd w:id="153"/>
       <w:proofErr w:type="spellEnd"/>
@@ -14148,25 +13842,13 @@
         <w:pStyle w:val="textbody"/>
       </w:pPr>
       <w:r>
-        <w:t>The number of active sites per ecoregion.  This column allows rapid calculations of totals as columns 4-6 are area adjusted.</w:t>
-      </w:r>
-    </w:p>
-    <w:p>
-      <w:pPr>
-        <w:pStyle w:val="Heading3"/>
-      </w:pPr>
-      <w:bookmarkStart w:id="154" w:name="_Toc225506316"/>
-      <w:r>
-        <w:t>LiveB</w:t>
-      </w:r>
-      <w:bookmarkEnd w:id="154"/>
-    </w:p>
-    <w:p>
-      <w:pPr>
-        <w:pStyle w:val="textbody"/>
-      </w:pPr>
-      <w:r>
-        <w:t>The total aboveground live biomass (g m</w:t>
+        <w:t xml:space="preserve">The total aboveground </w:t>
+      </w:r>
+      <w:r>
+        <w:t xml:space="preserve">litter </w:t>
+      </w:r>
+      <w:r>
+        <w:t>biomass (g m</w:t>
       </w:r>
       <w:r>
         <w:rPr>
@@ -14177,83 +13859,6 @@
       <w:r>
         <w:t>) averaged across all sites in the ecoregion.</w:t>
       </w:r>
-    </w:p>
-    <w:p>
-      <w:pPr>
-        <w:pStyle w:val="Heading3"/>
-      </w:pPr>
-      <w:bookmarkStart w:id="155" w:name="_Toc225506317"/>
-      <w:r>
-        <w:t>AG_NPP</w:t>
-      </w:r>
-      <w:bookmarkEnd w:id="155"/>
-    </w:p>
-    <w:p>
-      <w:pPr>
-        <w:pStyle w:val="textbody"/>
-      </w:pPr>
-      <w:r>
-        <w:t xml:space="preserve">The total aboveground </w:t>
-      </w:r>
-      <w:r>
-        <w:t xml:space="preserve">biomass </w:t>
-      </w:r>
-      <w:r>
-        <w:t>net primary productivity (g m</w:t>
-      </w:r>
-      <w:r>
-        <w:rPr>
-          <w:vertAlign w:val="superscript"/>
-        </w:rPr>
-        <w:t>-2</w:t>
-      </w:r>
-      <w:r>
-        <w:t xml:space="preserve"> yr</w:t>
-      </w:r>
-      <w:r>
-        <w:rPr>
-          <w:vertAlign w:val="superscript"/>
-        </w:rPr>
-        <w:t>-1</w:t>
-      </w:r>
-      <w:r>
-        <w:t>) averaged across all sites in the ecoregion.</w:t>
-      </w:r>
-    </w:p>
-    <w:p>
-      <w:pPr>
-        <w:pStyle w:val="Heading3"/>
-      </w:pPr>
-      <w:bookmarkStart w:id="156" w:name="_Toc225506318"/>
-      <w:proofErr w:type="spellStart"/>
-      <w:r>
-        <w:t>LitterB</w:t>
-      </w:r>
-      <w:bookmarkEnd w:id="156"/>
-      <w:proofErr w:type="spellEnd"/>
-    </w:p>
-    <w:p>
-      <w:pPr>
-        <w:pStyle w:val="textbody"/>
-      </w:pPr>
-      <w:r>
-        <w:t xml:space="preserve">The total aboveground </w:t>
-      </w:r>
-      <w:r>
-        <w:t xml:space="preserve">litter </w:t>
-      </w:r>
-      <w:r>
-        <w:t>biomass (g m</w:t>
-      </w:r>
-      <w:r>
-        <w:rPr>
-          <w:vertAlign w:val="superscript"/>
-        </w:rPr>
-        <w:t>-2</w:t>
-      </w:r>
-      <w:r>
-        <w:t>) averaged across all sites in the ecoregion.</w:t>
-      </w:r>
       <w:r>
         <w:t xml:space="preserve">  Dead woody biomass is not included.</w:t>
       </w:r>
@@ -14262,26 +13867,26 @@
       <w:pPr>
         <w:pStyle w:val="Heading1"/>
       </w:pPr>
-      <w:bookmarkStart w:id="157" w:name="_Toc225506319"/>
+      <w:bookmarkStart w:id="154" w:name="_Toc239766281"/>
       <w:r>
         <w:lastRenderedPageBreak/>
         <w:t xml:space="preserve">Example </w:t>
       </w:r>
-      <w:bookmarkEnd w:id="149"/>
+      <w:bookmarkEnd w:id="146"/>
       <w:r>
         <w:t>Inputs</w:t>
       </w:r>
-      <w:bookmarkEnd w:id="157"/>
+      <w:bookmarkEnd w:id="154"/>
     </w:p>
     <w:p>
       <w:pPr>
         <w:pStyle w:val="Heading2"/>
       </w:pPr>
-      <w:bookmarkStart w:id="158" w:name="_Toc225506320"/>
+      <w:bookmarkStart w:id="155" w:name="_Toc239766282"/>
       <w:r>
         <w:t>Main Parameter File</w:t>
       </w:r>
-      <w:bookmarkEnd w:id="158"/>
+      <w:bookmarkEnd w:id="155"/>
     </w:p>
     <w:p>
       <w:pPr>
@@ -15453,7 +15058,7 @@
 </file>
 
 <file path=word/endnotes.xml><?xml version="1.0" encoding="utf-8"?>
-<w:endnotes xmlns:wpc="http://schemas.microsoft.com/office/word/2010/wordprocessingCanvas" xmlns:cx="http://schemas.microsoft.com/office/drawing/2014/chartex" xmlns:cx1="http://schemas.microsoft.com/office/drawing/2015/9/8/chartex" xmlns:cx2="http://schemas.microsoft.com/office/drawing/2015/10/21/chartex" xmlns:cx3="http://schemas.microsoft.com/office/drawing/2016/5/9/chartex" xmlns:cx4="http://schemas.microsoft.com/office/drawing/2016/5/10/chartex" xmlns:cx5="http://schemas.microsoft.com/office/drawing/2016/5/11/chartex" xmlns:cx6="http://schemas.microsoft.com/office/drawing/2016/5/12/chartex" xmlns:cx7="http://schemas.microsoft.com/office/drawing/2016/5/13/chartex" xmlns:cx8="http://schemas.microsoft.com/office/drawing/2016/5/14/chartex" xmlns:mc="http://schemas.openxmlformats.org/markup-compatibility/2006" xmlns:aink="http://schemas.microsoft.com/office/drawing/2016/ink" xmlns:am3d="http://schemas.microsoft.com/office/drawing/2017/model3d" xmlns:o="urn:schemas-microsoft-com:office:office" xmlns:oel="http://schemas.microsoft.com/office/2019/extlst" xmlns:r="http://schemas.openxmlformats.org/officeDocument/2006/relationships" xmlns:m="http://schemas.openxmlformats.org/officeDocument/2006/math" xmlns:v="urn:schemas-microsoft-com:vml" xmlns:wp14="http://schemas.microsoft.com/office/word/2010/wordprocessingDrawing" xmlns:wp="http://schemas.openxmlformats.org/drawingml/2006/wordprocessingDrawing" xmlns:w10="urn:schemas-microsoft-com:office:word" xmlns:w="http://schemas.openxmlformats.org/wordprocessingml/2006/main" xmlns:w14="http://schemas.microsoft.com/office/word/2010/wordml" xmlns:w15="http://schemas.microsoft.com/office/word/2012/wordml" xmlns:w16cex="http://schemas.microsoft.com/office/word/2018/wordml/cex" xmlns:w16cid="http://schemas.microsoft.com/office/word/2016/wordml/cid" xmlns:w16="http://schemas.microsoft.com/office/word/2018/wordml" xmlns:w16du="http://schemas.microsoft.com/office/word/2023/wordml/word16du" xmlns:w16sdtdh="http://schemas.microsoft.com/office/word/2020/wordml/sdtdatahash" xmlns:w16sdtfl="http://schemas.microsoft.com/office/word/2024/wordml/sdtformatlock" xmlns:w16se="http://schemas.microsoft.com/office/word/2015/wordml/symex" xmlns:wpg="http://schemas.microsoft.com/office/word/2010/wordprocessingGroup" xmlns:wpi="http://schemas.microsoft.com/office/word/2010/wordprocessingInk" xmlns:wne="http://schemas.microsoft.com/office/word/2006/wordml" xmlns:wps="http://schemas.microsoft.com/office/word/2010/wordprocessingShape" mc:Ignorable="w14 w15 w16se w16cid w16 w16cex w16sdtdh w16sdtfl w16du wp14">
+<w:endnotes xmlns:wpc="http://schemas.microsoft.com/office/word/2010/wordprocessingCanvas" xmlns:cx="http://schemas.microsoft.com/office/drawing/2014/chartex" xmlns:cx1="http://schemas.microsoft.com/office/drawing/2015/9/8/chartex" xmlns:cx2="http://schemas.microsoft.com/office/drawing/2015/10/21/chartex" xmlns:cx3="http://schemas.microsoft.com/office/drawing/2016/5/9/chartex" xmlns:cx4="http://schemas.microsoft.com/office/drawing/2016/5/10/chartex" xmlns:cx5="http://schemas.microsoft.com/office/drawing/2016/5/11/chartex" xmlns:cx6="http://schemas.microsoft.com/office/drawing/2016/5/12/chartex" xmlns:cx7="http://schemas.microsoft.com/office/drawing/2016/5/13/chartex" xmlns:cx8="http://schemas.microsoft.com/office/drawing/2016/5/14/chartex" xmlns:mc="http://schemas.openxmlformats.org/markup-compatibility/2006" xmlns:aink="http://schemas.microsoft.com/office/drawing/2016/ink" xmlns:am3d="http://schemas.microsoft.com/office/drawing/2017/model3d" xmlns:o="urn:schemas-microsoft-com:office:office" xmlns:oel="http://schemas.microsoft.com/office/2019/extlst" xmlns:r="http://schemas.openxmlformats.org/officeDocument/2006/relationships" xmlns:m="http://schemas.openxmlformats.org/officeDocument/2006/math" xmlns:v="urn:schemas-microsoft-com:vml" xmlns:wp14="http://schemas.microsoft.com/office/word/2010/wordprocessingDrawing" xmlns:wp="http://schemas.openxmlformats.org/drawingml/2006/wordprocessingDrawing" xmlns:w10="urn:schemas-microsoft-com:office:word" xmlns:w="http://schemas.openxmlformats.org/wordprocessingml/2006/main" xmlns:w14="http://schemas.microsoft.com/office/word/2010/wordml" xmlns:w15="http://schemas.microsoft.com/office/word/2012/wordml" xmlns:w16cei="http://schemas.microsoft.com/office/word/2026/wordml/cei" xmlns:w16cex="http://schemas.microsoft.com/office/word/2018/wordml/cex" xmlns:w16cid="http://schemas.microsoft.com/office/word/2016/wordml/cid" xmlns:w16="http://schemas.microsoft.com/office/word/2018/wordml" xmlns:w16du="http://schemas.microsoft.com/office/word/2023/wordml/word16du" xmlns:w16sdtdh="http://schemas.microsoft.com/office/word/2020/wordml/sdtdatahash" xmlns:w16sdtfl="http://schemas.microsoft.com/office/word/2024/wordml/sdtformatlock" xmlns:w16se="http://schemas.microsoft.com/office/word/2015/wordml/symex" xmlns:wpg="http://schemas.microsoft.com/office/word/2010/wordprocessingGroup" xmlns:wpi="http://schemas.microsoft.com/office/word/2010/wordprocessingInk" xmlns:wne="http://schemas.microsoft.com/office/word/2006/wordml" xmlns:wps="http://schemas.microsoft.com/office/word/2010/wordprocessingShape" mc:Ignorable="w14 w15 w16se w16cid w16 w16cex w16sdtdh w16sdtfl w16du wp14">
   <w:endnote w:type="separator" w:id="-1">
     <w:p>
       <w:r>
@@ -15472,7 +15077,7 @@
 </file>
 
 <file path=word/footer1.xml><?xml version="1.0" encoding="utf-8"?>
-<w:ftr xmlns:wpc="http://schemas.microsoft.com/office/word/2010/wordprocessingCanvas" xmlns:cx="http://schemas.microsoft.com/office/drawing/2014/chartex" xmlns:cx1="http://schemas.microsoft.com/office/drawing/2015/9/8/chartex" xmlns:cx2="http://schemas.microsoft.com/office/drawing/2015/10/21/chartex" xmlns:cx3="http://schemas.microsoft.com/office/drawing/2016/5/9/chartex" xmlns:cx4="http://schemas.microsoft.com/office/drawing/2016/5/10/chartex" xmlns:cx5="http://schemas.microsoft.com/office/drawing/2016/5/11/chartex" xmlns:cx6="http://schemas.microsoft.com/office/drawing/2016/5/12/chartex" xmlns:cx7="http://schemas.microsoft.com/office/drawing/2016/5/13/chartex" xmlns:cx8="http://schemas.microsoft.com/office/drawing/2016/5/14/chartex" xmlns:mc="http://schemas.openxmlformats.org/markup-compatibility/2006" xmlns:aink="http://schemas.microsoft.com/office/drawing/2016/ink" xmlns:am3d="http://schemas.microsoft.com/office/drawing/2017/model3d" xmlns:o="urn:schemas-microsoft-com:office:office" xmlns:oel="http://schemas.microsoft.com/office/2019/extlst" xmlns:r="http://schemas.openxmlformats.org/officeDocument/2006/relationships" xmlns:m="http://schemas.openxmlformats.org/officeDocument/2006/math" xmlns:v="urn:schemas-microsoft-com:vml" xmlns:wp14="http://schemas.microsoft.com/office/word/2010/wordprocessingDrawing" xmlns:wp="http://schemas.openxmlformats.org/drawingml/2006/wordprocessingDrawing" xmlns:w10="urn:schemas-microsoft-com:office:word" xmlns:w="http://schemas.openxmlformats.org/wordprocessingml/2006/main" xmlns:w14="http://schemas.microsoft.com/office/word/2010/wordml" xmlns:w15="http://schemas.microsoft.com/office/word/2012/wordml" xmlns:w16cex="http://schemas.microsoft.com/office/word/2018/wordml/cex" xmlns:w16cid="http://schemas.microsoft.com/office/word/2016/wordml/cid" xmlns:w16="http://schemas.microsoft.com/office/word/2018/wordml" xmlns:w16du="http://schemas.microsoft.com/office/word/2023/wordml/word16du" xmlns:w16sdtdh="http://schemas.microsoft.com/office/word/2020/wordml/sdtdatahash" xmlns:w16sdtfl="http://schemas.microsoft.com/office/word/2024/wordml/sdtformatlock" xmlns:w16se="http://schemas.microsoft.com/office/word/2015/wordml/symex" xmlns:wpg="http://schemas.microsoft.com/office/word/2010/wordprocessingGroup" xmlns:wpi="http://schemas.microsoft.com/office/word/2010/wordprocessingInk" xmlns:wne="http://schemas.microsoft.com/office/word/2006/wordml" xmlns:wps="http://schemas.microsoft.com/office/word/2010/wordprocessingShape" mc:Ignorable="w14 w15 w16se w16cid w16 w16cex w16sdtdh w16sdtfl w16du wp14">
+<w:ftr xmlns:wpc="http://schemas.microsoft.com/office/word/2010/wordprocessingCanvas" xmlns:cx="http://schemas.microsoft.com/office/drawing/2014/chartex" xmlns:cx1="http://schemas.microsoft.com/office/drawing/2015/9/8/chartex" xmlns:cx2="http://schemas.microsoft.com/office/drawing/2015/10/21/chartex" xmlns:cx3="http://schemas.microsoft.com/office/drawing/2016/5/9/chartex" xmlns:cx4="http://schemas.microsoft.com/office/drawing/2016/5/10/chartex" xmlns:cx5="http://schemas.microsoft.com/office/drawing/2016/5/11/chartex" xmlns:cx6="http://schemas.microsoft.com/office/drawing/2016/5/12/chartex" xmlns:cx7="http://schemas.microsoft.com/office/drawing/2016/5/13/chartex" xmlns:cx8="http://schemas.microsoft.com/office/drawing/2016/5/14/chartex" xmlns:mc="http://schemas.openxmlformats.org/markup-compatibility/2006" xmlns:aink="http://schemas.microsoft.com/office/drawing/2016/ink" xmlns:am3d="http://schemas.microsoft.com/office/drawing/2017/model3d" xmlns:o="urn:schemas-microsoft-com:office:office" xmlns:oel="http://schemas.microsoft.com/office/2019/extlst" xmlns:r="http://schemas.openxmlformats.org/officeDocument/2006/relationships" xmlns:m="http://schemas.openxmlformats.org/officeDocument/2006/math" xmlns:v="urn:schemas-microsoft-com:vml" xmlns:wp14="http://schemas.microsoft.com/office/word/2010/wordprocessingDrawing" xmlns:wp="http://schemas.openxmlformats.org/drawingml/2006/wordprocessingDrawing" xmlns:w10="urn:schemas-microsoft-com:office:word" xmlns:w="http://schemas.openxmlformats.org/wordprocessingml/2006/main" xmlns:w14="http://schemas.microsoft.com/office/word/2010/wordml" xmlns:w15="http://schemas.microsoft.com/office/word/2012/wordml" xmlns:w16cei="http://schemas.microsoft.com/office/word/2026/wordml/cei" xmlns:w16cex="http://schemas.microsoft.com/office/word/2018/wordml/cex" xmlns:w16cid="http://schemas.microsoft.com/office/word/2016/wordml/cid" xmlns:w16="http://schemas.microsoft.com/office/word/2018/wordml" xmlns:w16du="http://schemas.microsoft.com/office/word/2023/wordml/word16du" xmlns:w16sdtdh="http://schemas.microsoft.com/office/word/2020/wordml/sdtdatahash" xmlns:w16sdtfl="http://schemas.microsoft.com/office/word/2024/wordml/sdtformatlock" xmlns:w16se="http://schemas.microsoft.com/office/word/2015/wordml/symex" xmlns:wpg="http://schemas.microsoft.com/office/word/2010/wordprocessingGroup" xmlns:wpi="http://schemas.microsoft.com/office/word/2010/wordprocessingInk" xmlns:wne="http://schemas.microsoft.com/office/word/2006/wordml" xmlns:wps="http://schemas.microsoft.com/office/word/2010/wordprocessingShape" mc:Ignorable="w14 w15 w16se w16cid w16 w16cex w16sdtdh w16sdtfl w16du wp14">
   <w:p>
     <w:pPr>
       <w:pStyle w:val="Footer"/>
@@ -15532,7 +15137,7 @@
 </file>
 
 <file path=word/footnotes.xml><?xml version="1.0" encoding="utf-8"?>
-<w:footnotes xmlns:wpc="http://schemas.microsoft.com/office/word/2010/wordprocessingCanvas" xmlns:cx="http://schemas.microsoft.com/office/drawing/2014/chartex" xmlns:cx1="http://schemas.microsoft.com/office/drawing/2015/9/8/chartex" xmlns:cx2="http://schemas.microsoft.com/office/drawing/2015/10/21/chartex" xmlns:cx3="http://schemas.microsoft.com/office/drawing/2016/5/9/chartex" xmlns:cx4="http://schemas.microsoft.com/office/drawing/2016/5/10/chartex" xmlns:cx5="http://schemas.microsoft.com/office/drawing/2016/5/11/chartex" xmlns:cx6="http://schemas.microsoft.com/office/drawing/2016/5/12/chartex" xmlns:cx7="http://schemas.microsoft.com/office/drawing/2016/5/13/chartex" xmlns:cx8="http://schemas.microsoft.com/office/drawing/2016/5/14/chartex" xmlns:mc="http://schemas.openxmlformats.org/markup-compatibility/2006" xmlns:aink="http://schemas.microsoft.com/office/drawing/2016/ink" xmlns:am3d="http://schemas.microsoft.com/office/drawing/2017/model3d" xmlns:o="urn:schemas-microsoft-com:office:office" xmlns:oel="http://schemas.microsoft.com/office/2019/extlst" xmlns:r="http://schemas.openxmlformats.org/officeDocument/2006/relationships" xmlns:m="http://schemas.openxmlformats.org/officeDocument/2006/math" xmlns:v="urn:schemas-microsoft-com:vml" xmlns:wp14="http://schemas.microsoft.com/office/word/2010/wordprocessingDrawing" xmlns:wp="http://schemas.openxmlformats.org/drawingml/2006/wordprocessingDrawing" xmlns:w10="urn:schemas-microsoft-com:office:word" xmlns:w="http://schemas.openxmlformats.org/wordprocessingml/2006/main" xmlns:w14="http://schemas.microsoft.com/office/word/2010/wordml" xmlns:w15="http://schemas.microsoft.com/office/word/2012/wordml" xmlns:w16cex="http://schemas.microsoft.com/office/word/2018/wordml/cex" xmlns:w16cid="http://schemas.microsoft.com/office/word/2016/wordml/cid" xmlns:w16="http://schemas.microsoft.com/office/word/2018/wordml" xmlns:w16du="http://schemas.microsoft.com/office/word/2023/wordml/word16du" xmlns:w16sdtdh="http://schemas.microsoft.com/office/word/2020/wordml/sdtdatahash" xmlns:w16sdtfl="http://schemas.microsoft.com/office/word/2024/wordml/sdtformatlock" xmlns:w16se="http://schemas.microsoft.com/office/word/2015/wordml/symex" xmlns:wpg="http://schemas.microsoft.com/office/word/2010/wordprocessingGroup" xmlns:wpi="http://schemas.microsoft.com/office/word/2010/wordprocessingInk" xmlns:wne="http://schemas.microsoft.com/office/word/2006/wordml" xmlns:wps="http://schemas.microsoft.com/office/word/2010/wordprocessingShape" mc:Ignorable="w14 w15 w16se w16cid w16 w16cex w16sdtdh w16sdtfl w16du wp14">
+<w:footnotes xmlns:wpc="http://schemas.microsoft.com/office/word/2010/wordprocessingCanvas" xmlns:cx="http://schemas.microsoft.com/office/drawing/2014/chartex" xmlns:cx1="http://schemas.microsoft.com/office/drawing/2015/9/8/chartex" xmlns:cx2="http://schemas.microsoft.com/office/drawing/2015/10/21/chartex" xmlns:cx3="http://schemas.microsoft.com/office/drawing/2016/5/9/chartex" xmlns:cx4="http://schemas.microsoft.com/office/drawing/2016/5/10/chartex" xmlns:cx5="http://schemas.microsoft.com/office/drawing/2016/5/11/chartex" xmlns:cx6="http://schemas.microsoft.com/office/drawing/2016/5/12/chartex" xmlns:cx7="http://schemas.microsoft.com/office/drawing/2016/5/13/chartex" xmlns:cx8="http://schemas.microsoft.com/office/drawing/2016/5/14/chartex" xmlns:mc="http://schemas.openxmlformats.org/markup-compatibility/2006" xmlns:aink="http://schemas.microsoft.com/office/drawing/2016/ink" xmlns:am3d="http://schemas.microsoft.com/office/drawing/2017/model3d" xmlns:o="urn:schemas-microsoft-com:office:office" xmlns:oel="http://schemas.microsoft.com/office/2019/extlst" xmlns:r="http://schemas.openxmlformats.org/officeDocument/2006/relationships" xmlns:m="http://schemas.openxmlformats.org/officeDocument/2006/math" xmlns:v="urn:schemas-microsoft-com:vml" xmlns:wp14="http://schemas.microsoft.com/office/word/2010/wordprocessingDrawing" xmlns:wp="http://schemas.openxmlformats.org/drawingml/2006/wordprocessingDrawing" xmlns:w10="urn:schemas-microsoft-com:office:word" xmlns:w="http://schemas.openxmlformats.org/wordprocessingml/2006/main" xmlns:w14="http://schemas.microsoft.com/office/word/2010/wordml" xmlns:w15="http://schemas.microsoft.com/office/word/2012/wordml" xmlns:w16cei="http://schemas.microsoft.com/office/word/2026/wordml/cei" xmlns:w16cex="http://schemas.microsoft.com/office/word/2018/wordml/cex" xmlns:w16cid="http://schemas.microsoft.com/office/word/2016/wordml/cid" xmlns:w16="http://schemas.microsoft.com/office/word/2018/wordml" xmlns:w16du="http://schemas.microsoft.com/office/word/2023/wordml/word16du" xmlns:w16sdtdh="http://schemas.microsoft.com/office/word/2020/wordml/sdtdatahash" xmlns:w16sdtfl="http://schemas.microsoft.com/office/word/2024/wordml/sdtformatlock" xmlns:w16se="http://schemas.microsoft.com/office/word/2015/wordml/symex" xmlns:wpg="http://schemas.microsoft.com/office/word/2010/wordprocessingGroup" xmlns:wpi="http://schemas.microsoft.com/office/word/2010/wordprocessingInk" xmlns:wne="http://schemas.microsoft.com/office/word/2006/wordml" xmlns:wps="http://schemas.microsoft.com/office/word/2010/wordprocessingShape" mc:Ignorable="w14 w15 w16se w16cid w16 w16cex w16sdtdh w16sdtfl w16du wp14">
   <w:footnote w:type="separator" w:id="-1">
     <w:p>
       <w:r>
@@ -15551,7 +15156,7 @@
 </file>
 
 <file path=word/header1.xml><?xml version="1.0" encoding="utf-8"?>
-<w:hdr xmlns:wpc="http://schemas.microsoft.com/office/word/2010/wordprocessingCanvas" xmlns:cx="http://schemas.microsoft.com/office/drawing/2014/chartex" xmlns:cx1="http://schemas.microsoft.com/office/drawing/2015/9/8/chartex" xmlns:cx2="http://schemas.microsoft.com/office/drawing/2015/10/21/chartex" xmlns:cx3="http://schemas.microsoft.com/office/drawing/2016/5/9/chartex" xmlns:cx4="http://schemas.microsoft.com/office/drawing/2016/5/10/chartex" xmlns:cx5="http://schemas.microsoft.com/office/drawing/2016/5/11/chartex" xmlns:cx6="http://schemas.microsoft.com/office/drawing/2016/5/12/chartex" xmlns:cx7="http://schemas.microsoft.com/office/drawing/2016/5/13/chartex" xmlns:cx8="http://schemas.microsoft.com/office/drawing/2016/5/14/chartex" xmlns:mc="http://schemas.openxmlformats.org/markup-compatibility/2006" xmlns:aink="http://schemas.microsoft.com/office/drawing/2016/ink" xmlns:am3d="http://schemas.microsoft.com/office/drawing/2017/model3d" xmlns:o="urn:schemas-microsoft-com:office:office" xmlns:oel="http://schemas.microsoft.com/office/2019/extlst" xmlns:r="http://schemas.openxmlformats.org/officeDocument/2006/relationships" xmlns:m="http://schemas.openxmlformats.org/officeDocument/2006/math" xmlns:v="urn:schemas-microsoft-com:vml" xmlns:wp14="http://schemas.microsoft.com/office/word/2010/wordprocessingDrawing" xmlns:wp="http://schemas.openxmlformats.org/drawingml/2006/wordprocessingDrawing" xmlns:w10="urn:schemas-microsoft-com:office:word" xmlns:w="http://schemas.openxmlformats.org/wordprocessingml/2006/main" xmlns:w14="http://schemas.microsoft.com/office/word/2010/wordml" xmlns:w15="http://schemas.microsoft.com/office/word/2012/wordml" xmlns:w16cex="http://schemas.microsoft.com/office/word/2018/wordml/cex" xmlns:w16cid="http://schemas.microsoft.com/office/word/2016/wordml/cid" xmlns:w16="http://schemas.microsoft.com/office/word/2018/wordml" xmlns:w16du="http://schemas.microsoft.com/office/word/2023/wordml/word16du" xmlns:w16sdtdh="http://schemas.microsoft.com/office/word/2020/wordml/sdtdatahash" xmlns:w16sdtfl="http://schemas.microsoft.com/office/word/2024/wordml/sdtformatlock" xmlns:w16se="http://schemas.microsoft.com/office/word/2015/wordml/symex" xmlns:wpg="http://schemas.microsoft.com/office/word/2010/wordprocessingGroup" xmlns:wpi="http://schemas.microsoft.com/office/word/2010/wordprocessingInk" xmlns:wne="http://schemas.microsoft.com/office/word/2006/wordml" xmlns:wps="http://schemas.microsoft.com/office/word/2010/wordprocessingShape" mc:Ignorable="w14 w15 w16se w16cid w16 w16cex w16sdtdh w16sdtfl w16du wp14">
+<w:hdr xmlns:wpc="http://schemas.microsoft.com/office/word/2010/wordprocessingCanvas" xmlns:cx="http://schemas.microsoft.com/office/drawing/2014/chartex" xmlns:cx1="http://schemas.microsoft.com/office/drawing/2015/9/8/chartex" xmlns:cx2="http://schemas.microsoft.com/office/drawing/2015/10/21/chartex" xmlns:cx3="http://schemas.microsoft.com/office/drawing/2016/5/9/chartex" xmlns:cx4="http://schemas.microsoft.com/office/drawing/2016/5/10/chartex" xmlns:cx5="http://schemas.microsoft.com/office/drawing/2016/5/11/chartex" xmlns:cx6="http://schemas.microsoft.com/office/drawing/2016/5/12/chartex" xmlns:cx7="http://schemas.microsoft.com/office/drawing/2016/5/13/chartex" xmlns:cx8="http://schemas.microsoft.com/office/drawing/2016/5/14/chartex" xmlns:mc="http://schemas.openxmlformats.org/markup-compatibility/2006" xmlns:aink="http://schemas.microsoft.com/office/drawing/2016/ink" xmlns:am3d="http://schemas.microsoft.com/office/drawing/2017/model3d" xmlns:o="urn:schemas-microsoft-com:office:office" xmlns:oel="http://schemas.microsoft.com/office/2019/extlst" xmlns:r="http://schemas.openxmlformats.org/officeDocument/2006/relationships" xmlns:m="http://schemas.openxmlformats.org/officeDocument/2006/math" xmlns:v="urn:schemas-microsoft-com:vml" xmlns:wp14="http://schemas.microsoft.com/office/word/2010/wordprocessingDrawing" xmlns:wp="http://schemas.openxmlformats.org/drawingml/2006/wordprocessingDrawing" xmlns:w10="urn:schemas-microsoft-com:office:word" xmlns:w="http://schemas.openxmlformats.org/wordprocessingml/2006/main" xmlns:w14="http://schemas.microsoft.com/office/word/2010/wordml" xmlns:w15="http://schemas.microsoft.com/office/word/2012/wordml" xmlns:w16cei="http://schemas.microsoft.com/office/word/2026/wordml/cei" xmlns:w16cex="http://schemas.microsoft.com/office/word/2018/wordml/cex" xmlns:w16cid="http://schemas.microsoft.com/office/word/2016/wordml/cid" xmlns:w16="http://schemas.microsoft.com/office/word/2018/wordml" xmlns:w16du="http://schemas.microsoft.com/office/word/2023/wordml/word16du" xmlns:w16sdtdh="http://schemas.microsoft.com/office/word/2020/wordml/sdtdatahash" xmlns:w16sdtfl="http://schemas.microsoft.com/office/word/2024/wordml/sdtformatlock" xmlns:w16se="http://schemas.microsoft.com/office/word/2015/wordml/symex" xmlns:wpg="http://schemas.microsoft.com/office/word/2010/wordprocessingGroup" xmlns:wpi="http://schemas.microsoft.com/office/word/2010/wordprocessingInk" xmlns:wne="http://schemas.microsoft.com/office/word/2006/wordml" xmlns:wps="http://schemas.microsoft.com/office/word/2010/wordprocessingShape" mc:Ignorable="w14 w15 w16se w16cid w16 w16cex w16sdtdh w16sdtfl w16du wp14">
   <w:p>
     <w:pPr>
       <w:pStyle w:val="Header"/>
@@ -15571,7 +15176,7 @@
 </file>
 
 <file path=word/header2.xml><?xml version="1.0" encoding="utf-8"?>
-<w:hdr xmlns:wpc="http://schemas.microsoft.com/office/word/2010/wordprocessingCanvas" xmlns:cx="http://schemas.microsoft.com/office/drawing/2014/chartex" xmlns:cx1="http://schemas.microsoft.com/office/drawing/2015/9/8/chartex" xmlns:cx2="http://schemas.microsoft.com/office/drawing/2015/10/21/chartex" xmlns:cx3="http://schemas.microsoft.com/office/drawing/2016/5/9/chartex" xmlns:cx4="http://schemas.microsoft.com/office/drawing/2016/5/10/chartex" xmlns:cx5="http://schemas.microsoft.com/office/drawing/2016/5/11/chartex" xmlns:cx6="http://schemas.microsoft.com/office/drawing/2016/5/12/chartex" xmlns:cx7="http://schemas.microsoft.com/office/drawing/2016/5/13/chartex" xmlns:cx8="http://schemas.microsoft.com/office/drawing/2016/5/14/chartex" xmlns:mc="http://schemas.openxmlformats.org/markup-compatibility/2006" xmlns:aink="http://schemas.microsoft.com/office/drawing/2016/ink" xmlns:am3d="http://schemas.microsoft.com/office/drawing/2017/model3d" xmlns:o="urn:schemas-microsoft-com:office:office" xmlns:oel="http://schemas.microsoft.com/office/2019/extlst" xmlns:r="http://schemas.openxmlformats.org/officeDocument/2006/relationships" xmlns:m="http://schemas.openxmlformats.org/officeDocument/2006/math" xmlns:v="urn:schemas-microsoft-com:vml" xmlns:wp14="http://schemas.microsoft.com/office/word/2010/wordprocessingDrawing" xmlns:wp="http://schemas.openxmlformats.org/drawingml/2006/wordprocessingDrawing" xmlns:w10="urn:schemas-microsoft-com:office:word" xmlns:w="http://schemas.openxmlformats.org/wordprocessingml/2006/main" xmlns:w14="http://schemas.microsoft.com/office/word/2010/wordml" xmlns:w15="http://schemas.microsoft.com/office/word/2012/wordml" xmlns:w16cex="http://schemas.microsoft.com/office/word/2018/wordml/cex" xmlns:w16cid="http://schemas.microsoft.com/office/word/2016/wordml/cid" xmlns:w16="http://schemas.microsoft.com/office/word/2018/wordml" xmlns:w16du="http://schemas.microsoft.com/office/word/2023/wordml/word16du" xmlns:w16sdtdh="http://schemas.microsoft.com/office/word/2020/wordml/sdtdatahash" xmlns:w16sdtfl="http://schemas.microsoft.com/office/word/2024/wordml/sdtformatlock" xmlns:w16se="http://schemas.microsoft.com/office/word/2015/wordml/symex" xmlns:wpg="http://schemas.microsoft.com/office/word/2010/wordprocessingGroup" xmlns:wpi="http://schemas.microsoft.com/office/word/2010/wordprocessingInk" xmlns:wne="http://schemas.microsoft.com/office/word/2006/wordml" xmlns:wps="http://schemas.microsoft.com/office/word/2010/wordprocessingShape" mc:Ignorable="w14 w15 w16se w16cid w16 w16cex w16sdtdh w16sdtfl w16du wp14">
+<w:hdr xmlns:wpc="http://schemas.microsoft.com/office/word/2010/wordprocessingCanvas" xmlns:cx="http://schemas.microsoft.com/office/drawing/2014/chartex" xmlns:cx1="http://schemas.microsoft.com/office/drawing/2015/9/8/chartex" xmlns:cx2="http://schemas.microsoft.com/office/drawing/2015/10/21/chartex" xmlns:cx3="http://schemas.microsoft.com/office/drawing/2016/5/9/chartex" xmlns:cx4="http://schemas.microsoft.com/office/drawing/2016/5/10/chartex" xmlns:cx5="http://schemas.microsoft.com/office/drawing/2016/5/11/chartex" xmlns:cx6="http://schemas.microsoft.com/office/drawing/2016/5/12/chartex" xmlns:cx7="http://schemas.microsoft.com/office/drawing/2016/5/13/chartex" xmlns:cx8="http://schemas.microsoft.com/office/drawing/2016/5/14/chartex" xmlns:mc="http://schemas.openxmlformats.org/markup-compatibility/2006" xmlns:aink="http://schemas.microsoft.com/office/drawing/2016/ink" xmlns:am3d="http://schemas.microsoft.com/office/drawing/2017/model3d" xmlns:o="urn:schemas-microsoft-com:office:office" xmlns:oel="http://schemas.microsoft.com/office/2019/extlst" xmlns:r="http://schemas.openxmlformats.org/officeDocument/2006/relationships" xmlns:m="http://schemas.openxmlformats.org/officeDocument/2006/math" xmlns:v="urn:schemas-microsoft-com:vml" xmlns:wp14="http://schemas.microsoft.com/office/word/2010/wordprocessingDrawing" xmlns:wp="http://schemas.openxmlformats.org/drawingml/2006/wordprocessingDrawing" xmlns:w10="urn:schemas-microsoft-com:office:word" xmlns:w="http://schemas.openxmlformats.org/wordprocessingml/2006/main" xmlns:w14="http://schemas.microsoft.com/office/word/2010/wordml" xmlns:w15="http://schemas.microsoft.com/office/word/2012/wordml" xmlns:w16cei="http://schemas.microsoft.com/office/word/2026/wordml/cei" xmlns:w16cex="http://schemas.microsoft.com/office/word/2018/wordml/cex" xmlns:w16cid="http://schemas.microsoft.com/office/word/2016/wordml/cid" xmlns:w16="http://schemas.microsoft.com/office/word/2018/wordml" xmlns:w16du="http://schemas.microsoft.com/office/word/2023/wordml/word16du" xmlns:w16sdtdh="http://schemas.microsoft.com/office/word/2020/wordml/sdtdatahash" xmlns:w16sdtfl="http://schemas.microsoft.com/office/word/2024/wordml/sdtformatlock" xmlns:w16se="http://schemas.microsoft.com/office/word/2015/wordml/symex" xmlns:wpg="http://schemas.microsoft.com/office/word/2010/wordprocessingGroup" xmlns:wpi="http://schemas.microsoft.com/office/word/2010/wordprocessingInk" xmlns:wne="http://schemas.microsoft.com/office/word/2006/wordml" xmlns:wps="http://schemas.microsoft.com/office/word/2010/wordprocessingShape" mc:Ignorable="w14 w15 w16se w16cid w16 w16cex w16sdtdh w16sdtfl w16du wp14">
   <w:p>
     <w:pPr>
       <w:pStyle w:val="Header"/>
@@ -15592,7 +15197,7 @@
     </w:r>
     <w:fldSimple w:instr=" DOCPROPERTY  &quot;Extension Version&quot;  \* MERGEFORMAT ">
       <w:r>
-        <w:t>7.2</w:t>
+        <w:t>7.3</w:t>
       </w:r>
     </w:fldSimple>
     <w:r>
@@ -15610,7 +15215,7 @@
 </file>
 
 <file path=word/numbering.xml><?xml version="1.0" encoding="utf-8"?>
-<w:numbering xmlns:wpc="http://schemas.microsoft.com/office/word/2010/wordprocessingCanvas" xmlns:cx="http://schemas.microsoft.com/office/drawing/2014/chartex" xmlns:cx1="http://schemas.microsoft.com/office/drawing/2015/9/8/chartex" xmlns:cx2="http://schemas.microsoft.com/office/drawing/2015/10/21/chartex" xmlns:cx3="http://schemas.microsoft.com/office/drawing/2016/5/9/chartex" xmlns:cx4="http://schemas.microsoft.com/office/drawing/2016/5/10/chartex" xmlns:cx5="http://schemas.microsoft.com/office/drawing/2016/5/11/chartex" xmlns:cx6="http://schemas.microsoft.com/office/drawing/2016/5/12/chartex" xmlns:cx7="http://schemas.microsoft.com/office/drawing/2016/5/13/chartex" xmlns:cx8="http://schemas.microsoft.com/office/drawing/2016/5/14/chartex" xmlns:mc="http://schemas.openxmlformats.org/markup-compatibility/2006" xmlns:aink="http://schemas.microsoft.com/office/drawing/2016/ink" xmlns:am3d="http://schemas.microsoft.com/office/drawing/2017/model3d" xmlns:o="urn:schemas-microsoft-com:office:office" xmlns:oel="http://schemas.microsoft.com/office/2019/extlst" xmlns:r="http://schemas.openxmlformats.org/officeDocument/2006/relationships" xmlns:m="http://schemas.openxmlformats.org/officeDocument/2006/math" xmlns:v="urn:schemas-microsoft-com:vml" xmlns:wp14="http://schemas.microsoft.com/office/word/2010/wordprocessingDrawing" xmlns:wp="http://schemas.openxmlformats.org/drawingml/2006/wordprocessingDrawing" xmlns:w10="urn:schemas-microsoft-com:office:word" xmlns:w="http://schemas.openxmlformats.org/wordprocessingml/2006/main" xmlns:w14="http://schemas.microsoft.com/office/word/2010/wordml" xmlns:w15="http://schemas.microsoft.com/office/word/2012/wordml" xmlns:w16cex="http://schemas.microsoft.com/office/word/2018/wordml/cex" xmlns:w16cid="http://schemas.microsoft.com/office/word/2016/wordml/cid" xmlns:w16="http://schemas.microsoft.com/office/word/2018/wordml" xmlns:w16du="http://schemas.microsoft.com/office/word/2023/wordml/word16du" xmlns:w16sdtdh="http://schemas.microsoft.com/office/word/2020/wordml/sdtdatahash" xmlns:w16sdtfl="http://schemas.microsoft.com/office/word/2024/wordml/sdtformatlock" xmlns:w16se="http://schemas.microsoft.com/office/word/2015/wordml/symex" xmlns:wpg="http://schemas.microsoft.com/office/word/2010/wordprocessingGroup" xmlns:wpi="http://schemas.microsoft.com/office/word/2010/wordprocessingInk" xmlns:wne="http://schemas.microsoft.com/office/word/2006/wordml" xmlns:wps="http://schemas.microsoft.com/office/word/2010/wordprocessingShape" mc:Ignorable="w14 w15 w16se w16cid w16 w16cex w16sdtdh w16sdtfl w16du wp14">
+<w:numbering xmlns:wpc="http://schemas.microsoft.com/office/word/2010/wordprocessingCanvas" xmlns:cx="http://schemas.microsoft.com/office/drawing/2014/chartex" xmlns:cx1="http://schemas.microsoft.com/office/drawing/2015/9/8/chartex" xmlns:cx2="http://schemas.microsoft.com/office/drawing/2015/10/21/chartex" xmlns:cx3="http://schemas.microsoft.com/office/drawing/2016/5/9/chartex" xmlns:cx4="http://schemas.microsoft.com/office/drawing/2016/5/10/chartex" xmlns:cx5="http://schemas.microsoft.com/office/drawing/2016/5/11/chartex" xmlns:cx6="http://schemas.microsoft.com/office/drawing/2016/5/12/chartex" xmlns:cx7="http://schemas.microsoft.com/office/drawing/2016/5/13/chartex" xmlns:cx8="http://schemas.microsoft.com/office/drawing/2016/5/14/chartex" xmlns:mc="http://schemas.openxmlformats.org/markup-compatibility/2006" xmlns:aink="http://schemas.microsoft.com/office/drawing/2016/ink" xmlns:am3d="http://schemas.microsoft.com/office/drawing/2017/model3d" xmlns:o="urn:schemas-microsoft-com:office:office" xmlns:oel="http://schemas.microsoft.com/office/2019/extlst" xmlns:r="http://schemas.openxmlformats.org/officeDocument/2006/relationships" xmlns:m="http://schemas.openxmlformats.org/officeDocument/2006/math" xmlns:v="urn:schemas-microsoft-com:vml" xmlns:wp14="http://schemas.microsoft.com/office/word/2010/wordprocessingDrawing" xmlns:wp="http://schemas.openxmlformats.org/drawingml/2006/wordprocessingDrawing" xmlns:w10="urn:schemas-microsoft-com:office:word" xmlns:w="http://schemas.openxmlformats.org/wordprocessingml/2006/main" xmlns:w14="http://schemas.microsoft.com/office/word/2010/wordml" xmlns:w15="http://schemas.microsoft.com/office/word/2012/wordml" xmlns:w16cei="http://schemas.microsoft.com/office/word/2026/wordml/cei" xmlns:w16cex="http://schemas.microsoft.com/office/word/2018/wordml/cex" xmlns:w16cid="http://schemas.microsoft.com/office/word/2016/wordml/cid" xmlns:w16="http://schemas.microsoft.com/office/word/2018/wordml" xmlns:w16du="http://schemas.microsoft.com/office/word/2023/wordml/word16du" xmlns:w16sdtdh="http://schemas.microsoft.com/office/word/2020/wordml/sdtdatahash" xmlns:w16sdtfl="http://schemas.microsoft.com/office/word/2024/wordml/sdtformatlock" xmlns:w16se="http://schemas.microsoft.com/office/word/2015/wordml/symex" xmlns:wpg="http://schemas.microsoft.com/office/word/2010/wordprocessingGroup" xmlns:wpi="http://schemas.microsoft.com/office/word/2010/wordprocessingInk" xmlns:wne="http://schemas.microsoft.com/office/word/2006/wordml" xmlns:wps="http://schemas.microsoft.com/office/word/2010/wordprocessingShape" mc:Ignorable="w14 w15 w16se w16cid w16 w16cex w16sdtdh w16sdtfl w16du wp14">
   <w:abstractNum w:abstractNumId="0" w15:restartNumberingAfterBreak="0">
     <w:nsid w:val="027F602A"/>
     <w:multiLevelType w:val="multilevel"/>

</xml_diff>